<commit_message>
all chapters before mise en oeuvre done
</commit_message>
<xml_diff>
--- a/Marie-Ange AIKPE Master's thesis.docx
+++ b/Marie-Ange AIKPE Master's thesis.docx
@@ -202,7 +202,7 @@
           <w:lang w:eastAsia="fr-FR"/>
         </w:rPr>
         <w:drawing>
-          <wp:anchor distT="0" distB="0" distL="114300" distR="114300" simplePos="0" relativeHeight="251659264" behindDoc="0" locked="0" layoutInCell="1" allowOverlap="1" wp14:anchorId="718E8D38" wp14:editId="39CE12F9">
+          <wp:anchor distT="0" distB="0" distL="114300" distR="114300" simplePos="0" relativeHeight="251659264" behindDoc="0" locked="0" layoutInCell="1" allowOverlap="1" wp14:anchorId="718E8D38" wp14:editId="005B0051">
             <wp:simplePos x="0" y="0"/>
             <wp:positionH relativeFrom="column">
               <wp:posOffset>-1137285</wp:posOffset>
@@ -364,7 +364,7 @@
                         <a:effectLst/>
                         <a:extLst>
                           <a:ext uri="{C572A759-6A51-4108-AA02-DFA0A04FC94B}">
-                            <ma14:wrappingTextBoxFlag xmlns:arto="http://schemas.microsoft.com/office/word/2006/arto" xmlns:ma14="http://schemas.microsoft.com/office/mac/drawingml/2011/main" xmlns:w="http://schemas.openxmlformats.org/wordprocessingml/2006/main" xmlns:w10="urn:schemas-microsoft-com:office:word" xmlns:v="urn:schemas-microsoft-com:vml" xmlns:o="urn:schemas-microsoft-com:office:office" xmlns:mv="urn:schemas-microsoft-com:mac:vml" xmlns:mo="http://schemas.microsoft.com/office/mac/office/2008/main" xmlns=""/>
+                            <ma14:wrappingTextBoxFlag xmlns="" xmlns:mo="http://schemas.microsoft.com/office/mac/office/2008/main" xmlns:mv="urn:schemas-microsoft-com:mac:vml" xmlns:o="urn:schemas-microsoft-com:office:office" xmlns:v="urn:schemas-microsoft-com:vml" xmlns:w10="urn:schemas-microsoft-com:office:word" xmlns:w="http://schemas.openxmlformats.org/wordprocessingml/2006/main" xmlns:ma14="http://schemas.microsoft.com/office/mac/drawingml/2011/main" xmlns:arto="http://schemas.microsoft.com/office/word/2006/arto"/>
                           </a:ext>
                         </a:extLst>
                       </wps:spPr>
@@ -513,7 +513,7 @@
                         <a:effectLst/>
                         <a:extLst>
                           <a:ext uri="{C572A759-6A51-4108-AA02-DFA0A04FC94B}">
-                            <ma14:wrappingTextBoxFlag xmlns:arto="http://schemas.microsoft.com/office/word/2006/arto" xmlns:ma14="http://schemas.microsoft.com/office/mac/drawingml/2011/main" xmlns:w="http://schemas.openxmlformats.org/wordprocessingml/2006/main" xmlns:w10="urn:schemas-microsoft-com:office:word" xmlns:v="urn:schemas-microsoft-com:vml" xmlns:o="urn:schemas-microsoft-com:office:office" xmlns:mv="urn:schemas-microsoft-com:mac:vml" xmlns:mo="http://schemas.microsoft.com/office/mac/office/2008/main" xmlns=""/>
+                            <ma14:wrappingTextBoxFlag xmlns="" xmlns:mo="http://schemas.microsoft.com/office/mac/office/2008/main" xmlns:mv="urn:schemas-microsoft-com:mac:vml" xmlns:o="urn:schemas-microsoft-com:office:office" xmlns:v="urn:schemas-microsoft-com:vml" xmlns:w10="urn:schemas-microsoft-com:office:word" xmlns:w="http://schemas.openxmlformats.org/wordprocessingml/2006/main" xmlns:ma14="http://schemas.microsoft.com/office/mac/drawingml/2011/main" xmlns:arto="http://schemas.microsoft.com/office/word/2006/arto"/>
                           </a:ext>
                         </a:extLst>
                       </wps:spPr>
@@ -901,7 +901,7 @@
                         <a:effectLst/>
                         <a:extLst>
                           <a:ext uri="{C572A759-6A51-4108-AA02-DFA0A04FC94B}">
-                            <ma14:wrappingTextBoxFlag xmlns:arto="http://schemas.microsoft.com/office/word/2006/arto" xmlns:ma14="http://schemas.microsoft.com/office/mac/drawingml/2011/main" xmlns:w="http://schemas.openxmlformats.org/wordprocessingml/2006/main" xmlns:w10="urn:schemas-microsoft-com:office:word" xmlns:v="urn:schemas-microsoft-com:vml" xmlns:o="urn:schemas-microsoft-com:office:office" xmlns:mv="urn:schemas-microsoft-com:mac:vml" xmlns:mo="http://schemas.microsoft.com/office/mac/office/2008/main" xmlns=""/>
+                            <ma14:wrappingTextBoxFlag xmlns="" xmlns:mo="http://schemas.microsoft.com/office/mac/office/2008/main" xmlns:mv="urn:schemas-microsoft-com:mac:vml" xmlns:o="urn:schemas-microsoft-com:office:office" xmlns:v="urn:schemas-microsoft-com:vml" xmlns:w10="urn:schemas-microsoft-com:office:word" xmlns:w="http://schemas.openxmlformats.org/wordprocessingml/2006/main" xmlns:ma14="http://schemas.microsoft.com/office/mac/drawingml/2011/main" xmlns:arto="http://schemas.microsoft.com/office/word/2006/arto"/>
                           </a:ext>
                         </a:extLst>
                       </wps:spPr>
@@ -1251,7 +1251,7 @@
                         <a:effectLst/>
                         <a:extLst>
                           <a:ext uri="{C572A759-6A51-4108-AA02-DFA0A04FC94B}">
-                            <ma14:wrappingTextBoxFlag xmlns:arto="http://schemas.microsoft.com/office/word/2006/arto" xmlns:ma14="http://schemas.microsoft.com/office/mac/drawingml/2011/main" xmlns:w="http://schemas.openxmlformats.org/wordprocessingml/2006/main" xmlns:w10="urn:schemas-microsoft-com:office:word" xmlns:v="urn:schemas-microsoft-com:vml" xmlns:o="urn:schemas-microsoft-com:office:office" xmlns:mv="urn:schemas-microsoft-com:mac:vml" xmlns:mo="http://schemas.microsoft.com/office/mac/office/2008/main" xmlns=""/>
+                            <ma14:wrappingTextBoxFlag xmlns="" xmlns:mo="http://schemas.microsoft.com/office/mac/office/2008/main" xmlns:mv="urn:schemas-microsoft-com:mac:vml" xmlns:o="urn:schemas-microsoft-com:office:office" xmlns:v="urn:schemas-microsoft-com:vml" xmlns:w10="urn:schemas-microsoft-com:office:word" xmlns:w="http://schemas.openxmlformats.org/wordprocessingml/2006/main" xmlns:ma14="http://schemas.microsoft.com/office/mac/drawingml/2011/main" xmlns:arto="http://schemas.microsoft.com/office/word/2006/arto"/>
                           </a:ext>
                         </a:extLst>
                       </wps:spPr>
@@ -2093,21 +2093,7 @@
             <w:rStyle w:val="Hyperlink"/>
             <w:noProof/>
           </w:rPr>
-          <w:t>Figure 2.6 : Impact d</w:t>
-        </w:r>
-        <w:r>
-          <w:rPr>
-            <w:rStyle w:val="Hyperlink"/>
-            <w:noProof/>
-          </w:rPr>
-          <w:t>e</w:t>
-        </w:r>
-        <w:r>
-          <w:rPr>
-            <w:rStyle w:val="Hyperlink"/>
-            <w:noProof/>
-          </w:rPr>
-          <w:t xml:space="preserve"> l’IoT</w:t>
+          <w:t>Figure 2.6 : Impact de l’IoT</w:t>
         </w:r>
         <w:r>
           <w:rPr>
@@ -2166,11 +2152,6 @@
     </w:p>
     <w:p/>
     <w:p>
-      <w:pPr>
-        <w:rPr>
-          <w:lang w:val="en-US"/>
-        </w:rPr>
-      </w:pPr>
       <w:r>
         <w:rPr>
           <w:lang w:val="en-US"/>
@@ -5835,7 +5816,13 @@
         <w:t xml:space="preserve"> et </w:t>
       </w:r>
       <w:r>
-        <w:t xml:space="preserve"> définirons ensuite en détail l'Internet des Objets</w:t>
+        <w:t xml:space="preserve"> définiron</w:t>
+      </w:r>
+      <w:r>
+        <w:t>t</w:t>
+      </w:r>
+      <w:r>
+        <w:t xml:space="preserve"> ensuite en détail l'Internet des Objets</w:t>
       </w:r>
       <w:r>
         <w:t>,</w:t>
@@ -5880,30 +5867,14 @@
       <w:r>
         <w:t xml:space="preserve"> </w:t>
       </w:r>
-      <w:r>
-        <w:fldChar w:fldCharType="begin"/>
-      </w:r>
-      <w:r>
-        <w:instrText>HYPERLINK  \l "ref1"</w:instrText>
-      </w:r>
-      <w:r>
-        <w:fldChar w:fldCharType="separate"/>
-      </w:r>
-      <w:r>
-        <w:rPr>
-          <w:rStyle w:val="Hyperlink"/>
-        </w:rPr>
-        <w:t>[1</w:t>
-      </w:r>
-      <w:r>
-        <w:rPr>
-          <w:rStyle w:val="Hyperlink"/>
-        </w:rPr>
-        <w:t>]</w:t>
-      </w:r>
-      <w:r>
-        <w:fldChar w:fldCharType="end"/>
-      </w:r>
+      <w:hyperlink w:anchor="ref1" w:history="1">
+        <w:r>
+          <w:rPr>
+            <w:rStyle w:val="Hyperlink"/>
+          </w:rPr>
+          <w:t>[1]</w:t>
+        </w:r>
+      </w:hyperlink>
     </w:p>
     <w:p/>
     <w:p>
@@ -6040,6 +6011,9 @@
     </w:p>
     <w:p>
       <w:r>
+        <w:rPr>
+          <w:noProof/>
+        </w:rPr>
         <w:drawing>
           <wp:inline distT="0" distB="0" distL="0" distR="0" wp14:anchorId="0DB999A6" wp14:editId="7425FD87">
             <wp:extent cx="5972175" cy="2092325"/>
@@ -6085,10 +6059,7 @@
       <w:bookmarkStart w:id="42" w:name="_Toc213478518"/>
       <w:r>
         <w:lastRenderedPageBreak/>
-        <w:t xml:space="preserve">Figure 2.1 : </w:t>
-      </w:r>
-      <w:r>
-        <w:t>Jonction entre monde physique et monde numérique</w:t>
+        <w:t>Figure 2.1 : Jonction entre monde physique et monde numérique</w:t>
       </w:r>
       <w:bookmarkEnd w:id="42"/>
     </w:p>
@@ -6324,10 +6295,7 @@
         </w:rPr>
       </w:pPr>
       <w:r>
-        <w:t>La couche de perception est également connue sous le nom de couche «Capteurs» dans l’IoT. Le but de cette couche est d’acquérir les données de l’environnement à l’aide de capteurs et d’actionneurs. Cette couche détecte, collecte et traite les informations, puis les transmet à la couche réseau. Cette couche effectue également la collaboration des nœuds IoT dans les réseaux locaux et à courte porté</w:t>
-      </w:r>
-      <w:r>
-        <w:t>.</w:t>
+        <w:t>La couche de perception est également connue sous le nom de couche «Capteurs» dans l’IoT. Le but de cette couche est d’acquérir les données de l’environnement à l’aide de capteurs et d’actionneurs. Cette couche détecte, collecte et traite les informations, puis les transmet à la couche réseau. Cette couche effectue également la collaboration des nœuds IoT dans les réseaux locaux et à courte porté.</w:t>
       </w:r>
     </w:p>
     <w:p>
@@ -6647,6 +6615,7 @@
       <w:r>
         <w:rPr>
           <w:rFonts w:eastAsia="Times New Roman" w:cs="Times New Roman"/>
+          <w:noProof/>
           <w:color w:val="000000" w:themeColor="text1"/>
           <w:szCs w:val="24"/>
         </w:rPr>
@@ -6700,10 +6669,7 @@
         <w:t>3</w:t>
       </w:r>
       <w:r>
-        <w:t xml:space="preserve"> : </w:t>
-      </w:r>
-      <w:r>
-        <w:t>schéma de conversion d’une grandeur physique en grandeur numérique</w:t>
+        <w:t> : schéma de conversion d’une grandeur physique en grandeur numérique</w:t>
       </w:r>
       <w:bookmarkEnd w:id="47"/>
     </w:p>
@@ -6789,6 +6755,7 @@
       <w:r>
         <w:rPr>
           <w:rFonts w:eastAsia="Times New Roman" w:cs="Times New Roman"/>
+          <w:noProof/>
           <w:color w:val="000000" w:themeColor="text1"/>
           <w:szCs w:val="24"/>
         </w:rPr>
@@ -6842,10 +6809,7 @@
         <w:t>4</w:t>
       </w:r>
       <w:r>
-        <w:t xml:space="preserve"> : schéma </w:t>
-      </w:r>
-      <w:r>
-        <w:t>représentatif de l’énergie électrique en mouvement mécanique</w:t>
+        <w:t> : schéma représentatif de l’énergie électrique en mouvement mécanique</w:t>
       </w:r>
       <w:bookmarkEnd w:id="49"/>
     </w:p>
@@ -7108,8 +7072,50 @@
           <w:color w:val="000000" w:themeColor="text1"/>
           <w:szCs w:val="24"/>
         </w:rPr>
-        <w:t xml:space="preserve">La technologie </w:t>
-      </w:r>
+        <w:t>La technologie Bluetooth Low Energy (BLE)</w:t>
+      </w:r>
+      <w:r>
+        <w:rPr>
+          <w:rFonts w:eastAsia="Times New Roman" w:cs="Times New Roman"/>
+          <w:color w:val="000000" w:themeColor="text1"/>
+          <w:szCs w:val="24"/>
+        </w:rPr>
+        <w:t> : I</w:t>
+      </w:r>
+      <w:r>
+        <w:rPr>
+          <w:rFonts w:eastAsia="Times New Roman" w:cs="Times New Roman"/>
+          <w:color w:val="000000" w:themeColor="text1"/>
+          <w:szCs w:val="24"/>
+        </w:rPr>
+        <w:t>ntroduit avec la norme Bluetooth 4.0 est une technologie de communication sans fil conçue pour une faible consommation d’énergie. Comme le Bluetooth classique, il opère dans la bande ISM de 2,4 GHz, mais utilise une modulation simplifiée et reste en mode veille lorsqu’il n’est pas sollicité, ce qui réduit considérablement sa consommation énergétique. Le BLE offre une portée d’environ 100 mètres et un débit d’environ 1 Mbit/s, ce qui le rend adapté aux dispositifs nécessitant une connexion stable mais peu énergivore.</w:t>
+      </w:r>
+    </w:p>
+    <w:p>
+      <w:pPr>
+        <w:rPr>
+          <w:rFonts w:eastAsia="Times New Roman" w:cs="Times New Roman"/>
+          <w:color w:val="000000" w:themeColor="text1"/>
+          <w:szCs w:val="24"/>
+        </w:rPr>
+      </w:pPr>
+      <w:r>
+        <w:rPr>
+          <w:rFonts w:eastAsia="Times New Roman" w:cs="Times New Roman"/>
+          <w:color w:val="000000" w:themeColor="text1"/>
+          <w:szCs w:val="24"/>
+        </w:rPr>
+        <w:t xml:space="preserve"> </w:t>
+      </w:r>
+    </w:p>
+    <w:p>
+      <w:pPr>
+        <w:rPr>
+          <w:rFonts w:eastAsia="Times New Roman" w:cs="Times New Roman"/>
+          <w:color w:val="000000" w:themeColor="text1"/>
+          <w:szCs w:val="24"/>
+        </w:rPr>
+      </w:pPr>
       <w:r>
         <w:rPr>
           <w:rFonts w:eastAsia="Times New Roman" w:cs="Times New Roman"/>
@@ -7118,7 +7124,7 @@
           <w:color w:val="000000" w:themeColor="text1"/>
           <w:szCs w:val="24"/>
         </w:rPr>
-        <w:t>Bluetooth Low Energy (BLE)</w:t>
+        <w:t>La technologie LiFi</w:t>
       </w:r>
       <w:r>
         <w:rPr>
@@ -7126,7 +7132,7 @@
           <w:color w:val="000000" w:themeColor="text1"/>
           <w:szCs w:val="24"/>
         </w:rPr>
-        <w:t> : I</w:t>
+        <w:t xml:space="preserve"> : </w:t>
       </w:r>
       <w:r>
         <w:rPr>
@@ -7134,25 +7140,34 @@
           <w:color w:val="000000" w:themeColor="text1"/>
           <w:szCs w:val="24"/>
         </w:rPr>
-        <w:t>ntroduit avec la norme Bluetooth 4.0 est une technologie de communication sans fil conçue pour une faible consommation d’énergie. Comme le Bluetooth classique, il opère dans la bande ISM de 2,4 GHz, mais utilise une modulation simplifiée et reste en mode veille lorsqu’il n’est pas sollicité, ce qui réduit considérablement sa consommation énergétique. Le BLE offre une portée d’environ 100 mètres et un débit d’environ 1 Mbit/s, ce qui le rend adapté aux dispositifs nécessitant une connexion stable mais peu énergivore.</w:t>
-      </w:r>
-    </w:p>
-    <w:p>
-      <w:pPr>
+        <w:t xml:space="preserve">LiFi est </w:t>
+      </w:r>
+      <w:r>
         <w:rPr>
           <w:rFonts w:eastAsia="Times New Roman" w:cs="Times New Roman"/>
           <w:color w:val="000000" w:themeColor="text1"/>
           <w:szCs w:val="24"/>
         </w:rPr>
-      </w:pPr>
+        <w:t xml:space="preserve">une nouvelle technologie de communication haute vitesse sans fil, bidirectionnelle, basée sur la lumière visible à modulation rapide. Il s’agit d’un type de système de communication à lumière visible (Visible Light Communications : VLC). Semblable au WiFi, le LiFi transmet des données à l’aide d’ondes électromagnétiques. Mais au lieu d’utiliser des ondes radio (MHz - GHz), il utilise la lumière visible ( THz). LiFi utilise des ampoules LED domestiques (light-emitting diodes) comme émetteurs. En faisant varier le courant électrique fourni à une ampoule LED à des vitesses extrêmement élevées, les données peuvent être encodées à mesure que la luminosité change rapidement, qui peuvent ensuite être captées par un photodétecteur (photodiode). Ces changements rapides sont trop rapides pour être remarqués aux yeux des humains; par conséquent, le LiFi n’affecte pas la fonction principale des lumières LED - </w:t>
+      </w:r>
       <w:r>
         <w:rPr>
           <w:rFonts w:eastAsia="Times New Roman" w:cs="Times New Roman"/>
           <w:color w:val="000000" w:themeColor="text1"/>
           <w:szCs w:val="24"/>
         </w:rPr>
-        <w:t xml:space="preserve"> </w:t>
-      </w:r>
+        <w:lastRenderedPageBreak/>
+        <w:t xml:space="preserve">l’éclairage. Le LiFi a un énorme avantage en termes d’infrastructure, car les ampoules LED sont de plus en plus utilisées dans les bâtiments, les rues et les véhicules. Il peut fonctionner à une vitesse impressionnante pouvant atteindre 224 gigabits par seconde et il est insensible aux interférences électromagnétiques. Le LiFi ne peut pas pénétrer les murs, ce qui signifie qu’il ne peut fonctionner qu’à courte portée, mais en même temps, cela le rend moins susceptible d’être piraté. </w:t>
+      </w:r>
+    </w:p>
+    <w:p>
+      <w:pPr>
+        <w:rPr>
+          <w:rFonts w:eastAsia="Times New Roman" w:cs="Times New Roman"/>
+          <w:color w:val="000000" w:themeColor="text1"/>
+          <w:szCs w:val="24"/>
+        </w:rPr>
+      </w:pPr>
     </w:p>
     <w:p>
       <w:pPr>
@@ -7170,59 +7185,8 @@
           <w:color w:val="000000" w:themeColor="text1"/>
           <w:szCs w:val="24"/>
         </w:rPr>
-        <w:t>La technologie LiFi</w:t>
-      </w:r>
-      <w:r>
-        <w:rPr>
-          <w:rFonts w:eastAsia="Times New Roman" w:cs="Times New Roman"/>
-          <w:color w:val="000000" w:themeColor="text1"/>
-          <w:szCs w:val="24"/>
-        </w:rPr>
-        <w:t xml:space="preserve"> : </w:t>
-      </w:r>
-      <w:r>
-        <w:rPr>
-          <w:rFonts w:eastAsia="Times New Roman" w:cs="Times New Roman"/>
-          <w:color w:val="000000" w:themeColor="text1"/>
-          <w:szCs w:val="24"/>
-        </w:rPr>
-        <w:t xml:space="preserve">LiFi est </w:t>
-      </w:r>
-      <w:r>
-        <w:rPr>
-          <w:rFonts w:eastAsia="Times New Roman" w:cs="Times New Roman"/>
-          <w:color w:val="000000" w:themeColor="text1"/>
-          <w:szCs w:val="24"/>
-        </w:rPr>
-        <w:t xml:space="preserve">une nouvelle technologie de communication haute vitesse sans fil, bidirectionnelle, basée sur la lumière visible à modulation rapide. Il s’agit d’un type de système de communication à lumière visible (Visible Light Communications : VLC). Semblable au WiFi, le LiFi transmet des données à l’aide d’ondes électromagnétiques. Mais au lieu d’utiliser des ondes radio (MHz - GHz), il utilise la lumière visible ( THz). LiFi utilise des ampoules LED domestiques (light-emitting diodes) comme émetteurs. En faisant varier le courant électrique fourni à une ampoule LED à des vitesses extrêmement élevées, les données peuvent être encodées à mesure que la luminosité change rapidement, qui peuvent ensuite être captées par un photodétecteur (photodiode). Ces changements rapides sont trop rapides pour être remarqués aux yeux des humains; par conséquent, le LiFi n’affecte pas la fonction principale des lumières LED - </w:t>
-      </w:r>
-      <w:r>
-        <w:rPr>
-          <w:rFonts w:eastAsia="Times New Roman" w:cs="Times New Roman"/>
-          <w:color w:val="000000" w:themeColor="text1"/>
-          <w:szCs w:val="24"/>
-        </w:rPr>
-        <w:lastRenderedPageBreak/>
-        <w:t xml:space="preserve">l’éclairage. Le LiFi a un énorme avantage en termes d’infrastructure, car les ampoules LED sont de plus en plus utilisées dans les bâtiments, les rues et les véhicules. Il peut fonctionner à une vitesse impressionnante pouvant atteindre 224 gigabits par seconde et il est insensible aux interférences électromagnétiques. Le LiFi ne peut pas pénétrer les murs, ce qui signifie qu’il ne peut fonctionner qu’à courte portée, mais en même temps, cela le rend moins susceptible d’être piraté. </w:t>
-      </w:r>
-    </w:p>
-    <w:p>
-      <w:pPr>
-        <w:rPr>
-          <w:rFonts w:eastAsia="Times New Roman" w:cs="Times New Roman"/>
-          <w:color w:val="000000" w:themeColor="text1"/>
-          <w:szCs w:val="24"/>
-        </w:rPr>
-      </w:pPr>
-    </w:p>
-    <w:p>
-      <w:pPr>
-        <w:rPr>
-          <w:rFonts w:eastAsia="Times New Roman" w:cs="Times New Roman"/>
-          <w:color w:val="000000" w:themeColor="text1"/>
-          <w:szCs w:val="24"/>
-        </w:rPr>
-      </w:pPr>
+        <w:t xml:space="preserve">La technologie </w:t>
+      </w:r>
       <w:r>
         <w:rPr>
           <w:rFonts w:eastAsia="Times New Roman" w:cs="Times New Roman"/>
@@ -7231,7 +7195,7 @@
           <w:color w:val="000000" w:themeColor="text1"/>
           <w:szCs w:val="24"/>
         </w:rPr>
-        <w:t xml:space="preserve">La technologie </w:t>
+        <w:t xml:space="preserve">6LowAN : </w:t>
       </w:r>
       <w:r>
         <w:rPr>
@@ -7241,8 +7205,42 @@
           <w:color w:val="000000" w:themeColor="text1"/>
           <w:szCs w:val="24"/>
         </w:rPr>
-        <w:t xml:space="preserve">6LowAN : </w:t>
-      </w:r>
+        <w:t xml:space="preserve">6LowAN </w:t>
+      </w:r>
+      <w:r>
+        <w:rPr>
+          <w:rFonts w:eastAsia="Times New Roman" w:cs="Times New Roman"/>
+          <w:color w:val="000000" w:themeColor="text1"/>
+          <w:szCs w:val="24"/>
+        </w:rPr>
+        <w:t>signifie IPv6 (Internet Protocol Version 6) sur les réseaux personnels sans fil à faible puissance (Personal Area Networks : WPAN. Il s’agit essentiellement d’un réseau maillé sans fil à faible puissance et faible débit basé sur les normes IEEE 802.15.4, utilisant IPv6 comme protocole de communication. Comparé à d’autres réseaux locaux, 6LoWPAN a un avantage distinct, c’est-à-dire qu’il est basé sur des normes ouvertes TCP/IP, y compris TCP, UDP, HTTP, CoAP, MQTT et WebSockets etc. Il a des nœuds adressables IPv6 de bout en bout et peut être facilement connecté à Internet directement. Il est également auto-réparateur en raison du routage du maillage. 6LoWPAN a été utilisé dans les réseaux de capteurs sans fil, les lumières et les compteurs</w:t>
+      </w:r>
+      <w:r>
+        <w:rPr>
+          <w:rFonts w:eastAsia="Times New Roman" w:cs="Times New Roman"/>
+          <w:color w:val="000000" w:themeColor="text1"/>
+          <w:szCs w:val="24"/>
+        </w:rPr>
+        <w:t> </w:t>
+      </w:r>
+    </w:p>
+    <w:p>
+      <w:pPr>
+        <w:rPr>
+          <w:rFonts w:eastAsia="Times New Roman" w:cs="Times New Roman"/>
+          <w:color w:val="000000" w:themeColor="text1"/>
+          <w:szCs w:val="24"/>
+        </w:rPr>
+      </w:pPr>
+    </w:p>
+    <w:p>
+      <w:pPr>
+        <w:rPr>
+          <w:rFonts w:eastAsia="Times New Roman" w:cs="Times New Roman"/>
+          <w:color w:val="000000" w:themeColor="text1"/>
+          <w:szCs w:val="24"/>
+        </w:rPr>
+      </w:pPr>
       <w:r>
         <w:rPr>
           <w:rFonts w:eastAsia="Times New Roman" w:cs="Times New Roman"/>
@@ -7251,42 +7249,8 @@
           <w:color w:val="000000" w:themeColor="text1"/>
           <w:szCs w:val="24"/>
         </w:rPr>
-        <w:t xml:space="preserve">6LowAN </w:t>
-      </w:r>
-      <w:r>
-        <w:rPr>
-          <w:rFonts w:eastAsia="Times New Roman" w:cs="Times New Roman"/>
-          <w:color w:val="000000" w:themeColor="text1"/>
-          <w:szCs w:val="24"/>
-        </w:rPr>
-        <w:t>signifie IPv6 (Internet Protocol Version 6) sur les réseaux personnels sans fil à faible puissance (Personal Area Networks : WPAN. Il s’agit essentiellement d’un réseau maillé sans fil à faible puissance et faible débit basé sur les normes IEEE 802.15.4, utilisant IPv6 comme protocole de communication. Comparé à d’autres réseaux locaux, 6LoWPAN a un avantage distinct, c’est-à-dire qu’il est basé sur des normes ouvertes TCP/IP, y compris TCP, UDP, HTTP, CoAP, MQTT et WebSockets etc. Il a des nœuds adressables IPv6 de bout en bout et peut être facilement connecté à Internet directement. Il est également auto-réparateur en raison du routage du maillage. 6LoWPAN a été utilisé dans les réseaux de capteurs sans fil, les lumières et les compteurs</w:t>
-      </w:r>
-      <w:r>
-        <w:rPr>
-          <w:rFonts w:eastAsia="Times New Roman" w:cs="Times New Roman"/>
-          <w:color w:val="000000" w:themeColor="text1"/>
-          <w:szCs w:val="24"/>
-        </w:rPr>
-        <w:t> </w:t>
-      </w:r>
-    </w:p>
-    <w:p>
-      <w:pPr>
-        <w:rPr>
-          <w:rFonts w:eastAsia="Times New Roman" w:cs="Times New Roman"/>
-          <w:color w:val="000000" w:themeColor="text1"/>
-          <w:szCs w:val="24"/>
-        </w:rPr>
-      </w:pPr>
-    </w:p>
-    <w:p>
-      <w:pPr>
-        <w:rPr>
-          <w:rFonts w:eastAsia="Times New Roman" w:cs="Times New Roman"/>
-          <w:color w:val="000000" w:themeColor="text1"/>
-          <w:szCs w:val="24"/>
-        </w:rPr>
-      </w:pPr>
+        <w:t>La technologie</w:t>
+      </w:r>
       <w:r>
         <w:rPr>
           <w:rFonts w:eastAsia="Times New Roman" w:cs="Times New Roman"/>
@@ -7295,7 +7259,31 @@
           <w:color w:val="000000" w:themeColor="text1"/>
           <w:szCs w:val="24"/>
         </w:rPr>
-        <w:t>La technologie</w:t>
+        <w:t xml:space="preserve"> ZigBee </w:t>
+      </w:r>
+      <w:r>
+        <w:rPr>
+          <w:rFonts w:eastAsia="Times New Roman" w:cs="Times New Roman"/>
+          <w:color w:val="000000" w:themeColor="text1"/>
+          <w:szCs w:val="24"/>
+        </w:rPr>
+        <w:t>:</w:t>
+      </w:r>
+      <w:r>
+        <w:rPr>
+          <w:rFonts w:eastAsia="Times New Roman" w:cs="Times New Roman"/>
+          <w:color w:val="000000" w:themeColor="text1"/>
+          <w:szCs w:val="24"/>
+        </w:rPr>
+        <w:t xml:space="preserve"> </w:t>
+      </w:r>
+      <w:r>
+        <w:rPr>
+          <w:rFonts w:eastAsia="Times New Roman" w:cs="Times New Roman"/>
+          <w:color w:val="000000" w:themeColor="text1"/>
+          <w:szCs w:val="24"/>
+        </w:rPr>
+        <w:t>ZigBee</w:t>
       </w:r>
       <w:r>
         <w:rPr>
@@ -7305,7 +7293,7 @@
           <w:color w:val="000000" w:themeColor="text1"/>
           <w:szCs w:val="24"/>
         </w:rPr>
-        <w:t xml:space="preserve"> ZigBee </w:t>
+        <w:t> </w:t>
       </w:r>
       <w:r>
         <w:rPr>
@@ -7313,24 +7301,26 @@
           <w:color w:val="000000" w:themeColor="text1"/>
           <w:szCs w:val="24"/>
         </w:rPr>
-        <w:t>:</w:t>
-      </w:r>
-      <w:r>
+        <w:t xml:space="preserve">est une technologie de communication de haut niveau pour les réseaux personnels à faible puissance et à faible débit de données, tels que les réseaux de capteurs, les automatismes domestiques et les dispositifs médicaux. ZigBee est basé sur la norme IEEE 802.15.4. Il a une distance de transmission de 10 à 100 mètres et doit être en ligne de mire. Il opère dans les bandes radio industrielles, scientifiques et médicales (ISM), à savoir 868 MHz en Europe, 915 MHz aux États-Unis et en Australie, 784 MHz en Chine et 2,4 GHz dans le reste du monde. ZigBee a un débit de données allant de 20 kbit / s (bande 868 MHz) à 250 kbit / s (bande 2,4 GHz). </w:t>
+      </w:r>
+    </w:p>
+    <w:p>
+      <w:pPr>
         <w:rPr>
           <w:rFonts w:eastAsia="Times New Roman" w:cs="Times New Roman"/>
           <w:color w:val="000000" w:themeColor="text1"/>
           <w:szCs w:val="24"/>
         </w:rPr>
-        <w:t xml:space="preserve"> </w:t>
-      </w:r>
-      <w:r>
+      </w:pPr>
+    </w:p>
+    <w:p>
+      <w:pPr>
         <w:rPr>
           <w:rFonts w:eastAsia="Times New Roman" w:cs="Times New Roman"/>
           <w:color w:val="000000" w:themeColor="text1"/>
           <w:szCs w:val="24"/>
         </w:rPr>
-        <w:t>ZigBee</w:t>
-      </w:r>
+      </w:pPr>
       <w:r>
         <w:rPr>
           <w:rFonts w:eastAsia="Times New Roman" w:cs="Times New Roman"/>
@@ -7339,7 +7329,7 @@
           <w:color w:val="000000" w:themeColor="text1"/>
           <w:szCs w:val="24"/>
         </w:rPr>
-        <w:t> </w:t>
+        <w:t xml:space="preserve">La technologie Z-Wave : </w:t>
       </w:r>
       <w:r>
         <w:rPr>
@@ -7347,7 +7337,7 @@
           <w:color w:val="000000" w:themeColor="text1"/>
           <w:szCs w:val="24"/>
         </w:rPr>
-        <w:t xml:space="preserve">est </w:t>
+        <w:t xml:space="preserve">Z-Wave est une technologie de communication sans fil qui est principalement utilisée pour la domotique, comme le contrôle et l’automatisation des lumières et des appareils. Il peut être utilisé comme système de sécurité ou pour surveiller et contrôler votre propriété à distance. Z-Wave fonctionne dans la bande industrielle, scientifique et médicale (ISM) non autorisée, à savoir 868,42 MHz en Europe, 908,42 MHz aux États-Unis et au Canada, et </w:t>
       </w:r>
       <w:r>
         <w:rPr>
@@ -7355,7 +7345,8 @@
           <w:color w:val="000000" w:themeColor="text1"/>
           <w:szCs w:val="24"/>
         </w:rPr>
-        <w:t xml:space="preserve">une technologie de communication de haut niveau pour les réseaux personnels à faible puissance et à faible débit de données, tels que les réseaux de capteurs, les automatismes domestiques et les dispositifs médicaux. ZigBee est basé sur la norme IEEE 802.15.4. Il a une distance de transmission de 10 à 100 mètres et doit être en ligne de mire. Il opère dans les bandes radio industrielles, scientifiques et médicales (ISM), à savoir 868 MHz en Europe, 915 MHz aux États-Unis et en Australie, 784 MHz en Chine et 2,4 GHz dans le reste du monde. ZigBee a un débit de données allant de 20 kbit / s (bande 868 MHz) à 250 kbit / s (bande 2,4 GHz). </w:t>
+        <w:lastRenderedPageBreak/>
+        <w:t>d’autres fréquences dans d’autres régions. Z-Wave est conçu pour fournir une transmission fiable à faible latence à une portée d’environ 100 mètres, avec des débits de données jusqu’à 100 kbit/s.</w:t>
       </w:r>
     </w:p>
     <w:p>
@@ -7383,43 +7374,8 @@
           <w:color w:val="000000" w:themeColor="text1"/>
           <w:szCs w:val="24"/>
         </w:rPr>
-        <w:t xml:space="preserve">La technologie Z-Wave : </w:t>
-      </w:r>
-      <w:r>
-        <w:rPr>
-          <w:rFonts w:eastAsia="Times New Roman" w:cs="Times New Roman"/>
-          <w:color w:val="000000" w:themeColor="text1"/>
-          <w:szCs w:val="24"/>
-        </w:rPr>
-        <w:t xml:space="preserve">Z-Wave est une technologie de communication sans fil qui est principalement utilisée pour la domotique, comme le contrôle et l’automatisation des lumières et des appareils. Il peut être utilisé comme système de sécurité ou pour surveiller et contrôler votre propriété à distance. Z-Wave fonctionne dans la bande industrielle, scientifique et médicale (ISM) non autorisée, à savoir 868,42 MHz en Europe, 908,42 MHz aux États-Unis et au Canada, et </w:t>
-      </w:r>
-      <w:r>
-        <w:rPr>
-          <w:rFonts w:eastAsia="Times New Roman" w:cs="Times New Roman"/>
-          <w:color w:val="000000" w:themeColor="text1"/>
-          <w:szCs w:val="24"/>
-        </w:rPr>
-        <w:lastRenderedPageBreak/>
-        <w:t>d’autres fréquences dans d’autres régions. Z-Wave est conçu pour fournir une transmission fiable à faible latence à une portée d’environ 100 mètres, avec des débits de données jusqu’à 100 kbit/s.</w:t>
-      </w:r>
-    </w:p>
-    <w:p>
-      <w:pPr>
-        <w:rPr>
-          <w:rFonts w:eastAsia="Times New Roman" w:cs="Times New Roman"/>
-          <w:color w:val="000000" w:themeColor="text1"/>
-          <w:szCs w:val="24"/>
-        </w:rPr>
-      </w:pPr>
-    </w:p>
-    <w:p>
-      <w:pPr>
-        <w:rPr>
-          <w:rFonts w:eastAsia="Times New Roman" w:cs="Times New Roman"/>
-          <w:color w:val="000000" w:themeColor="text1"/>
-          <w:szCs w:val="24"/>
-        </w:rPr>
-      </w:pPr>
+        <w:t xml:space="preserve">La technologie </w:t>
+      </w:r>
       <w:r>
         <w:rPr>
           <w:rFonts w:eastAsia="Times New Roman" w:cs="Times New Roman"/>
@@ -7428,26 +7384,10 @@
           <w:color w:val="000000" w:themeColor="text1"/>
           <w:szCs w:val="24"/>
         </w:rPr>
-        <w:t xml:space="preserve">La technologie </w:t>
-      </w:r>
-      <w:r>
-        <w:rPr>
-          <w:rFonts w:eastAsia="Times New Roman" w:cs="Times New Roman"/>
-          <w:i/>
-          <w:iCs/>
-          <w:color w:val="000000" w:themeColor="text1"/>
-          <w:szCs w:val="24"/>
-        </w:rPr>
         <w:t xml:space="preserve">LoRa : </w:t>
       </w:r>
       <w:r>
-        <w:t>LoRa est une technologie de communication à longue portée conçue pour les communications à faible puissance et à longue distance des dispositifs IoT alimentés par batterie, c’est</w:t>
-      </w:r>
-      <w:r>
-        <w:t xml:space="preserve"> </w:t>
-      </w:r>
-      <w:r>
-        <w:t xml:space="preserve">à-dire un réseau étendu à faible puissance (LPWAN). Il prend en charge les communications bidirectionnelles sécurisées des réseaux avec des millions et des millions d’appareils. </w:t>
+        <w:t xml:space="preserve">LoRa est une technologie de communication à longue portée conçue pour les communications à faible puissance et à longue distance des dispositifs IoT alimentés par batterie, c’est à-dire un réseau étendu à faible puissance (LPWAN). Il prend en charge les communications bidirectionnelles sécurisées des réseaux avec des millions et des millions d’appareils. </w:t>
       </w:r>
     </w:p>
     <w:p>
@@ -7684,6 +7624,9 @@
     </w:p>
     <w:p>
       <w:r>
+        <w:rPr>
+          <w:noProof/>
+        </w:rPr>
         <w:drawing>
           <wp:inline distT="0" distB="0" distL="0" distR="0" wp14:anchorId="288F18FD" wp14:editId="14BE5C22">
             <wp:extent cx="5600700" cy="2984500"/>
@@ -7859,6 +7802,7 @@
       <w:r>
         <w:rPr>
           <w:rFonts w:eastAsia="Times New Roman" w:cs="Times New Roman"/>
+          <w:noProof/>
           <w:color w:val="000000" w:themeColor="text1"/>
           <w:szCs w:val="24"/>
         </w:rPr>
@@ -7913,10 +7857,7 @@
         <w:t>6</w:t>
       </w:r>
       <w:r>
-        <w:t xml:space="preserve"> : </w:t>
-      </w:r>
-      <w:r>
-        <w:t>Impact de l’IoT</w:t>
+        <w:t> : Impact de l’IoT</w:t>
       </w:r>
       <w:bookmarkEnd w:id="58"/>
     </w:p>
@@ -8350,16 +8291,7 @@
         </w:numPr>
       </w:pPr>
       <w:r>
-        <w:t xml:space="preserve">Solution </w:t>
-      </w:r>
-      <w:r>
-        <w:t>Envirofit</w:t>
-      </w:r>
-      <w:r>
-        <w:t xml:space="preserve"> </w:t>
-      </w:r>
-      <w:r>
-        <w:t>SmartGas</w:t>
+        <w:t>Solution Envirofit SmartGas</w:t>
       </w:r>
     </w:p>
     <w:p>
@@ -8865,13 +8797,7 @@
           </w:tcPr>
           <w:p>
             <w:r>
-              <w:t>En tant qu</w:t>
-            </w:r>
-            <w:r>
-              <w:t>’</w:t>
-            </w:r>
-            <w:r>
-              <w:t>utilisateur, je veux voir au travers de mon téléphone</w:t>
+              <w:t>En tant qu’utilisateur, je veux voir au travers de mon téléphone</w:t>
             </w:r>
           </w:p>
           <w:p>
@@ -8957,13 +8883,7 @@
           </w:tcPr>
           <w:p>
             <w:r>
-              <w:t>En tant qu</w:t>
-            </w:r>
-            <w:r>
-              <w:t>’</w:t>
-            </w:r>
-            <w:r>
-              <w:t>utilisateur, je veux pouvoir définir aisément sur mon</w:t>
+              <w:t>En tant qu’utilisateur, je veux pouvoir définir aisément sur mon</w:t>
             </w:r>
           </w:p>
           <w:p>
@@ -8983,13 +8903,7 @@
           </w:p>
           <w:p>
             <w:r>
-              <w:t>surpris si je n’ai pas mon téléphone proche de moi dans à la</w:t>
-            </w:r>
-            <w:r>
-              <w:t xml:space="preserve"> </w:t>
-            </w:r>
-            <w:r>
-              <w:t>cuisine</w:t>
+              <w:t>surpris si je n’ai pas mon téléphone proche de moi dans à la cuisine</w:t>
             </w:r>
           </w:p>
         </w:tc>
@@ -9075,13 +8989,7 @@
           </w:tcPr>
           <w:p>
             <w:r>
-              <w:t>En tant qu</w:t>
-            </w:r>
-            <w:r>
-              <w:t>’</w:t>
-            </w:r>
-            <w:r>
-              <w:t>utilisateur, je veux pouvoir facilement géolocaliser</w:t>
+              <w:t>En tant qu’utilisateur, je veux pouvoir facilement géolocaliser</w:t>
             </w:r>
           </w:p>
           <w:p>
@@ -9177,24 +9085,12 @@
           </w:tcPr>
           <w:p>
             <w:r>
-              <w:t>En tant qu</w:t>
-            </w:r>
-            <w:r>
-              <w:t>’</w:t>
-            </w:r>
-            <w:r>
-              <w:t>utilisateur, je veux pouvoir contacter un distributeur</w:t>
+              <w:t>En tant qu’utilisateur, je veux pouvoir contacter un distributeur</w:t>
             </w:r>
           </w:p>
           <w:p>
             <w:r>
-              <w:t>donné afin de prendre confirmation s</w:t>
-            </w:r>
-            <w:r>
-              <w:t>’</w:t>
-            </w:r>
-            <w:r>
-              <w:t>il y a toujours du gaz en</w:t>
+              <w:t>donné afin de prendre confirmation s’il y a toujours du gaz en</w:t>
             </w:r>
           </w:p>
           <w:p>
@@ -9377,10 +9273,7 @@
           </w:p>
           <w:p>
             <w:r>
-              <w:t>mon stock de gaz afin de notifier aux clients si je possède</w:t>
-            </w:r>
-            <w:r>
-              <w:t xml:space="preserve"> </w:t>
+              <w:t xml:space="preserve">mon stock de gaz afin de notifier aux clients si je possède </w:t>
             </w:r>
             <w:r>
               <w:t>encore ou non du gaz.</w:t>
@@ -9507,15 +9400,1076 @@
       <w:bookmarkEnd w:id="74"/>
     </w:p>
     <w:p>
-      <w:pPr>
-        <w:ind w:firstLine="567"/>
-      </w:pPr>
-    </w:p>
-    <w:p>
-      <w:pPr>
-        <w:ind w:firstLine="567"/>
-      </w:pPr>
-    </w:p>
+      <w:r>
+        <w:t>Les besoins non fonctionnels regroupent l’ensemble des exigences qui ne concernent pas directement les fonctionnalités du système, mais plutôt la manière dont celui-ci doit fonctionner. Ils définissent les critères de qualité, de performance, de fiabilité, de sécurité, d’ergonomie et de maintenabilité auxquels la solution doit répondre. Contrairement aux besoins fonctionnels qui décrivent ce que fait le système, les besoins non fonctionnels décrivent comment il doit le faire. Ils garantissent une expérience utilisateur optimale, assurent la robustesse technique du système et contribuent à la pérennité de la solution.</w:t>
+      </w:r>
+    </w:p>
+    <w:p/>
+    <w:p>
+      <w:pPr>
+        <w:rPr>
+          <w:b/>
+          <w:bCs/>
+        </w:rPr>
+      </w:pPr>
+      <w:r>
+        <w:rPr>
+          <w:b/>
+          <w:bCs/>
+        </w:rPr>
+        <w:t>1. Consultation du niveau de gaz en temps réel</w:t>
+      </w:r>
+    </w:p>
+    <w:tbl>
+      <w:tblPr>
+        <w:tblStyle w:val="TableGrid"/>
+        <w:tblW w:w="0" w:type="auto"/>
+        <w:tblLook w:val="04A0" w:firstRow="1" w:lastRow="0" w:firstColumn="1" w:lastColumn="0" w:noHBand="0" w:noVBand="1"/>
+      </w:tblPr>
+      <w:tblGrid>
+        <w:gridCol w:w="2689"/>
+        <w:gridCol w:w="6706"/>
+      </w:tblGrid>
+      <w:tr>
+        <w:tc>
+          <w:tcPr>
+            <w:tcW w:w="2689" w:type="dxa"/>
+          </w:tcPr>
+          <w:p>
+            <w:pPr>
+              <w:rPr>
+                <w:b/>
+                <w:bCs/>
+              </w:rPr>
+            </w:pPr>
+            <w:r>
+              <w:rPr>
+                <w:b/>
+                <w:bCs/>
+              </w:rPr>
+              <w:t xml:space="preserve">Critère </w:t>
+            </w:r>
+          </w:p>
+        </w:tc>
+        <w:tc>
+          <w:tcPr>
+            <w:tcW w:w="6706" w:type="dxa"/>
+          </w:tcPr>
+          <w:p>
+            <w:pPr>
+              <w:rPr>
+                <w:b/>
+                <w:bCs/>
+              </w:rPr>
+            </w:pPr>
+            <w:r>
+              <w:rPr>
+                <w:b/>
+                <w:bCs/>
+              </w:rPr>
+              <w:t>Exigence</w:t>
+            </w:r>
+          </w:p>
+        </w:tc>
+      </w:tr>
+      <w:tr>
+        <w:tc>
+          <w:tcPr>
+            <w:tcW w:w="2689" w:type="dxa"/>
+          </w:tcPr>
+          <w:p>
+            <w:r>
+              <w:t>Performance (Latence)</w:t>
+            </w:r>
+          </w:p>
+        </w:tc>
+        <w:tc>
+          <w:tcPr>
+            <w:tcW w:w="6706" w:type="dxa"/>
+          </w:tcPr>
+          <w:p>
+            <w:pPr>
+              <w:pStyle w:val="ListParagraph"/>
+              <w:numPr>
+                <w:ilvl w:val="0"/>
+                <w:numId w:val="16"/>
+              </w:numPr>
+            </w:pPr>
+            <w:r>
+              <w:t xml:space="preserve">Le temps de mise à jour du niveau de gaz ne doit pas excéder </w:t>
+            </w:r>
+            <w:r>
+              <w:t>5</w:t>
+            </w:r>
+            <w:r>
+              <w:t xml:space="preserve"> secondes entre la mesure IoT et l’affichage sur le smartphone.</w:t>
+            </w:r>
+          </w:p>
+          <w:p>
+            <w:pPr>
+              <w:pStyle w:val="ListParagraph"/>
+              <w:numPr>
+                <w:ilvl w:val="0"/>
+                <w:numId w:val="16"/>
+              </w:numPr>
+            </w:pPr>
+          </w:p>
+        </w:tc>
+      </w:tr>
+      <w:tr>
+        <w:tc>
+          <w:tcPr>
+            <w:tcW w:w="2689" w:type="dxa"/>
+          </w:tcPr>
+          <w:p>
+            <w:r>
+              <w:t>Fiabilité</w:t>
+            </w:r>
+          </w:p>
+        </w:tc>
+        <w:tc>
+          <w:tcPr>
+            <w:tcW w:w="6706" w:type="dxa"/>
+          </w:tcPr>
+          <w:p>
+            <w:pPr>
+              <w:pStyle w:val="ListParagraph"/>
+              <w:numPr>
+                <w:ilvl w:val="0"/>
+                <w:numId w:val="16"/>
+              </w:numPr>
+            </w:pPr>
+            <w:r>
+              <w:t>Le système doit garantir une précision minimale de ±5% sur le niveau de gaz affiché.</w:t>
+            </w:r>
+          </w:p>
+          <w:p>
+            <w:pPr>
+              <w:pStyle w:val="ListParagraph"/>
+              <w:numPr>
+                <w:ilvl w:val="0"/>
+                <w:numId w:val="16"/>
+              </w:numPr>
+            </w:pPr>
+            <w:r>
+              <w:t xml:space="preserve">En cas de perte de </w:t>
+            </w:r>
+            <w:r>
+              <w:t>connectivité</w:t>
+            </w:r>
+            <w:r>
+              <w:t>, l’application doit afficher la dernière donnée valide et notifier l’utilisateur.</w:t>
+            </w:r>
+          </w:p>
+        </w:tc>
+      </w:tr>
+      <w:tr>
+        <w:tc>
+          <w:tcPr>
+            <w:tcW w:w="2689" w:type="dxa"/>
+          </w:tcPr>
+          <w:p>
+            <w:r>
+              <w:t>Ergonomie</w:t>
+            </w:r>
+          </w:p>
+        </w:tc>
+        <w:tc>
+          <w:tcPr>
+            <w:tcW w:w="6706" w:type="dxa"/>
+          </w:tcPr>
+          <w:p>
+            <w:r>
+              <w:t>L’affichage du niveau doit être clair, lisible</w:t>
+            </w:r>
+            <w:r>
+              <w:t xml:space="preserve"> et facile à comprendre.</w:t>
+            </w:r>
+          </w:p>
+        </w:tc>
+      </w:tr>
+      <w:tr>
+        <w:tc>
+          <w:tcPr>
+            <w:tcW w:w="2689" w:type="dxa"/>
+          </w:tcPr>
+          <w:p>
+            <w:r>
+              <w:t>Compatibilité</w:t>
+            </w:r>
+          </w:p>
+        </w:tc>
+        <w:tc>
+          <w:tcPr>
+            <w:tcW w:w="6706" w:type="dxa"/>
+          </w:tcPr>
+          <w:p>
+            <w:r>
+              <w:t xml:space="preserve">L'application doit fonctionner sur Android </w:t>
+            </w:r>
+            <w:r>
+              <w:t>e</w:t>
+            </w:r>
+            <w:r>
+              <w:t xml:space="preserve">t iOS </w:t>
+            </w:r>
+          </w:p>
+        </w:tc>
+      </w:tr>
+      <w:tr>
+        <w:tc>
+          <w:tcPr>
+            <w:tcW w:w="2689" w:type="dxa"/>
+          </w:tcPr>
+          <w:p>
+            <w:r>
+              <w:t>Disponibilité</w:t>
+            </w:r>
+          </w:p>
+        </w:tc>
+        <w:tc>
+          <w:tcPr>
+            <w:tcW w:w="6706" w:type="dxa"/>
+          </w:tcPr>
+          <w:p>
+            <w:r>
+              <w:t>Le service doit être toujours disponible si toutes les conditions sont réunies</w:t>
+            </w:r>
+          </w:p>
+        </w:tc>
+      </w:tr>
+    </w:tbl>
+    <w:p/>
+    <w:p>
+      <w:pPr>
+        <w:rPr>
+          <w:b/>
+          <w:bCs/>
+        </w:rPr>
+      </w:pPr>
+      <w:r>
+        <w:rPr>
+          <w:b/>
+          <w:bCs/>
+        </w:rPr>
+        <w:lastRenderedPageBreak/>
+        <w:t>2. Définition du seuil d'alerte de consommation</w:t>
+      </w:r>
+    </w:p>
+    <w:tbl>
+      <w:tblPr>
+        <w:tblStyle w:val="TableGrid"/>
+        <w:tblW w:w="0" w:type="auto"/>
+        <w:tblLook w:val="04A0" w:firstRow="1" w:lastRow="0" w:firstColumn="1" w:lastColumn="0" w:noHBand="0" w:noVBand="1"/>
+      </w:tblPr>
+      <w:tblGrid>
+        <w:gridCol w:w="3114"/>
+        <w:gridCol w:w="6281"/>
+      </w:tblGrid>
+      <w:tr>
+        <w:tc>
+          <w:tcPr>
+            <w:tcW w:w="3114" w:type="dxa"/>
+          </w:tcPr>
+          <w:p>
+            <w:pPr>
+              <w:rPr>
+                <w:b/>
+                <w:bCs/>
+              </w:rPr>
+            </w:pPr>
+            <w:r>
+              <w:rPr>
+                <w:b/>
+                <w:bCs/>
+              </w:rPr>
+              <w:t xml:space="preserve">Critère </w:t>
+            </w:r>
+          </w:p>
+        </w:tc>
+        <w:tc>
+          <w:tcPr>
+            <w:tcW w:w="6281" w:type="dxa"/>
+          </w:tcPr>
+          <w:p>
+            <w:pPr>
+              <w:rPr>
+                <w:b/>
+                <w:bCs/>
+              </w:rPr>
+            </w:pPr>
+            <w:r>
+              <w:rPr>
+                <w:b/>
+                <w:bCs/>
+              </w:rPr>
+              <w:t>Exigence</w:t>
+            </w:r>
+          </w:p>
+        </w:tc>
+      </w:tr>
+      <w:tr>
+        <w:tc>
+          <w:tcPr>
+            <w:tcW w:w="3114" w:type="dxa"/>
+          </w:tcPr>
+          <w:p>
+            <w:r>
+              <w:t>Facilité d'utilisation</w:t>
+            </w:r>
+          </w:p>
+        </w:tc>
+        <w:tc>
+          <w:tcPr>
+            <w:tcW w:w="6281" w:type="dxa"/>
+          </w:tcPr>
+          <w:p>
+            <w:r>
+              <w:t>Le paramétrage du seuil ne doit pas nécessiter plus de 3 actions utilisateur</w:t>
+            </w:r>
+          </w:p>
+        </w:tc>
+      </w:tr>
+      <w:tr>
+        <w:tc>
+          <w:tcPr>
+            <w:tcW w:w="3114" w:type="dxa"/>
+          </w:tcPr>
+          <w:p>
+            <w:r>
+              <w:t>Réactivité</w:t>
+            </w:r>
+          </w:p>
+        </w:tc>
+        <w:tc>
+          <w:tcPr>
+            <w:tcW w:w="6281" w:type="dxa"/>
+          </w:tcPr>
+          <w:p>
+            <w:r>
+              <w:t>L'alerte doit être déclenchée dans les 10 secondes suivant l'atteinte du seuil défini</w:t>
+            </w:r>
+          </w:p>
+        </w:tc>
+      </w:tr>
+      <w:tr>
+        <w:tc>
+          <w:tcPr>
+            <w:tcW w:w="3114" w:type="dxa"/>
+          </w:tcPr>
+          <w:p>
+            <w:r>
+              <w:t>Fiabilité</w:t>
+            </w:r>
+          </w:p>
+        </w:tc>
+        <w:tc>
+          <w:tcPr>
+            <w:tcW w:w="6281" w:type="dxa"/>
+          </w:tcPr>
+          <w:p>
+            <w:r>
+              <w:t>Le système doit garantir l'envoi de l'alerte avec un taux de réussite de 9</w:t>
+            </w:r>
+            <w:r>
+              <w:t>/10</w:t>
+            </w:r>
+          </w:p>
+        </w:tc>
+      </w:tr>
+      <w:tr>
+        <w:tc>
+          <w:tcPr>
+            <w:tcW w:w="3114" w:type="dxa"/>
+          </w:tcPr>
+          <w:p>
+            <w:r>
+              <w:t>Notifications</w:t>
+            </w:r>
+          </w:p>
+        </w:tc>
+        <w:tc>
+          <w:tcPr>
+            <w:tcW w:w="6281" w:type="dxa"/>
+          </w:tcPr>
+          <w:p>
+            <w:r>
+              <w:t>Les alertes doivent être envoyées via notification push</w:t>
+            </w:r>
+            <w:r>
+              <w:t xml:space="preserve"> accompagné d’un</w:t>
+            </w:r>
+            <w:r>
+              <w:t xml:space="preserve"> signal sonore sur l'appareil</w:t>
+            </w:r>
+            <w:r>
+              <w:t xml:space="preserve"> (personnalisable)</w:t>
+            </w:r>
+          </w:p>
+        </w:tc>
+      </w:tr>
+      <w:tr>
+        <w:tc>
+          <w:tcPr>
+            <w:tcW w:w="3114" w:type="dxa"/>
+          </w:tcPr>
+          <w:p>
+            <w:r>
+              <w:t>Personnalisation</w:t>
+            </w:r>
+          </w:p>
+        </w:tc>
+        <w:tc>
+          <w:tcPr>
+            <w:tcW w:w="6281" w:type="dxa"/>
+          </w:tcPr>
+          <w:p>
+            <w:r>
+              <w:t>L'utilisateur doit pouvoir définir des seuils différents selon ses besoins</w:t>
+            </w:r>
+          </w:p>
+        </w:tc>
+      </w:tr>
+    </w:tbl>
+    <w:p/>
+    <w:p>
+      <w:pPr>
+        <w:rPr>
+          <w:b/>
+          <w:bCs/>
+        </w:rPr>
+      </w:pPr>
+      <w:r>
+        <w:rPr>
+          <w:b/>
+          <w:bCs/>
+        </w:rPr>
+        <w:t>3. Géolocalisation des distributeurs disponibles (par type de gaz)</w:t>
+      </w:r>
+    </w:p>
+    <w:tbl>
+      <w:tblPr>
+        <w:tblStyle w:val="TableGrid"/>
+        <w:tblW w:w="0" w:type="auto"/>
+        <w:tblLook w:val="04A0" w:firstRow="1" w:lastRow="0" w:firstColumn="1" w:lastColumn="0" w:noHBand="0" w:noVBand="1"/>
+      </w:tblPr>
+      <w:tblGrid>
+        <w:gridCol w:w="3114"/>
+        <w:gridCol w:w="6281"/>
+      </w:tblGrid>
+      <w:tr>
+        <w:tc>
+          <w:tcPr>
+            <w:tcW w:w="3114" w:type="dxa"/>
+          </w:tcPr>
+          <w:p>
+            <w:pPr>
+              <w:rPr>
+                <w:b/>
+                <w:bCs/>
+              </w:rPr>
+            </w:pPr>
+            <w:r>
+              <w:rPr>
+                <w:b/>
+                <w:bCs/>
+              </w:rPr>
+              <w:t xml:space="preserve">Critère </w:t>
+            </w:r>
+          </w:p>
+        </w:tc>
+        <w:tc>
+          <w:tcPr>
+            <w:tcW w:w="6281" w:type="dxa"/>
+          </w:tcPr>
+          <w:p>
+            <w:pPr>
+              <w:rPr>
+                <w:b/>
+                <w:bCs/>
+              </w:rPr>
+            </w:pPr>
+            <w:r>
+              <w:rPr>
+                <w:b/>
+                <w:bCs/>
+              </w:rPr>
+              <w:t>Exigence</w:t>
+            </w:r>
+          </w:p>
+        </w:tc>
+      </w:tr>
+      <w:tr>
+        <w:tc>
+          <w:tcPr>
+            <w:tcW w:w="3114" w:type="dxa"/>
+          </w:tcPr>
+          <w:p>
+            <w:r>
+              <w:t>Exactitude</w:t>
+            </w:r>
+          </w:p>
+        </w:tc>
+        <w:tc>
+          <w:tcPr>
+            <w:tcW w:w="6281" w:type="dxa"/>
+          </w:tcPr>
+          <w:p>
+            <w:r>
+              <w:t>La géolocalisation doit être précise dans un rayon de 10 à 20 mètres pour permettre un guidage efficace.</w:t>
+            </w:r>
+          </w:p>
+        </w:tc>
+      </w:tr>
+      <w:tr>
+        <w:tc>
+          <w:tcPr>
+            <w:tcW w:w="3114" w:type="dxa"/>
+          </w:tcPr>
+          <w:p>
+            <w:r>
+              <w:t>Performance</w:t>
+            </w:r>
+            <w:r>
+              <w:t xml:space="preserve"> de recherche</w:t>
+            </w:r>
+          </w:p>
+        </w:tc>
+        <w:tc>
+          <w:tcPr>
+            <w:tcW w:w="6281" w:type="dxa"/>
+          </w:tcPr>
+          <w:p>
+            <w:r>
+              <w:t>La liste des distributeurs dans un rayon défini (ex: 5km) doit s'afficher en moins de 2 secondes.</w:t>
+            </w:r>
+          </w:p>
+        </w:tc>
+      </w:tr>
+      <w:tr>
+        <w:tc>
+          <w:tcPr>
+            <w:tcW w:w="3114" w:type="dxa"/>
+          </w:tcPr>
+          <w:p>
+            <w:r>
+              <w:t>Filtrage</w:t>
+            </w:r>
+          </w:p>
+        </w:tc>
+        <w:tc>
+          <w:tcPr>
+            <w:tcW w:w="6281" w:type="dxa"/>
+          </w:tcPr>
+          <w:p>
+            <w:r>
+              <w:t>Lors de sa recherche, l</w:t>
+            </w:r>
+            <w:r>
+              <w:t>'utilisateur doit pouvoir filtrer les résultats par type de gaz, distance (</w:t>
+            </w:r>
+            <w:r>
+              <w:t xml:space="preserve">ex : </w:t>
+            </w:r>
+            <w:r>
+              <w:t xml:space="preserve">rayon </w:t>
+            </w:r>
+            <w:r>
+              <w:t>de</w:t>
+            </w:r>
+            <w:r>
+              <w:t xml:space="preserve"> </w:t>
+            </w:r>
+            <w:r>
+              <w:t>2</w:t>
+            </w:r>
+            <w:r>
+              <w:t xml:space="preserve"> km) et disponibilité</w:t>
+            </w:r>
+          </w:p>
+        </w:tc>
+      </w:tr>
+    </w:tbl>
+    <w:p/>
+    <w:p/>
+    <w:p>
+      <w:pPr>
+        <w:rPr>
+          <w:b/>
+          <w:bCs/>
+        </w:rPr>
+      </w:pPr>
+      <w:r>
+        <w:rPr>
+          <w:b/>
+          <w:bCs/>
+        </w:rPr>
+        <w:t xml:space="preserve">4. Prise de contact avec un </w:t>
+      </w:r>
+      <w:r>
+        <w:rPr>
+          <w:b/>
+          <w:bCs/>
+        </w:rPr>
+        <w:t>revendeur</w:t>
+      </w:r>
+    </w:p>
+    <w:tbl>
+      <w:tblPr>
+        <w:tblStyle w:val="TableGrid"/>
+        <w:tblW w:w="0" w:type="auto"/>
+        <w:tblLook w:val="04A0" w:firstRow="1" w:lastRow="0" w:firstColumn="1" w:lastColumn="0" w:noHBand="0" w:noVBand="1"/>
+      </w:tblPr>
+      <w:tblGrid>
+        <w:gridCol w:w="2689"/>
+        <w:gridCol w:w="6706"/>
+      </w:tblGrid>
+      <w:tr>
+        <w:tc>
+          <w:tcPr>
+            <w:tcW w:w="2689" w:type="dxa"/>
+          </w:tcPr>
+          <w:p>
+            <w:pPr>
+              <w:rPr>
+                <w:b/>
+                <w:bCs/>
+              </w:rPr>
+            </w:pPr>
+            <w:r>
+              <w:rPr>
+                <w:b/>
+                <w:bCs/>
+              </w:rPr>
+              <w:t xml:space="preserve">Critère </w:t>
+            </w:r>
+          </w:p>
+        </w:tc>
+        <w:tc>
+          <w:tcPr>
+            <w:tcW w:w="6706" w:type="dxa"/>
+          </w:tcPr>
+          <w:p>
+            <w:pPr>
+              <w:rPr>
+                <w:b/>
+                <w:bCs/>
+              </w:rPr>
+            </w:pPr>
+            <w:r>
+              <w:rPr>
+                <w:b/>
+                <w:bCs/>
+              </w:rPr>
+              <w:t>Exigence</w:t>
+            </w:r>
+          </w:p>
+        </w:tc>
+      </w:tr>
+      <w:tr>
+        <w:tc>
+          <w:tcPr>
+            <w:tcW w:w="2689" w:type="dxa"/>
+          </w:tcPr>
+          <w:p>
+            <w:r>
+              <w:t>Interopérabilité</w:t>
+            </w:r>
+          </w:p>
+        </w:tc>
+        <w:tc>
+          <w:tcPr>
+            <w:tcW w:w="6706" w:type="dxa"/>
+          </w:tcPr>
+          <w:p>
+            <w:r>
+              <w:t>L'application doit s'interfacer nativement avec les fonctions du téléphone (Redirection directe vers le clavier d'appel, WhatsApp ou l'app de SMS)</w:t>
+            </w:r>
+          </w:p>
+        </w:tc>
+      </w:tr>
+    </w:tbl>
+    <w:p/>
+    <w:p>
+      <w:pPr>
+        <w:rPr>
+          <w:b/>
+          <w:bCs/>
+        </w:rPr>
+      </w:pPr>
+      <w:r>
+        <w:rPr>
+          <w:b/>
+          <w:bCs/>
+        </w:rPr>
+        <w:lastRenderedPageBreak/>
+        <w:t>5. Consultation des réservations clients (côté gérant)</w:t>
+      </w:r>
+    </w:p>
+    <w:tbl>
+      <w:tblPr>
+        <w:tblStyle w:val="TableGrid"/>
+        <w:tblW w:w="0" w:type="auto"/>
+        <w:tblLook w:val="04A0" w:firstRow="1" w:lastRow="0" w:firstColumn="1" w:lastColumn="0" w:noHBand="0" w:noVBand="1"/>
+      </w:tblPr>
+      <w:tblGrid>
+        <w:gridCol w:w="2689"/>
+        <w:gridCol w:w="6706"/>
+      </w:tblGrid>
+      <w:tr>
+        <w:tc>
+          <w:tcPr>
+            <w:tcW w:w="2689" w:type="dxa"/>
+          </w:tcPr>
+          <w:p>
+            <w:pPr>
+              <w:rPr>
+                <w:b/>
+                <w:bCs/>
+              </w:rPr>
+            </w:pPr>
+            <w:r>
+              <w:rPr>
+                <w:b/>
+                <w:bCs/>
+              </w:rPr>
+              <w:t xml:space="preserve">Critère </w:t>
+            </w:r>
+          </w:p>
+        </w:tc>
+        <w:tc>
+          <w:tcPr>
+            <w:tcW w:w="6706" w:type="dxa"/>
+          </w:tcPr>
+          <w:p>
+            <w:pPr>
+              <w:rPr>
+                <w:b/>
+                <w:bCs/>
+              </w:rPr>
+            </w:pPr>
+            <w:r>
+              <w:rPr>
+                <w:b/>
+                <w:bCs/>
+              </w:rPr>
+              <w:t>Exigence</w:t>
+            </w:r>
+          </w:p>
+        </w:tc>
+      </w:tr>
+      <w:tr>
+        <w:tc>
+          <w:tcPr>
+            <w:tcW w:w="2689" w:type="dxa"/>
+          </w:tcPr>
+          <w:p>
+            <w:r>
+              <w:t>Sécurité</w:t>
+            </w:r>
+          </w:p>
+        </w:tc>
+        <w:tc>
+          <w:tcPr>
+            <w:tcW w:w="6706" w:type="dxa"/>
+          </w:tcPr>
+          <w:p>
+            <w:r>
+              <w:t>Seuls les utilisateurs authentifiés avec un rôle "Gérant" validé peuvent accéder à cette interface.</w:t>
+            </w:r>
+          </w:p>
+        </w:tc>
+      </w:tr>
+      <w:tr>
+        <w:tc>
+          <w:tcPr>
+            <w:tcW w:w="2689" w:type="dxa"/>
+          </w:tcPr>
+          <w:p>
+            <w:r>
+              <w:t>Filtrage</w:t>
+            </w:r>
+          </w:p>
+        </w:tc>
+        <w:tc>
+          <w:tcPr>
+            <w:tcW w:w="6706" w:type="dxa"/>
+          </w:tcPr>
+          <w:p>
+            <w:r>
+              <w:t>Le gérant doit pouvoir filtrer les réservations par date, statut, type de gaz</w:t>
+            </w:r>
+            <w:r>
+              <w:t>.</w:t>
+            </w:r>
+          </w:p>
+        </w:tc>
+      </w:tr>
+      <w:tr>
+        <w:tc>
+          <w:tcPr>
+            <w:tcW w:w="2689" w:type="dxa"/>
+          </w:tcPr>
+          <w:p>
+            <w:r>
+              <w:t>Notifications</w:t>
+            </w:r>
+          </w:p>
+        </w:tc>
+        <w:tc>
+          <w:tcPr>
+            <w:tcW w:w="6706" w:type="dxa"/>
+          </w:tcPr>
+          <w:p>
+            <w:r>
+              <w:t>Le gérant doit recevoir une notification instantanée à chaque nouvelle réservation</w:t>
+            </w:r>
+          </w:p>
+        </w:tc>
+      </w:tr>
+    </w:tbl>
+    <w:p/>
+    <w:p/>
+    <w:p>
+      <w:pPr>
+        <w:rPr>
+          <w:b/>
+          <w:bCs/>
+        </w:rPr>
+      </w:pPr>
+      <w:r>
+        <w:rPr>
+          <w:b/>
+          <w:bCs/>
+        </w:rPr>
+        <w:t>6. Mise à jour du stock de gaz (côté gérant)</w:t>
+      </w:r>
+    </w:p>
+    <w:tbl>
+      <w:tblPr>
+        <w:tblStyle w:val="TableGrid"/>
+        <w:tblW w:w="0" w:type="auto"/>
+        <w:tblLook w:val="04A0" w:firstRow="1" w:lastRow="0" w:firstColumn="1" w:lastColumn="0" w:noHBand="0" w:noVBand="1"/>
+      </w:tblPr>
+      <w:tblGrid>
+        <w:gridCol w:w="2689"/>
+        <w:gridCol w:w="6706"/>
+      </w:tblGrid>
+      <w:tr>
+        <w:tc>
+          <w:tcPr>
+            <w:tcW w:w="2689" w:type="dxa"/>
+          </w:tcPr>
+          <w:p>
+            <w:pPr>
+              <w:rPr>
+                <w:b/>
+                <w:bCs/>
+              </w:rPr>
+            </w:pPr>
+            <w:r>
+              <w:rPr>
+                <w:b/>
+                <w:bCs/>
+              </w:rPr>
+              <w:t xml:space="preserve">Critère </w:t>
+            </w:r>
+          </w:p>
+        </w:tc>
+        <w:tc>
+          <w:tcPr>
+            <w:tcW w:w="6706" w:type="dxa"/>
+          </w:tcPr>
+          <w:p>
+            <w:pPr>
+              <w:rPr>
+                <w:b/>
+                <w:bCs/>
+              </w:rPr>
+            </w:pPr>
+            <w:r>
+              <w:rPr>
+                <w:b/>
+                <w:bCs/>
+              </w:rPr>
+              <w:t>Exigence</w:t>
+            </w:r>
+          </w:p>
+        </w:tc>
+      </w:tr>
+      <w:tr>
+        <w:tc>
+          <w:tcPr>
+            <w:tcW w:w="2689" w:type="dxa"/>
+          </w:tcPr>
+          <w:p>
+            <w:r>
+              <w:t>Simplicité</w:t>
+            </w:r>
+          </w:p>
+        </w:tc>
+        <w:tc>
+          <w:tcPr>
+            <w:tcW w:w="6706" w:type="dxa"/>
+          </w:tcPr>
+          <w:p>
+            <w:r>
+              <w:t xml:space="preserve">La mise à jour du stock ne doit pas nécessiter plus de </w:t>
+            </w:r>
+            <w:r>
+              <w:t>3</w:t>
+            </w:r>
+            <w:r>
+              <w:t xml:space="preserve"> actions</w:t>
+            </w:r>
+          </w:p>
+        </w:tc>
+      </w:tr>
+      <w:tr>
+        <w:tc>
+          <w:tcPr>
+            <w:tcW w:w="2689" w:type="dxa"/>
+          </w:tcPr>
+          <w:p>
+            <w:r>
+              <w:t xml:space="preserve">Intégrité des données </w:t>
+            </w:r>
+          </w:p>
+        </w:tc>
+        <w:tc>
+          <w:tcPr>
+            <w:tcW w:w="6706" w:type="dxa"/>
+          </w:tcPr>
+          <w:p>
+            <w:r>
+              <w:t>La mise à jour du stock doit être immédiate</w:t>
+            </w:r>
+            <w:r>
+              <w:t xml:space="preserve">. </w:t>
+            </w:r>
+            <w:r>
+              <w:t>Dès que le gérant valide une entrée/sortie, le stock visible par les clients (Fonctionnalité 3) doit être à jour pour éviter de déplacer un client pour rien.</w:t>
+            </w:r>
+          </w:p>
+        </w:tc>
+      </w:tr>
+    </w:tbl>
+    <w:p/>
+    <w:p/>
+    <w:p>
+      <w:pPr>
+        <w:rPr>
+          <w:b/>
+          <w:bCs/>
+        </w:rPr>
+      </w:pPr>
+      <w:r>
+        <w:rPr>
+          <w:b/>
+          <w:bCs/>
+        </w:rPr>
+        <w:t>7. Mini Gestion du catalogue de gaz (côté gérant)</w:t>
+      </w:r>
+    </w:p>
+    <w:tbl>
+      <w:tblPr>
+        <w:tblStyle w:val="TableGrid"/>
+        <w:tblW w:w="0" w:type="auto"/>
+        <w:tblLook w:val="04A0" w:firstRow="1" w:lastRow="0" w:firstColumn="1" w:lastColumn="0" w:noHBand="0" w:noVBand="1"/>
+      </w:tblPr>
+      <w:tblGrid>
+        <w:gridCol w:w="2689"/>
+        <w:gridCol w:w="6706"/>
+      </w:tblGrid>
+      <w:tr>
+        <w:tc>
+          <w:tcPr>
+            <w:tcW w:w="2689" w:type="dxa"/>
+          </w:tcPr>
+          <w:p>
+            <w:pPr>
+              <w:rPr>
+                <w:b/>
+                <w:bCs/>
+              </w:rPr>
+            </w:pPr>
+            <w:r>
+              <w:rPr>
+                <w:b/>
+                <w:bCs/>
+              </w:rPr>
+              <w:t xml:space="preserve">Critère </w:t>
+            </w:r>
+          </w:p>
+        </w:tc>
+        <w:tc>
+          <w:tcPr>
+            <w:tcW w:w="6706" w:type="dxa"/>
+          </w:tcPr>
+          <w:p>
+            <w:pPr>
+              <w:rPr>
+                <w:b/>
+                <w:bCs/>
+              </w:rPr>
+            </w:pPr>
+            <w:r>
+              <w:rPr>
+                <w:b/>
+                <w:bCs/>
+              </w:rPr>
+              <w:t>Exigence</w:t>
+            </w:r>
+          </w:p>
+        </w:tc>
+      </w:tr>
+      <w:tr>
+        <w:tc>
+          <w:tcPr>
+            <w:tcW w:w="2689" w:type="dxa"/>
+          </w:tcPr>
+          <w:p>
+            <w:r>
+              <w:t>Flexibilité</w:t>
+            </w:r>
+          </w:p>
+        </w:tc>
+        <w:tc>
+          <w:tcPr>
+            <w:tcW w:w="6706" w:type="dxa"/>
+          </w:tcPr>
+          <w:p>
+            <w:r>
+              <w:t>Le gérant doit pouvoir ajouter, modifier ou supprimer un type de gaz en moins de 5 actions</w:t>
+            </w:r>
+          </w:p>
+        </w:tc>
+      </w:tr>
+      <w:tr>
+        <w:tc>
+          <w:tcPr>
+            <w:tcW w:w="2689" w:type="dxa"/>
+          </w:tcPr>
+          <w:p>
+            <w:r>
+              <w:t xml:space="preserve">Scalabilité </w:t>
+            </w:r>
+          </w:p>
+        </w:tc>
+        <w:tc>
+          <w:tcPr>
+            <w:tcW w:w="6706" w:type="dxa"/>
+          </w:tcPr>
+          <w:p>
+            <w:r>
+              <w:t>Le système doit permettre d'ajouter de nouveaux types de gaz (nouvelles marques, nouveaux poids) sans nécessiter une mise à jour du code de l'application (configuration dynamique).</w:t>
+            </w:r>
+          </w:p>
+        </w:tc>
+      </w:tr>
+    </w:tbl>
+    <w:p/>
+    <w:p/>
     <w:p/>
     <w:p/>
     <w:p>
@@ -9529,14 +10483,358 @@
       <w:bookmarkStart w:id="75" w:name="_Toc212338049"/>
       <w:bookmarkStart w:id="76" w:name="_Toc212338106"/>
       <w:r>
+        <w:lastRenderedPageBreak/>
         <w:t>Modélisation UML</w:t>
       </w:r>
       <w:bookmarkEnd w:id="75"/>
       <w:bookmarkEnd w:id="76"/>
     </w:p>
+    <w:p>
+      <w:r>
+        <w:t>Afin de structurer et de clarifier les spécifications fonctionnelles et techniques du système de gestion de gaz, nous procédons à une modélisation UML. Cette démarche nous permettra de</w:t>
+      </w:r>
+      <w:r>
+        <w:t xml:space="preserve"> </w:t>
+      </w:r>
+      <w:r>
+        <w:t>représenter de manière structurée les différents composants, leurs interactions ainsi que le comportement global de l’application. Les diagrammes présentés ci-après offrent une vision claire et détaillée du fonctionnement du système avant son implémentation.</w:t>
+      </w:r>
+    </w:p>
     <w:p/>
+    <w:p>
+      <w:r>
+        <w:drawing>
+          <wp:inline distT="0" distB="0" distL="0" distR="0" wp14:anchorId="5D01E417" wp14:editId="725B4D0F">
+            <wp:extent cx="5972175" cy="3281045"/>
+            <wp:effectExtent l="0" t="0" r="0" b="0"/>
+            <wp:docPr id="2005037787" name="Picture 1"/>
+            <wp:cNvGraphicFramePr>
+              <a:graphicFrameLocks xmlns:a="http://schemas.openxmlformats.org/drawingml/2006/main" noChangeAspect="1"/>
+            </wp:cNvGraphicFramePr>
+            <a:graphic xmlns:a="http://schemas.openxmlformats.org/drawingml/2006/main">
+              <a:graphicData uri="http://schemas.openxmlformats.org/drawingml/2006/picture">
+                <pic:pic xmlns:pic="http://schemas.openxmlformats.org/drawingml/2006/picture">
+                  <pic:nvPicPr>
+                    <pic:cNvPr id="2005037787" name=""/>
+                    <pic:cNvPicPr/>
+                  </pic:nvPicPr>
+                  <pic:blipFill>
+                    <a:blip r:embed="rId22"/>
+                    <a:stretch>
+                      <a:fillRect/>
+                    </a:stretch>
+                  </pic:blipFill>
+                  <pic:spPr>
+                    <a:xfrm>
+                      <a:off x="0" y="0"/>
+                      <a:ext cx="5972175" cy="3281045"/>
+                    </a:xfrm>
+                    <a:prstGeom prst="rect">
+                      <a:avLst/>
+                    </a:prstGeom>
+                  </pic:spPr>
+                </pic:pic>
+              </a:graphicData>
+            </a:graphic>
+          </wp:inline>
+        </w:drawing>
+      </w:r>
+    </w:p>
     <w:p/>
+    <w:p>
+      <w:r>
+        <w:t>Basé sur le diagramme de classes UML fourni, voici une explication conceptuelle de la structure du système</w:t>
+      </w:r>
+      <w:r>
+        <w:t>.</w:t>
+      </w:r>
+    </w:p>
+    <w:p>
+      <w:pPr>
+        <w:pStyle w:val="ListParagraph"/>
+        <w:numPr>
+          <w:ilvl w:val="0"/>
+          <w:numId w:val="16"/>
+        </w:numPr>
+      </w:pPr>
+      <w:r>
+        <w:t xml:space="preserve">La classe </w:t>
+      </w:r>
+      <w:r>
+        <w:rPr>
+          <w:i/>
+          <w:iCs/>
+        </w:rPr>
+        <w:t>BouteilleDeGaz</w:t>
+      </w:r>
+      <w:r>
+        <w:t xml:space="preserve"> représente les différentes bouteilles de gaz pouvant être utilisées par les clients. Une bouteille peut être associée à plusieurs capteurs IoT, car un utilisateur peut disposer de plusieurs bouteilles ou remplacer une bouteille tout en conservant le </w:t>
+      </w:r>
+      <w:r>
+        <w:t xml:space="preserve">même </w:t>
+      </w:r>
+      <w:r>
+        <w:t>capteur.</w:t>
+      </w:r>
+    </w:p>
+    <w:p>
+      <w:pPr>
+        <w:pStyle w:val="ListParagraph"/>
+        <w:ind w:left="360"/>
+      </w:pPr>
+    </w:p>
+    <w:p>
+      <w:pPr>
+        <w:pStyle w:val="ListParagraph"/>
+        <w:numPr>
+          <w:ilvl w:val="0"/>
+          <w:numId w:val="16"/>
+        </w:numPr>
+      </w:pPr>
+      <w:r>
+        <w:t xml:space="preserve">La classe </w:t>
+      </w:r>
+      <w:r>
+        <w:rPr>
+          <w:i/>
+          <w:iCs/>
+        </w:rPr>
+        <w:t>CapteursIoT</w:t>
+      </w:r>
+      <w:r>
+        <w:t xml:space="preserve"> correspond aux dispositifs intelligents installés sur les bouteilles pour mesurer le poids du gaz restant.</w:t>
+      </w:r>
+      <w:r>
+        <w:t xml:space="preserve"> </w:t>
+      </w:r>
+      <w:r>
+        <w:t>Un capteur est associé à un utilisateur</w:t>
+      </w:r>
+      <w:r>
+        <w:t xml:space="preserve"> ou plusieurs utilisateurs</w:t>
+      </w:r>
+      <w:r>
+        <w:t xml:space="preserve">, </w:t>
+      </w:r>
+      <w:r>
+        <w:lastRenderedPageBreak/>
+        <w:t>reflétant l’installation du dispositif dans un foyer donné, mais il peut être lié à plusieurs bouteilles au cours de son utilisation (par exemple lors de remplacements).</w:t>
+      </w:r>
+    </w:p>
+    <w:p>
+      <w:pPr>
+        <w:pStyle w:val="ListParagraph"/>
+      </w:pPr>
+    </w:p>
+    <w:p>
+      <w:pPr>
+        <w:pStyle w:val="ListParagraph"/>
+        <w:numPr>
+          <w:ilvl w:val="0"/>
+          <w:numId w:val="16"/>
+        </w:numPr>
+      </w:pPr>
+      <w:r>
+        <w:t xml:space="preserve">La classe </w:t>
+      </w:r>
+      <w:r>
+        <w:rPr>
+          <w:i/>
+          <w:iCs/>
+        </w:rPr>
+        <w:t>Utilisateur</w:t>
+      </w:r>
+      <w:r>
+        <w:t xml:space="preserve"> représente les clients utilisant l’application mobile</w:t>
+      </w:r>
+      <w:r>
+        <w:t>.</w:t>
+      </w:r>
+      <w:r>
+        <w:t xml:space="preserve"> Dans notre système,</w:t>
+      </w:r>
+      <w:r>
+        <w:t xml:space="preserve"> </w:t>
+      </w:r>
+      <w:r>
+        <w:t>un</w:t>
+      </w:r>
+      <w:r>
+        <w:t xml:space="preserve"> utilisateur </w:t>
+      </w:r>
+      <w:r>
+        <w:t>ne peut être lié qu’à un seul capteur</w:t>
+      </w:r>
+      <w:r>
+        <w:t xml:space="preserve">, ce qui lui permet de suivre en temps réel l’évolution de </w:t>
+      </w:r>
+      <w:r>
+        <w:t>sa</w:t>
+      </w:r>
+      <w:r>
+        <w:t xml:space="preserve"> </w:t>
+      </w:r>
+      <w:r>
+        <w:t>bouteille</w:t>
+      </w:r>
+      <w:r>
+        <w:t xml:space="preserve">. De plus, un utilisateur peut </w:t>
+      </w:r>
+      <w:r>
+        <w:t>faire aucune ou</w:t>
+      </w:r>
+      <w:r>
+        <w:t xml:space="preserve"> plusieurs réservations de gaz auprès </w:t>
+      </w:r>
+      <w:r>
+        <w:t>d’un gérant ou plusieurs gérant</w:t>
+      </w:r>
+      <w:r>
+        <w:t>.</w:t>
+      </w:r>
+      <w:r>
+        <w:t xml:space="preserve"> </w:t>
+      </w:r>
+      <w:r>
+        <w:t xml:space="preserve">La classe </w:t>
+      </w:r>
+      <w:r>
+        <w:rPr>
+          <w:i/>
+          <w:iCs/>
+        </w:rPr>
+        <w:t>Utilisateur</w:t>
+      </w:r>
+      <w:r>
+        <w:rPr>
+          <w:i/>
+          <w:iCs/>
+        </w:rPr>
+        <w:t xml:space="preserve"> </w:t>
+      </w:r>
+      <w:r>
+        <w:t xml:space="preserve">dépend de la classe de </w:t>
+      </w:r>
+      <w:r>
+        <w:rPr>
+          <w:i/>
+          <w:iCs/>
+        </w:rPr>
+        <w:t>Géolocalisation</w:t>
+      </w:r>
+      <w:r>
+        <w:t xml:space="preserve"> pour trouver l’emplacement d’un distributeur.</w:t>
+      </w:r>
+    </w:p>
     <w:p/>
+    <w:p>
+      <w:pPr>
+        <w:pStyle w:val="ListParagraph"/>
+        <w:numPr>
+          <w:ilvl w:val="0"/>
+          <w:numId w:val="16"/>
+        </w:numPr>
+      </w:pPr>
+      <w:r>
+        <w:t xml:space="preserve">La classe </w:t>
+      </w:r>
+      <w:r>
+        <w:rPr>
+          <w:i/>
+          <w:iCs/>
+        </w:rPr>
+        <w:t>Gérant</w:t>
+      </w:r>
+      <w:r>
+        <w:t xml:space="preserve"> correspond aux responsables des points de vente de gaz. Un gérant peut recevoir plusieurs réservations de la part des clients et dispose de la capacité de gérer son stock de gaz.</w:t>
+      </w:r>
+      <w:r>
+        <w:t xml:space="preserve"> La suppression d’une instance gérant crée la suppression des données associées à elle liées à l’emplacement de ce dernier. Un gérant peut donc avoir zéro (0) ou 1 emplacement. Mais un emplacement ne peut être relié qu’à un (1) seul gérant. De plus, la classe Gérant dépend de la classe GestionDeStock pour gérer son stock.</w:t>
+      </w:r>
+    </w:p>
+    <w:p>
+      <w:pPr>
+        <w:pStyle w:val="ListParagraph"/>
+      </w:pPr>
+    </w:p>
+    <w:p>
+      <w:pPr>
+        <w:pStyle w:val="ListParagraph"/>
+        <w:numPr>
+          <w:ilvl w:val="0"/>
+          <w:numId w:val="16"/>
+        </w:numPr>
+      </w:pPr>
+      <w:r>
+        <w:t>L</w:t>
+      </w:r>
+      <w:r>
+        <w:t xml:space="preserve">’association </w:t>
+      </w:r>
+      <w:r>
+        <w:rPr>
+          <w:i/>
+          <w:iCs/>
+        </w:rPr>
+        <w:t>Réservation</w:t>
+      </w:r>
+      <w:r>
+        <w:t xml:space="preserve"> modélise les demandes de réservation effectuées par les utilisateurs pour obtenir une bouteille de gaz. Cette classe intervient à la fois du côté utilisateur et du côté gérant, traduisant l’interaction entre les deux acteurs.</w:t>
+      </w:r>
+      <w:r>
+        <w:t xml:space="preserve"> </w:t>
+      </w:r>
+      <w:r>
+        <w:t xml:space="preserve">Ainsi donc pour </w:t>
+      </w:r>
+      <w:r>
+        <w:t xml:space="preserve"> qu’il y ai une réservation</w:t>
+      </w:r>
+      <w:r>
+        <w:t xml:space="preserve">, </w:t>
+      </w:r>
+      <w:r>
+        <w:t xml:space="preserve">il faudra forcément </w:t>
+      </w:r>
+      <w:r>
+        <w:t>un</w:t>
+      </w:r>
+      <w:r>
+        <w:t xml:space="preserve"> lien entre </w:t>
+      </w:r>
+      <w:r>
+        <w:t>l’utilisateur et le gérant</w:t>
+      </w:r>
+    </w:p>
+    <w:p/>
+    <w:p>
+      <w:pPr>
+        <w:pStyle w:val="ListParagraph"/>
+        <w:numPr>
+          <w:ilvl w:val="0"/>
+          <w:numId w:val="16"/>
+        </w:numPr>
+      </w:pPr>
+      <w:r>
+        <w:t xml:space="preserve">La classe </w:t>
+      </w:r>
+      <w:r>
+        <w:rPr>
+          <w:i/>
+          <w:iCs/>
+        </w:rPr>
+        <w:t>GestionDeStock</w:t>
+      </w:r>
+      <w:r>
+        <w:t xml:space="preserve"> regroupe les opérations de mise à jour du stock du gérant. Cette classe traduit les opérations internes du gérant pour maintenir l’état du stock à jour afin d’assurer une meilleure disponibilité pour les utilisateurs.</w:t>
+      </w:r>
+    </w:p>
+    <w:p/>
+    <w:p>
+      <w:r>
+        <w:t>L’ensemble de ces classes et relations permet de représenter de manière structurée les fonctionnalités principales du système : suivi de la consommation via capteurs IoT, gestion des bouteilles, réservation de gaz, géolocalisation des distributeurs et mise à jour des stocks. Ce modèle UML constitue ainsi une base cohérente pour la conception et le développement du système.</w:t>
+      </w:r>
+    </w:p>
     <w:p>
       <w:pPr>
         <w:pStyle w:val="Heading2"/>
@@ -9548,10 +10846,103 @@
       <w:bookmarkStart w:id="77" w:name="_Toc212338050"/>
       <w:bookmarkStart w:id="78" w:name="_Toc212338107"/>
       <w:r>
+        <w:lastRenderedPageBreak/>
         <w:t>Proposition d’une solution de déploiement</w:t>
       </w:r>
       <w:bookmarkEnd w:id="77"/>
       <w:bookmarkEnd w:id="78"/>
+    </w:p>
+    <w:p/>
+    <w:p>
+      <w:r>
+        <w:t xml:space="preserve">Afin d’assurer une compréhension globale de l’architecture du système de prédiction et de gestion du gaz, le schéma ci-dessous présente l’ensemble des composants techniques répartis </w:t>
+      </w:r>
+      <w:r>
+        <w:t xml:space="preserve">différentes couches du modèle OSI. </w:t>
+      </w:r>
+      <w:r>
+        <w:t xml:space="preserve">Cette représentation met en évidence les flux d’informations entre le capteur de poids installé chez l’utilisateur, l’infrastructure cloud assurant le traitement des données et les services essentiels, puis les applications mobiles dédiées aux clients et aux gérants. Elle illustre de manière intégrée le fonctionnement complet du système, depuis la collecte du niveau de gaz jusqu’à la mise à jour du stock et la gestion des réservations. Ce schéma de déploiement constitue ainsi la base de l’architecture technique proposée pour garantir un service fiable, évolutif et </w:t>
+      </w:r>
+      <w:r>
+        <w:t xml:space="preserve">facilement </w:t>
+      </w:r>
+      <w:r>
+        <w:t>accessible.</w:t>
+      </w:r>
+    </w:p>
+    <w:p>
+      <w:r>
+        <w:rPr>
+          <w:noProof/>
+          <w14:ligatures w14:val="standardContextual"/>
+        </w:rPr>
+        <w:drawing>
+          <wp:inline distT="0" distB="0" distL="0" distR="0" wp14:anchorId="5E83BE9B" wp14:editId="48F53403">
+            <wp:extent cx="5972175" cy="3257550"/>
+            <wp:effectExtent l="0" t="0" r="0" b="6350"/>
+            <wp:docPr id="1784308163" name="Picture 20"/>
+            <wp:cNvGraphicFramePr>
+              <a:graphicFrameLocks xmlns:a="http://schemas.openxmlformats.org/drawingml/2006/main" noChangeAspect="1"/>
+            </wp:cNvGraphicFramePr>
+            <a:graphic xmlns:a="http://schemas.openxmlformats.org/drawingml/2006/main">
+              <a:graphicData uri="http://schemas.openxmlformats.org/drawingml/2006/picture">
+                <pic:pic xmlns:pic="http://schemas.openxmlformats.org/drawingml/2006/picture">
+                  <pic:nvPicPr>
+                    <pic:cNvPr id="1784308163" name="Picture 1784308163"/>
+                    <pic:cNvPicPr/>
+                  </pic:nvPicPr>
+                  <pic:blipFill>
+                    <a:blip r:embed="rId23" cstate="print">
+                      <a:extLst>
+                        <a:ext uri="{28A0092B-C50C-407E-A947-70E740481C1C}">
+                          <a14:useLocalDpi xmlns:a14="http://schemas.microsoft.com/office/drawing/2010/main" val="0"/>
+                        </a:ext>
+                      </a:extLst>
+                    </a:blip>
+                    <a:stretch>
+                      <a:fillRect/>
+                    </a:stretch>
+                  </pic:blipFill>
+                  <pic:spPr>
+                    <a:xfrm>
+                      <a:off x="0" y="0"/>
+                      <a:ext cx="5972175" cy="3257550"/>
+                    </a:xfrm>
+                    <a:prstGeom prst="rect">
+                      <a:avLst/>
+                    </a:prstGeom>
+                  </pic:spPr>
+                </pic:pic>
+              </a:graphicData>
+            </a:graphic>
+          </wp:inline>
+        </w:drawing>
+      </w:r>
+    </w:p>
+    <w:p/>
+    <w:p>
+      <w:pPr>
+        <w:pStyle w:val="Figure"/>
+        <w:jc w:val="center"/>
+      </w:pPr>
+      <w:r>
+        <w:t xml:space="preserve">Figure </w:t>
+      </w:r>
+      <w:r>
+        <w:t>3.5</w:t>
+      </w:r>
+      <w:r>
+        <w:t xml:space="preserve"> : </w:t>
+      </w:r>
+      <w:r>
+        <w:t xml:space="preserve">Architecture globale </w:t>
+      </w:r>
+      <w:r>
+        <w:t>du système de gestion de la consommation du gaz</w:t>
+      </w:r>
+      <w:r>
+        <w:t>.</w:t>
+      </w:r>
     </w:p>
     <w:p/>
     <w:p/>
@@ -9566,80 +10957,273 @@
       <w:bookmarkStart w:id="79" w:name="_Toc212338051"/>
       <w:bookmarkStart w:id="80" w:name="_Toc212338108"/>
       <w:r>
+        <w:lastRenderedPageBreak/>
         <w:t>Degré de faisabilité</w:t>
       </w:r>
       <w:bookmarkEnd w:id="79"/>
       <w:bookmarkEnd w:id="80"/>
+    </w:p>
+    <w:p>
+      <w:pPr>
+        <w:pStyle w:val="ListParagraph"/>
+        <w:numPr>
+          <w:ilvl w:val="2"/>
+          <w:numId w:val="24"/>
+        </w:numPr>
+        <w:rPr>
+          <w:b/>
+          <w:bCs/>
+        </w:rPr>
+      </w:pPr>
+      <w:r>
+        <w:rPr>
+          <w:b/>
+          <w:bCs/>
+        </w:rPr>
+        <w:t>Faisabilité Technique</w:t>
+      </w:r>
+    </w:p>
+    <w:p>
+      <w:pPr>
+        <w:ind w:left="720"/>
+      </w:pPr>
+      <w:r>
+        <w:t>La solution repose sur des technologies éprouvées et accessibles, notamment l'intégration d</w:t>
+      </w:r>
+      <w:r>
+        <w:t>e</w:t>
+      </w:r>
+      <w:r>
+        <w:t xml:space="preserve"> capteur</w:t>
+      </w:r>
+      <w:r>
+        <w:t>s</w:t>
+      </w:r>
+      <w:r>
+        <w:t xml:space="preserve"> de poids </w:t>
+      </w:r>
+      <w:r>
+        <w:t xml:space="preserve">demi-ponts, </w:t>
+      </w:r>
+      <w:r>
+        <w:t>des communications réseau via Wi-Fi ou GSM, ainsi qu'une application mobile connectée à un serveur cloud. Les capteurs de poids offrent une précision suffisante pour le suivi du niveau de gaz et sont facilement intégrables, tandis que les microcontrôleurs Wi-Fi/GSM permettent l'envoi de données en temps réel</w:t>
+      </w:r>
+      <w:r>
+        <w:t xml:space="preserve">. </w:t>
+      </w:r>
+      <w:r>
+        <w:t xml:space="preserve">Le développement mobile </w:t>
+      </w:r>
+      <w:r>
+        <w:t>sera</w:t>
+      </w:r>
+      <w:r>
+        <w:t xml:space="preserve"> réalisé efficacement avec des frameworks modernes tels que React Native, compatibles Android et iOS. L'ensemble de ces composants standards, peu coûteux et</w:t>
+      </w:r>
+      <w:r>
+        <w:t xml:space="preserve"> avec une documentation bien fournie</w:t>
+      </w:r>
+      <w:r>
+        <w:t>, confirme que la faisabilité technique du projet est élevée.</w:t>
+      </w:r>
+    </w:p>
+    <w:p>
+      <w:pPr>
+        <w:ind w:left="720"/>
+      </w:pPr>
+    </w:p>
+    <w:p>
+      <w:pPr>
+        <w:pStyle w:val="ListParagraph"/>
+        <w:numPr>
+          <w:ilvl w:val="2"/>
+          <w:numId w:val="24"/>
+        </w:numPr>
+        <w:rPr>
+          <w:b/>
+          <w:bCs/>
+        </w:rPr>
+      </w:pPr>
+      <w:r>
+        <w:rPr>
+          <w:b/>
+          <w:bCs/>
+        </w:rPr>
+        <w:t xml:space="preserve">Faisabilité </w:t>
+      </w:r>
+      <w:r>
+        <w:rPr>
+          <w:b/>
+          <w:bCs/>
+        </w:rPr>
+        <w:t>opérationnelle</w:t>
+      </w:r>
+    </w:p>
+    <w:p>
+      <w:pPr>
+        <w:ind w:left="720"/>
+      </w:pPr>
+      <w:r>
+        <w:t>Le système répond à des besoins concrets et tangibles du marché : le suivi en temps réel du niveau de gaz pour les clients, la gestion efficace du stock</w:t>
+      </w:r>
+      <w:r>
+        <w:t>,</w:t>
+      </w:r>
+      <w:r>
+        <w:t xml:space="preserve"> </w:t>
+      </w:r>
+      <w:r>
+        <w:t>l</w:t>
+      </w:r>
+      <w:r>
+        <w:t>es réservations, la réduction des déplacements inutiles</w:t>
+      </w:r>
+      <w:r>
+        <w:t xml:space="preserve"> </w:t>
+      </w:r>
+      <w:r>
+        <w:t>amélior</w:t>
+      </w:r>
+      <w:r>
+        <w:t>e de façon</w:t>
+      </w:r>
+      <w:r>
+        <w:t xml:space="preserve"> globale </w:t>
+      </w:r>
+      <w:r>
+        <w:t>le</w:t>
+      </w:r>
+      <w:r>
+        <w:t xml:space="preserve"> service client. La solution s'intègre naturellement dans les habitudes quotidiennes des utilisateurs grâce à l'utilisation du smartphone et des notifications push, et ne requiert aucune compétence technique avancée pour son utilisation. L'interface intuitive et la simplicité d'adoption garantissent une appropriation rapide par les utilisateurs finaux comme par les gérants. La faisabilité opérationnelle est donc très bonne, le système apportant une valeur ajoutée directe et mesurable aux différents acteurs.</w:t>
+      </w:r>
+    </w:p>
+    <w:p>
+      <w:pPr>
+        <w:ind w:left="720"/>
+      </w:pPr>
+    </w:p>
+    <w:p>
+      <w:pPr>
+        <w:pStyle w:val="ListParagraph"/>
+        <w:numPr>
+          <w:ilvl w:val="2"/>
+          <w:numId w:val="24"/>
+        </w:numPr>
+        <w:rPr>
+          <w:b/>
+          <w:bCs/>
+        </w:rPr>
+      </w:pPr>
+      <w:r>
+        <w:rPr>
+          <w:b/>
+          <w:bCs/>
+        </w:rPr>
+        <w:t xml:space="preserve">Faisabilité </w:t>
+      </w:r>
+      <w:r>
+        <w:rPr>
+          <w:b/>
+          <w:bCs/>
+        </w:rPr>
+        <w:t>économique</w:t>
+      </w:r>
+    </w:p>
+    <w:p>
+      <w:pPr>
+        <w:ind w:left="720"/>
+      </w:pPr>
+      <w:r>
+        <w:t xml:space="preserve">Le coût global du projet englobe l'acquisition des capteurs de poids, du microcontrôleur IoT, le développement de l'application mobile, l'hébergement cloud ainsi que la maintenance et la supervision technique. Ces coûts restent raisonnables grâce à l'utilisation de solutions open-source et de serveurs mutualisés. Le modèle économique peut être </w:t>
+      </w:r>
+      <w:r>
+        <w:lastRenderedPageBreak/>
+        <w:t>soutenu par plusieurs sources de revenus : la vente de kits IoT (capteur + carte électronique</w:t>
+      </w:r>
+      <w:r>
+        <w:t>)</w:t>
+      </w:r>
+      <w:r>
+        <w:t>. L'investissement initial étant modéré et le système présentant un potentiel de rentabilisation à moyen terme, la faisabilité économique du projet est jugée satisfaisante et viable.</w:t>
+      </w:r>
+    </w:p>
+    <w:p>
+      <w:pPr>
+        <w:ind w:left="720"/>
+      </w:pPr>
+    </w:p>
+    <w:p>
+      <w:pPr>
+        <w:pStyle w:val="ListParagraph"/>
+        <w:numPr>
+          <w:ilvl w:val="2"/>
+          <w:numId w:val="24"/>
+        </w:numPr>
+        <w:rPr>
+          <w:b/>
+          <w:bCs/>
+        </w:rPr>
+      </w:pPr>
+      <w:r>
+        <w:rPr>
+          <w:b/>
+          <w:bCs/>
+        </w:rPr>
+        <w:t xml:space="preserve">Faisabilité </w:t>
+      </w:r>
+      <w:r>
+        <w:rPr>
+          <w:b/>
+          <w:bCs/>
+        </w:rPr>
+        <w:t>temporelle</w:t>
+      </w:r>
+    </w:p>
+    <w:p>
+      <w:pPr>
+        <w:ind w:left="720"/>
+      </w:pPr>
+      <w:r>
+        <w:t>Le développement du projet peut être structuré en phases successives et cohérentes : la conception du prototype IoT nécessite 2 à 4 semaines, le développement de l'API et de la base de données environ 2 semaines, l'application mobile entre 4 et 6 semaines, tandis que les tests terrain et les ajustements requièrent 2 à 3 semaines supplémentaires. La durée totale estimée se situe entre 10 et 14 semaines, ce qui représente un calendrier réaliste et réalisable pour une équipe de petite à moyenne taille. Cette planification progressive permet également d'intégrer des phases de validation et d'itération pour garantir la qualité du produit final. La faisabilité temporelle est donc positive, le calendrier de réalisation étant cohérent avec les ressources disponibles et les objectifs du projet.</w:t>
+      </w:r>
     </w:p>
     <w:p/>
     <w:p/>
     <w:p/>
+    <w:p>
+      <w:r>
+        <w:t>Ce chapitre a permis d'établir les fondations techniques et conceptuelles du système de prédiction et de gestion de gaz. À travers l'expression détaillée du cahier des charges, nous avons formalisé les besoins fonctionnels et non fonctionnels qui guideront l'ensemble du développement. Les exigences identifiées couvrent tant les attentes des utilisateurs finaux (consultation temps réel, alertes, géolocalisation) que celles des gérants (gestion de stock, réservations, catalogue). La modélisation UML nous a permis de visualiser l'architecture du système et les interactions entre ses différents composants. Cette représentation structurée facilite la compréhension globale de la solution et constitue un référentiel commun pour toutes les parties prenantes du projet. La proposition de déploiement illustre concrètement l'implémentation technique envisagée, depuis le dispositif IoT (capteur de poids et microcontrôleur) jusqu'aux applications mobiles, en passant par le backend cloud et les services tiers. Cette architecture garantit la scalabilité</w:t>
+      </w:r>
+      <w:r>
+        <w:t xml:space="preserve"> </w:t>
+      </w:r>
+      <w:r>
+        <w:t>et la</w:t>
+      </w:r>
+      <w:r>
+        <w:t xml:space="preserve"> performance </w:t>
+      </w:r>
+      <w:r>
+        <w:t>du système. Les risques identifiés sont gérables à travers des mesures d'atténuation appropriées.</w:t>
+      </w:r>
+    </w:p>
     <w:p/>
-    <w:p/>
-    <w:p>
-      <w:r>
-        <w:rPr>
-          <w:highlight w:val="yellow"/>
-        </w:rPr>
-        <w:t>Petite conclusion</w:t>
-      </w:r>
-    </w:p>
-    <w:p/>
-    <w:p/>
-    <w:p>
-      <w:pPr>
-        <w:keepNext/>
-      </w:pPr>
-      <w:r>
-        <w:rPr>
-          <w:highlight w:val="yellow"/>
-        </w:rPr>
-        <w:lastRenderedPageBreak/>
-        <w:br w:type="page"/>
-      </w:r>
-    </w:p>
-    <w:p>
-      <w:pPr>
-        <w:pStyle w:val="Caption"/>
-        <w:keepNext/>
-      </w:pPr>
-      <w:r>
-        <w:lastRenderedPageBreak/>
-        <w:t xml:space="preserve">Tableau </w:t>
-      </w:r>
-      <w:r>
-        <w:fldChar w:fldCharType="begin"/>
-      </w:r>
-      <w:r>
-        <w:instrText xml:space="preserve"> SEQ Tableau \* ARABIC </w:instrText>
-      </w:r>
-      <w:r>
-        <w:fldChar w:fldCharType="separate"/>
-      </w:r>
-      <w:r>
-        <w:rPr>
-          <w:noProof/>
-        </w:rPr>
-        <w:t>1</w:t>
-      </w:r>
-      <w:r>
-        <w:fldChar w:fldCharType="end"/>
-      </w:r>
-      <w:r>
-        <w:t>: table image</w:t>
-      </w:r>
-    </w:p>
-    <w:p>
-      <w:pPr>
-        <w:keepNext/>
-      </w:pPr>
-    </w:p>
     <w:p>
       <w:pPr>
         <w:pStyle w:val="Heading1"/>
       </w:pPr>
       <w:bookmarkStart w:id="81" w:name="_Toc212338052"/>
       <w:bookmarkStart w:id="82" w:name="_Toc212338109"/>
+    </w:p>
+    <w:p>
+      <w:pPr>
+        <w:pStyle w:val="Heading1"/>
+      </w:pPr>
+    </w:p>
+    <w:p>
+      <w:pPr>
+        <w:pStyle w:val="Heading1"/>
+      </w:pPr>
       <w:r>
         <w:t>Chapitre 4 : Mise en œuvre</w:t>
       </w:r>
@@ -9730,8 +11314,16 @@
       <w:bookmarkStart w:id="89" w:name="_Toc212338056"/>
       <w:bookmarkStart w:id="90" w:name="_Toc212338113"/>
       <w:r>
-        <w:lastRenderedPageBreak/>
-        <w:t>Etude de cout</w:t>
+        <w:t>Ét</w:t>
+      </w:r>
+      <w:r>
+        <w:t>ude de co</w:t>
+      </w:r>
+      <w:r>
+        <w:t>û</w:t>
+      </w:r>
+      <w:r>
+        <w:t>t</w:t>
       </w:r>
       <w:bookmarkEnd w:id="89"/>
       <w:bookmarkEnd w:id="90"/>
@@ -9886,9 +11478,9 @@
     <w:p>
       <w:pPr>
         <w:sectPr>
-          <w:footerReference w:type="default" r:id="rId22"/>
+          <w:footerReference w:type="default" r:id="rId24"/>
           <w:pgSz w:w="12240" w:h="15840"/>
-          <w:pgMar w:top="1134" w:right="1134" w:bottom="1134" w:left="1701" w:header="709" w:footer="709" w:gutter="0"/>
+          <w:pgMar w:top="1134" w:right="1134" w:bottom="1134" w:left="1701" w:header="709" w:footer="737" w:gutter="0"/>
           <w:pgNumType w:start="1"/>
           <w:cols w:space="708"/>
           <w:docGrid w:linePitch="360"/>
@@ -9897,21 +11489,19 @@
     </w:p>
     <w:sdt>
       <w:sdtPr>
+        <w:rPr>
+          <w:rFonts w:eastAsiaTheme="minorHAnsi" w:cstheme="minorBidi"/>
+          <w:b w:val="0"/>
+          <w:color w:val="auto"/>
+          <w:sz w:val="24"/>
+          <w:szCs w:val="22"/>
+        </w:rPr>
         <w:id w:val="924391624"/>
         <w:docPartObj>
           <w:docPartGallery w:val="Bibliographies"/>
           <w:docPartUnique/>
         </w:docPartObj>
       </w:sdtPr>
-      <w:sdtEndPr>
-        <w:rPr>
-          <w:rFonts w:eastAsiaTheme="minorHAnsi" w:cstheme="minorBidi"/>
-          <w:b w:val="0"/>
-          <w:color w:val="auto"/>
-          <w:sz w:val="24"/>
-          <w:szCs w:val="22"/>
-        </w:rPr>
-      </w:sdtEndPr>
       <w:sdtContent>
         <w:p>
           <w:pPr>
@@ -10162,49 +11752,15 @@
           <w:numId w:val="16"/>
         </w:numPr>
       </w:pPr>
-      <w:r>
-        <w:rPr>
-          <w:rFonts w:eastAsiaTheme="majorEastAsia"/>
-        </w:rPr>
-        <w:fldChar w:fldCharType="begin"/>
-      </w:r>
-      <w:r>
-        <w:rPr>
-          <w:rFonts w:eastAsiaTheme="majorEastAsia"/>
-        </w:rPr>
-        <w:instrText>HYPERLINK "</w:instrText>
-      </w:r>
-      <w:r>
-        <w:rPr>
-          <w:rFonts w:eastAsiaTheme="majorEastAsia"/>
-        </w:rPr>
-        <w:instrText>https://t20ind.org/research/promoting-the-use-of-lpg-for-household-cooking-in-developing-countries/#:~:text=In</w:instrText>
-      </w:r>
-      <w:r>
-        <w:rPr>
-          <w:rFonts w:eastAsiaTheme="majorEastAsia"/>
-        </w:rPr>
-        <w:instrText>"</w:instrText>
-      </w:r>
-      <w:r>
-        <w:rPr>
-          <w:rFonts w:eastAsiaTheme="majorEastAsia"/>
-        </w:rPr>
-        <w:fldChar w:fldCharType="separate"/>
-      </w:r>
-      <w:r>
-        <w:rPr>
-          <w:rStyle w:val="Hyperlink"/>
-          <w:rFonts w:eastAsiaTheme="majorEastAsia"/>
-        </w:rPr>
-        <w:t>https://t20ind.org/research/promoting-the-use-of-lpg-for-household-cooking-in-developing-countries/#:~:text=In</w:t>
-      </w:r>
-      <w:r>
-        <w:rPr>
-          <w:rFonts w:eastAsiaTheme="majorEastAsia"/>
-        </w:rPr>
-        <w:fldChar w:fldCharType="end"/>
-      </w:r>
+      <w:hyperlink r:id="rId25" w:history="1">
+        <w:r>
+          <w:rPr>
+            <w:rStyle w:val="Hyperlink"/>
+            <w:rFonts w:eastAsiaTheme="majorEastAsia"/>
+          </w:rPr>
+          <w:t>https://t20ind.org/research/promoting-the-use-of-lpg-for-household-cooking-in-developing-countries/#:~:text=In</w:t>
+        </w:r>
+      </w:hyperlink>
       <w:r>
         <w:t xml:space="preserve"> </w:t>
       </w:r>
@@ -10220,49 +11776,15 @@
           <w:numId w:val="16"/>
         </w:numPr>
       </w:pPr>
-      <w:r>
-        <w:rPr>
-          <w:rFonts w:eastAsiaTheme="majorEastAsia"/>
-        </w:rPr>
-        <w:fldChar w:fldCharType="begin"/>
-      </w:r>
-      <w:r>
-        <w:rPr>
-          <w:rFonts w:eastAsiaTheme="majorEastAsia"/>
-        </w:rPr>
-        <w:instrText>HYPERLINK "</w:instrText>
-      </w:r>
-      <w:r>
-        <w:rPr>
-          <w:rFonts w:eastAsiaTheme="majorEastAsia"/>
-        </w:rPr>
-        <w:instrText>https://lequotidien.sn/acces-aux-combustibles-modernes-de-cuisson-au-senegal-43-des-menages-exclus-2/</w:instrText>
-      </w:r>
-      <w:r>
-        <w:rPr>
-          <w:rFonts w:eastAsiaTheme="majorEastAsia"/>
-        </w:rPr>
-        <w:instrText>"</w:instrText>
-      </w:r>
-      <w:r>
-        <w:rPr>
-          <w:rFonts w:eastAsiaTheme="majorEastAsia"/>
-        </w:rPr>
-        <w:fldChar w:fldCharType="separate"/>
-      </w:r>
-      <w:r>
-        <w:rPr>
-          <w:rStyle w:val="Hyperlink"/>
-          <w:rFonts w:eastAsiaTheme="majorEastAsia"/>
-        </w:rPr>
-        <w:t>https://lequotidien.sn/acces-aux-combustibles-modernes-de-cuisson-au-senegal-43-des-menages-exclus-2/</w:t>
-      </w:r>
-      <w:r>
-        <w:rPr>
-          <w:rFonts w:eastAsiaTheme="majorEastAsia"/>
-        </w:rPr>
-        <w:fldChar w:fldCharType="end"/>
-      </w:r>
+      <w:hyperlink r:id="rId26" w:history="1">
+        <w:r>
+          <w:rPr>
+            <w:rStyle w:val="Hyperlink"/>
+            <w:rFonts w:eastAsiaTheme="majorEastAsia"/>
+          </w:rPr>
+          <w:t>https://lequotidien.sn/acces-aux-combustibles-modernes-de-cuisson-au-senegal-43-des-menages-exclus-2/</w:t>
+        </w:r>
+      </w:hyperlink>
       <w:r>
         <w:rPr>
           <w:rFonts w:eastAsiaTheme="majorEastAsia"/>
@@ -10278,7 +11800,7 @@
           <w:numId w:val="16"/>
         </w:numPr>
       </w:pPr>
-      <w:hyperlink r:id="rId23" w:history="1">
+      <w:hyperlink r:id="rId27" w:anchor=":~:text=Le" w:history="1">
         <w:r>
           <w:rPr>
             <w:rStyle w:val="Hyperlink"/>
@@ -10302,7 +11824,7 @@
           <w:numId w:val="16"/>
         </w:numPr>
       </w:pPr>
-      <w:hyperlink r:id="rId24" w:history="1">
+      <w:hyperlink r:id="rId28" w:history="1">
         <w:r>
           <w:rPr>
             <w:rStyle w:val="Hyperlink"/>
@@ -10326,7 +11848,7 @@
           <w:numId w:val="16"/>
         </w:numPr>
       </w:pPr>
-      <w:hyperlink r:id="rId25" w:history="1">
+      <w:hyperlink r:id="rId29" w:history="1">
         <w:r>
           <w:rPr>
             <w:rStyle w:val="Hyperlink"/>
@@ -10350,7 +11872,7 @@
           <w:numId w:val="16"/>
         </w:numPr>
       </w:pPr>
-      <w:hyperlink r:id="rId26" w:history="1">
+      <w:hyperlink r:id="rId30" w:history="1">
         <w:r>
           <w:rPr>
             <w:rStyle w:val="Hyperlink"/>
@@ -10374,7 +11896,7 @@
           <w:numId w:val="16"/>
         </w:numPr>
       </w:pPr>
-      <w:hyperlink r:id="rId27" w:history="1">
+      <w:hyperlink r:id="rId31" w:history="1">
         <w:r>
           <w:rPr>
             <w:rStyle w:val="Hyperlink"/>
@@ -10398,7 +11920,7 @@
           <w:numId w:val="16"/>
         </w:numPr>
       </w:pPr>
-      <w:hyperlink r:id="rId28" w:history="1">
+      <w:hyperlink r:id="rId32" w:history="1">
         <w:r>
           <w:rPr>
             <w:rStyle w:val="Hyperlink"/>
@@ -10422,7 +11944,7 @@
           <w:numId w:val="16"/>
         </w:numPr>
       </w:pPr>
-      <w:hyperlink r:id="rId29" w:history="1">
+      <w:hyperlink r:id="rId33" w:history="1">
         <w:r>
           <w:rPr>
             <w:rStyle w:val="Hyperlink"/>
@@ -15742,7 +17264,7 @@
     <w:p>
       <w:pPr>
         <w:sectPr>
-          <w:footerReference w:type="default" r:id="rId30"/>
+          <w:footerReference w:type="default" r:id="rId34"/>
           <w:pgSz w:w="12240" w:h="15840"/>
           <w:pgMar w:top="1134" w:right="1134" w:bottom="1134" w:left="1701" w:header="709" w:footer="709" w:gutter="0"/>
           <w:pgNumType w:fmt="upperRoman" w:start="1"/>
@@ -15785,8 +17307,8 @@
     <w:p/>
     <w:p/>
     <w:sectPr>
-      <w:headerReference w:type="default" r:id="rId31"/>
-      <w:footerReference w:type="default" r:id="rId32"/>
+      <w:headerReference w:type="default" r:id="rId35"/>
+      <w:footerReference w:type="default" r:id="rId36"/>
       <w:pgSz w:w="12240" w:h="15840"/>
       <w:pgMar w:top="1134" w:right="1134" w:bottom="1134" w:left="1701" w:header="709" w:footer="709" w:gutter="0"/>
       <w:pgNumType w:fmt="upperRoman" w:start="1"/>
@@ -16720,7 +18242,7 @@
         <w:rFonts w:ascii="Franklin Gothic Book" w:hAnsi="Franklin Gothic Book"/>
         <w:b/>
       </w:rPr>
-      <w:pict w14:anchorId="36587743">
+      <w:pict w14:anchorId="30C4C4EF">
         <v:shapetype id="_x0000_t75" coordsize="21600,21600" o:spt="75" o:preferrelative="t" path="m@4@5l@4@11@9@11@9@5xe" filled="f" stroked="f">
           <v:stroke joinstyle="miter"/>
           <v:formulas>
@@ -16863,7 +18385,7 @@
         <w:lang w:eastAsia="fr-FR"/>
         <w14:ligatures w14:val="standardContextual"/>
       </w:rPr>
-      <w:pict w14:anchorId="5462E0D7">
+      <w:pict w14:anchorId="5F8FE76C">
         <v:shapetype id="_x0000_t75" coordsize="21600,21600" o:spt="75" o:preferrelative="t" path="m@4@5l@4@11@9@11@9@5xe" filled="f" stroked="f">
           <v:stroke joinstyle="miter"/>
           <v:formulas>
@@ -21794,6 +23316,49 @@
       <w:lang w:val="en-SN" w:eastAsia="zh-CN"/>
     </w:rPr>
   </w:style>
+  <w:style w:type="paragraph" w:styleId="FootnoteText">
+    <w:name w:val="footnote text"/>
+    <w:basedOn w:val="Normal"/>
+    <w:link w:val="FootnoteTextChar"/>
+    <w:uiPriority w:val="99"/>
+    <w:semiHidden/>
+    <w:unhideWhenUsed/>
+    <w:rsid w:val="002823CF"/>
+    <w:pPr>
+      <w:spacing w:after="0" w:line="240" w:lineRule="auto"/>
+    </w:pPr>
+    <w:rPr>
+      <w:sz w:val="20"/>
+      <w:szCs w:val="20"/>
+    </w:rPr>
+  </w:style>
+  <w:style w:type="character" w:customStyle="1" w:styleId="FootnoteTextChar">
+    <w:name w:val="Footnote Text Char"/>
+    <w:basedOn w:val="DefaultParagraphFont"/>
+    <w:link w:val="FootnoteText"/>
+    <w:uiPriority w:val="99"/>
+    <w:semiHidden/>
+    <w:rsid w:val="002823CF"/>
+    <w:rPr>
+      <w:rFonts w:ascii="Times New Roman" w:hAnsi="Times New Roman"/>
+      <w:kern w:val="0"/>
+      <w:sz w:val="20"/>
+      <w:szCs w:val="20"/>
+      <w:lang w:val="fr-FR"/>
+      <w14:ligatures w14:val="none"/>
+    </w:rPr>
+  </w:style>
+  <w:style w:type="character" w:styleId="FootnoteReference">
+    <w:name w:val="footnote reference"/>
+    <w:basedOn w:val="DefaultParagraphFont"/>
+    <w:uiPriority w:val="99"/>
+    <w:semiHidden/>
+    <w:unhideWhenUsed/>
+    <w:rsid w:val="002823CF"/>
+    <w:rPr>
+      <w:vertAlign w:val="superscript"/>
+    </w:rPr>
+  </w:style>
 </w:styles>
 </file>
 

</xml_diff>

<commit_message>
all chapters before mise en oeuvre really done
</commit_message>
<xml_diff>
--- a/Marie-Ange AIKPE Master's thesis.docx
+++ b/Marie-Ange AIKPE Master's thesis.docx
@@ -11232,13 +11232,12 @@
     </w:p>
     <w:p>
       <w:r>
-        <w:rPr>
-          <w:highlight w:val="yellow"/>
-        </w:rPr>
-        <w:t>Petite introduction</w:t>
-      </w:r>
-    </w:p>
-    <w:p/>
+        <w:t>Ce chapitre présente le processus pratique de réalisation du système de gestion de gaz. Après la phase de conception théorique et de modélisation, il s’agit ici de décrire les moyens matériels et logiciels mobilisés, ainsi que les différentes étapes qui ont permis de développer et d’intégrer la solution. Cette mise en œuvre permet de transformer les besoins fonctionnels identifiés en un prototype opérationnel</w:t>
+      </w:r>
+      <w:r>
+        <w:t>.</w:t>
+      </w:r>
+    </w:p>
     <w:p>
       <w:pPr>
         <w:pStyle w:val="Heading2"/>
@@ -11255,47 +11254,1530 @@
       <w:bookmarkEnd w:id="83"/>
       <w:bookmarkEnd w:id="84"/>
     </w:p>
+    <w:p>
+      <w:pPr>
+        <w:pStyle w:val="ListParagraph"/>
+        <w:numPr>
+          <w:ilvl w:val="2"/>
+          <w:numId w:val="27"/>
+        </w:numPr>
+      </w:pPr>
+      <w:r>
+        <w:t>Le Kit Arduino UNO</w:t>
+      </w:r>
+    </w:p>
+    <w:p>
+      <w:pPr>
+        <w:ind w:left="720"/>
+      </w:pPr>
+      <w:r>
+        <w:t>L'architecture centrale du prototype s'articule autour de la carte Arduino Uno, qui agit ici comme l'unité de traitement principale. Son rôle est de récupérer les signaux analogiques liés à la masse de la bouteille de gaz, de les convertir en données numériques exploitables, et d'en assurer la transmission.</w:t>
+      </w:r>
+    </w:p>
+    <w:p/>
+    <w:p>
+      <w:r>
+        <w:rPr>
+          <w:noProof/>
+          <w14:ligatures w14:val="standardContextual"/>
+        </w:rPr>
+        <w:drawing>
+          <wp:inline distT="0" distB="0" distL="0" distR="0" wp14:anchorId="69AC3F3E" wp14:editId="20456A81">
+            <wp:extent cx="5972175" cy="2687320"/>
+            <wp:effectExtent l="0" t="0" r="0" b="5080"/>
+            <wp:docPr id="845652133" name="Picture 28"/>
+            <wp:cNvGraphicFramePr>
+              <a:graphicFrameLocks xmlns:a="http://schemas.openxmlformats.org/drawingml/2006/main" noChangeAspect="1"/>
+            </wp:cNvGraphicFramePr>
+            <a:graphic xmlns:a="http://schemas.openxmlformats.org/drawingml/2006/main">
+              <a:graphicData uri="http://schemas.openxmlformats.org/drawingml/2006/picture">
+                <pic:pic xmlns:pic="http://schemas.openxmlformats.org/drawingml/2006/picture">
+                  <pic:nvPicPr>
+                    <pic:cNvPr id="845652133" name="Picture 845652133"/>
+                    <pic:cNvPicPr/>
+                  </pic:nvPicPr>
+                  <pic:blipFill>
+                    <a:blip r:embed="rId24">
+                      <a:extLst>
+                        <a:ext uri="{28A0092B-C50C-407E-A947-70E740481C1C}">
+                          <a14:useLocalDpi xmlns:a14="http://schemas.microsoft.com/office/drawing/2010/main" val="0"/>
+                        </a:ext>
+                      </a:extLst>
+                    </a:blip>
+                    <a:stretch>
+                      <a:fillRect/>
+                    </a:stretch>
+                  </pic:blipFill>
+                  <pic:spPr>
+                    <a:xfrm>
+                      <a:off x="0" y="0"/>
+                      <a:ext cx="5972175" cy="2687320"/>
+                    </a:xfrm>
+                    <a:prstGeom prst="rect">
+                      <a:avLst/>
+                    </a:prstGeom>
+                  </pic:spPr>
+                </pic:pic>
+              </a:graphicData>
+            </a:graphic>
+          </wp:inline>
+        </w:drawing>
+      </w:r>
+    </w:p>
+    <w:p>
+      <w:pPr>
+        <w:pStyle w:val="Figure"/>
+        <w:jc w:val="center"/>
+      </w:pPr>
+      <w:r>
+        <w:t xml:space="preserve">Figure </w:t>
+      </w:r>
+      <w:r>
+        <w:t xml:space="preserve">4.1.1.a </w:t>
+      </w:r>
+      <w:r>
+        <w:t xml:space="preserve">: </w:t>
+      </w:r>
+      <w:r>
+        <w:t>Vue d'ensemble du kit de composants électroniques et de la platine d'expérimentation (breadboard)</w:t>
+      </w:r>
+    </w:p>
+    <w:p>
+      <w:r>
+        <w:rPr>
+          <w:noProof/>
+          <w14:ligatures w14:val="standardContextual"/>
+        </w:rPr>
+        <w:lastRenderedPageBreak/>
+        <w:drawing>
+          <wp:inline distT="0" distB="0" distL="0" distR="0" wp14:anchorId="2CE846B0" wp14:editId="3480B99A">
+            <wp:extent cx="2687320" cy="5972175"/>
+            <wp:effectExtent l="0" t="4128" r="953" b="952"/>
+            <wp:docPr id="181532236" name="Picture 30"/>
+            <wp:cNvGraphicFramePr>
+              <a:graphicFrameLocks xmlns:a="http://schemas.openxmlformats.org/drawingml/2006/main" noChangeAspect="1"/>
+            </wp:cNvGraphicFramePr>
+            <a:graphic xmlns:a="http://schemas.openxmlformats.org/drawingml/2006/main">
+              <a:graphicData uri="http://schemas.openxmlformats.org/drawingml/2006/picture">
+                <pic:pic xmlns:pic="http://schemas.openxmlformats.org/drawingml/2006/picture">
+                  <pic:nvPicPr>
+                    <pic:cNvPr id="181532236" name="Picture 181532236"/>
+                    <pic:cNvPicPr/>
+                  </pic:nvPicPr>
+                  <pic:blipFill>
+                    <a:blip r:embed="rId25">
+                      <a:extLst>
+                        <a:ext uri="{28A0092B-C50C-407E-A947-70E740481C1C}">
+                          <a14:useLocalDpi xmlns:a14="http://schemas.microsoft.com/office/drawing/2010/main" val="0"/>
+                        </a:ext>
+                      </a:extLst>
+                    </a:blip>
+                    <a:stretch>
+                      <a:fillRect/>
+                    </a:stretch>
+                  </pic:blipFill>
+                  <pic:spPr>
+                    <a:xfrm rot="16200000">
+                      <a:off x="0" y="0"/>
+                      <a:ext cx="2687320" cy="5972175"/>
+                    </a:xfrm>
+                    <a:prstGeom prst="rect">
+                      <a:avLst/>
+                    </a:prstGeom>
+                  </pic:spPr>
+                </pic:pic>
+              </a:graphicData>
+            </a:graphic>
+          </wp:inline>
+        </w:drawing>
+      </w:r>
+    </w:p>
+    <w:p>
+      <w:pPr>
+        <w:pStyle w:val="Figure"/>
+        <w:jc w:val="center"/>
+      </w:pPr>
+      <w:r>
+        <w:t>Figure 4.1.1</w:t>
+      </w:r>
+      <w:r>
+        <w:t>.b</w:t>
+      </w:r>
+      <w:r>
+        <w:t xml:space="preserve"> : </w:t>
+      </w:r>
+      <w:r>
+        <w:t>L'unité centrale de traitement</w:t>
+      </w:r>
+      <w:r>
+        <w:t xml:space="preserve"> et éléments de signalisation</w:t>
+      </w:r>
+    </w:p>
+    <w:p>
+      <w:pPr>
+        <w:pStyle w:val="Figure"/>
+        <w:jc w:val="center"/>
+      </w:pPr>
+    </w:p>
+    <w:p>
+      <w:pPr>
+        <w:pStyle w:val="Figure"/>
+        <w:jc w:val="center"/>
+      </w:pPr>
+    </w:p>
+    <w:p>
+      <w:pPr>
+        <w:pStyle w:val="ListParagraph"/>
+        <w:numPr>
+          <w:ilvl w:val="2"/>
+          <w:numId w:val="27"/>
+        </w:numPr>
+      </w:pPr>
+      <w:r>
+        <w:t>Capteurs de poids</w:t>
+      </w:r>
+    </w:p>
+    <w:p>
+      <w:r>
+        <w:t>Pour l'acquisition de la masse de la bouteille de gaz, nous avons sélectionné un ensemble de quatre capteurs de force à jauge de contrainte</w:t>
+      </w:r>
+      <w:r>
+        <w:t xml:space="preserve">. </w:t>
+      </w:r>
+      <w:r>
+        <w:t xml:space="preserve">Chaque capteur est un modèle à demi-pont capable de mesurer une charge allant jusqu'à 50 kg. Principe de fonctionnement : Ces capteurs fonctionnent comme des transducteurs : ils convertissent la force physique (le poids de la bouteille) en une variation infime de résistance électrique. </w:t>
+      </w:r>
+    </w:p>
+    <w:p>
+      <w:r>
+        <w:rPr>
+          <w:noProof/>
+          <w14:ligatures w14:val="standardContextual"/>
+        </w:rPr>
+        <w:lastRenderedPageBreak/>
+        <w:drawing>
+          <wp:inline distT="0" distB="0" distL="0" distR="0" wp14:anchorId="5FDAFE13" wp14:editId="33A7827C">
+            <wp:extent cx="2687320" cy="5972175"/>
+            <wp:effectExtent l="0" t="4128" r="953" b="952"/>
+            <wp:docPr id="493521599" name="Picture 33"/>
+            <wp:cNvGraphicFramePr>
+              <a:graphicFrameLocks xmlns:a="http://schemas.openxmlformats.org/drawingml/2006/main" noChangeAspect="1"/>
+            </wp:cNvGraphicFramePr>
+            <a:graphic xmlns:a="http://schemas.openxmlformats.org/drawingml/2006/main">
+              <a:graphicData uri="http://schemas.openxmlformats.org/drawingml/2006/picture">
+                <pic:pic xmlns:pic="http://schemas.openxmlformats.org/drawingml/2006/picture">
+                  <pic:nvPicPr>
+                    <pic:cNvPr id="493521599" name="Picture 493521599"/>
+                    <pic:cNvPicPr/>
+                  </pic:nvPicPr>
+                  <pic:blipFill>
+                    <a:blip r:embed="rId26">
+                      <a:extLst>
+                        <a:ext uri="{28A0092B-C50C-407E-A947-70E740481C1C}">
+                          <a14:useLocalDpi xmlns:a14="http://schemas.microsoft.com/office/drawing/2010/main" val="0"/>
+                        </a:ext>
+                      </a:extLst>
+                    </a:blip>
+                    <a:stretch>
+                      <a:fillRect/>
+                    </a:stretch>
+                  </pic:blipFill>
+                  <pic:spPr>
+                    <a:xfrm rot="16200000">
+                      <a:off x="0" y="0"/>
+                      <a:ext cx="2687320" cy="5972175"/>
+                    </a:xfrm>
+                    <a:prstGeom prst="rect">
+                      <a:avLst/>
+                    </a:prstGeom>
+                  </pic:spPr>
+                </pic:pic>
+              </a:graphicData>
+            </a:graphic>
+          </wp:inline>
+        </w:drawing>
+      </w:r>
+    </w:p>
+    <w:p>
+      <w:pPr>
+        <w:pStyle w:val="Figure"/>
+        <w:jc w:val="center"/>
+      </w:pPr>
+      <w:r>
+        <w:t>Figure 4.1.</w:t>
+      </w:r>
+      <w:r>
+        <w:t>2</w:t>
+      </w:r>
+      <w:r>
+        <w:t xml:space="preserve"> : </w:t>
+      </w:r>
+      <w:r>
+        <w:t>Ensemble de quatre capteurs de pesage à jauge de contrainte (type demi-pont, capacité unitaire de 50kg)</w:t>
+      </w:r>
+    </w:p>
+    <w:p/>
+    <w:p>
+      <w:pPr>
+        <w:pStyle w:val="ListParagraph"/>
+        <w:numPr>
+          <w:ilvl w:val="2"/>
+          <w:numId w:val="27"/>
+        </w:numPr>
+      </w:pPr>
+      <w:r>
+        <w:t>Outils d’assemblage et de diagnostic</w:t>
+      </w:r>
+    </w:p>
+    <w:p>
+      <w:r>
+        <w:t>La réalisation physique du prototype et sa maintenance ont nécessité un environnement technique adapté. Nous avons mobilisé un ensemble d'outils de précision pour assurer</w:t>
+      </w:r>
+      <w:r>
+        <w:t>.</w:t>
+      </w:r>
+    </w:p>
+    <w:p>
+      <w:r>
+        <w:rPr>
+          <w:noProof/>
+          <w14:ligatures w14:val="standardContextual"/>
+        </w:rPr>
+        <w:drawing>
+          <wp:inline distT="0" distB="0" distL="0" distR="0" wp14:anchorId="737CA45D" wp14:editId="54443F91">
+            <wp:extent cx="5972175" cy="2647315"/>
+            <wp:effectExtent l="0" t="0" r="0" b="0"/>
+            <wp:docPr id="1205702331" name="Picture 35"/>
+            <wp:cNvGraphicFramePr>
+              <a:graphicFrameLocks xmlns:a="http://schemas.openxmlformats.org/drawingml/2006/main" noChangeAspect="1"/>
+            </wp:cNvGraphicFramePr>
+            <a:graphic xmlns:a="http://schemas.openxmlformats.org/drawingml/2006/main">
+              <a:graphicData uri="http://schemas.openxmlformats.org/drawingml/2006/picture">
+                <pic:pic xmlns:pic="http://schemas.openxmlformats.org/drawingml/2006/picture">
+                  <pic:nvPicPr>
+                    <pic:cNvPr id="1205702331" name="Picture 1205702331"/>
+                    <pic:cNvPicPr/>
+                  </pic:nvPicPr>
+                  <pic:blipFill>
+                    <a:blip r:embed="rId27" cstate="print">
+                      <a:extLst>
+                        <a:ext uri="{28A0092B-C50C-407E-A947-70E740481C1C}">
+                          <a14:useLocalDpi xmlns:a14="http://schemas.microsoft.com/office/drawing/2010/main" val="0"/>
+                        </a:ext>
+                      </a:extLst>
+                    </a:blip>
+                    <a:stretch>
+                      <a:fillRect/>
+                    </a:stretch>
+                  </pic:blipFill>
+                  <pic:spPr>
+                    <a:xfrm>
+                      <a:off x="0" y="0"/>
+                      <a:ext cx="5972175" cy="2647315"/>
+                    </a:xfrm>
+                    <a:prstGeom prst="rect">
+                      <a:avLst/>
+                    </a:prstGeom>
+                  </pic:spPr>
+                </pic:pic>
+              </a:graphicData>
+            </a:graphic>
+          </wp:inline>
+        </w:drawing>
+      </w:r>
+    </w:p>
+    <w:p>
+      <w:pPr>
+        <w:pStyle w:val="Figure"/>
+        <w:jc w:val="center"/>
+      </w:pPr>
+      <w:r>
+        <w:t>Figure 4.1.</w:t>
+      </w:r>
+      <w:r>
+        <w:t>3</w:t>
+      </w:r>
+      <w:r>
+        <w:t xml:space="preserve"> : </w:t>
+      </w:r>
+      <w:r>
+        <w:t xml:space="preserve">Kit d'outillage </w:t>
+      </w:r>
+      <w:r>
+        <w:t xml:space="preserve">d’assemblage </w:t>
+      </w:r>
+      <w:r>
+        <w:t xml:space="preserve">technique </w:t>
+      </w:r>
+    </w:p>
+    <w:p>
+      <w:pPr>
+        <w:pStyle w:val="Figure"/>
+        <w:jc w:val="center"/>
+      </w:pPr>
+    </w:p>
+    <w:p>
+      <w:pPr>
+        <w:pStyle w:val="ListParagraph"/>
+        <w:numPr>
+          <w:ilvl w:val="2"/>
+          <w:numId w:val="27"/>
+        </w:numPr>
+      </w:pPr>
+      <w:r>
+        <w:lastRenderedPageBreak/>
+        <w:t>Téléphone portable</w:t>
+      </w:r>
+    </w:p>
+    <w:p>
+      <w:pPr>
+        <w:ind w:left="720"/>
+      </w:pPr>
+      <w:r>
+        <w:t>Enfin, un smartphone a été intégré au dispositif de test pour effectuer des vérifications en conditions réelles, servant d'interface de contrôle physique pour valider instantanément la réception des données.</w:t>
+      </w:r>
+    </w:p>
+    <w:p>
+      <w:pPr>
+        <w:pStyle w:val="Figure"/>
+        <w:jc w:val="center"/>
+      </w:pPr>
+    </w:p>
+    <w:p>
+      <w:pPr>
+        <w:pStyle w:val="Heading2"/>
+        <w:numPr>
+          <w:ilvl w:val="1"/>
+          <w:numId w:val="35"/>
+        </w:numPr>
+      </w:pPr>
+      <w:bookmarkStart w:id="85" w:name="_Toc212338054"/>
+      <w:bookmarkStart w:id="86" w:name="_Toc212338111"/>
+      <w:r>
+        <w:t>Logiciels utilisés</w:t>
+      </w:r>
+      <w:bookmarkEnd w:id="85"/>
+      <w:bookmarkEnd w:id="86"/>
+    </w:p>
+    <w:p>
+      <w:r>
+        <w:t>Pour mener à bien le développement de la solution, de la conception électronique jusqu'à l'interface utilisateur mobile, nous nous sommes appuyés sur une suite d'outils logiciels complémentaires.</w:t>
+      </w:r>
+    </w:p>
+    <w:p>
+      <w:pPr>
+        <w:pStyle w:val="ListParagraph"/>
+        <w:numPr>
+          <w:ilvl w:val="2"/>
+          <w:numId w:val="35"/>
+        </w:numPr>
+      </w:pPr>
+      <w:r>
+        <w:t>Android Studio</w:t>
+      </w:r>
+    </w:p>
+    <w:p>
+      <w:pPr>
+        <w:pStyle w:val="ListParagraph"/>
+        <w:ind w:left="1440"/>
+      </w:pPr>
+      <w:r>
+        <w:rPr>
+          <w:noProof/>
+          <w14:ligatures w14:val="standardContextual"/>
+        </w:rPr>
+        <w:drawing>
+          <wp:inline distT="0" distB="0" distL="0" distR="0" wp14:anchorId="2994C32D" wp14:editId="4DDD14C2">
+            <wp:extent cx="1739900" cy="406400"/>
+            <wp:effectExtent l="0" t="0" r="0" b="0"/>
+            <wp:docPr id="1366884040" name="Picture 38"/>
+            <wp:cNvGraphicFramePr>
+              <a:graphicFrameLocks xmlns:a="http://schemas.openxmlformats.org/drawingml/2006/main" noChangeAspect="1"/>
+            </wp:cNvGraphicFramePr>
+            <a:graphic xmlns:a="http://schemas.openxmlformats.org/drawingml/2006/main">
+              <a:graphicData uri="http://schemas.openxmlformats.org/drawingml/2006/picture">
+                <pic:pic xmlns:pic="http://schemas.openxmlformats.org/drawingml/2006/picture">
+                  <pic:nvPicPr>
+                    <pic:cNvPr id="1366884040" name="Picture 1366884040"/>
+                    <pic:cNvPicPr/>
+                  </pic:nvPicPr>
+                  <pic:blipFill>
+                    <a:blip r:embed="rId28">
+                      <a:extLst>
+                        <a:ext uri="{28A0092B-C50C-407E-A947-70E740481C1C}">
+                          <a14:useLocalDpi xmlns:a14="http://schemas.microsoft.com/office/drawing/2010/main" val="0"/>
+                        </a:ext>
+                      </a:extLst>
+                    </a:blip>
+                    <a:stretch>
+                      <a:fillRect/>
+                    </a:stretch>
+                  </pic:blipFill>
+                  <pic:spPr>
+                    <a:xfrm>
+                      <a:off x="0" y="0"/>
+                      <a:ext cx="1739900" cy="406400"/>
+                    </a:xfrm>
+                    <a:prstGeom prst="rect">
+                      <a:avLst/>
+                    </a:prstGeom>
+                  </pic:spPr>
+                </pic:pic>
+              </a:graphicData>
+            </a:graphic>
+          </wp:inline>
+        </w:drawing>
+      </w:r>
+    </w:p>
+    <w:p>
+      <w:pPr>
+        <w:pStyle w:val="ListParagraph"/>
+        <w:ind w:left="1440"/>
+      </w:pPr>
+      <w:r>
+        <w:t>Dans notre flux de travail, cet outil a été principalement mobilisé pour ses capacités d'émulation avancées (Android Virtual Devices). Il nous a permis de déployer l'application sur des terminaux virtuels afin de valider le comportement de l'interface et l'affichage des données de gaz, simulant ainsi divers modèles de smartphones sans nécessiter de matériel physique supplémentaire</w:t>
+      </w:r>
+      <w:r>
+        <w:t xml:space="preserve"> ou en cas d’indisponibilité du téléphone physique</w:t>
+      </w:r>
+      <w:r>
+        <w:t xml:space="preserve"> lors des phases de développement.</w:t>
+      </w:r>
+    </w:p>
+    <w:p>
+      <w:pPr>
+        <w:pStyle w:val="ListParagraph"/>
+        <w:ind w:left="1440"/>
+      </w:pPr>
+    </w:p>
+    <w:p>
+      <w:pPr>
+        <w:pStyle w:val="ListParagraph"/>
+        <w:numPr>
+          <w:ilvl w:val="2"/>
+          <w:numId w:val="35"/>
+        </w:numPr>
+      </w:pPr>
+      <w:r>
+        <w:t>XCode</w:t>
+      </w:r>
+    </w:p>
+    <w:p>
+      <w:pPr>
+        <w:pStyle w:val="ListParagraph"/>
+        <w:ind w:left="1440"/>
+      </w:pPr>
+      <w:r>
+        <w:drawing>
+          <wp:inline distT="0" distB="0" distL="0" distR="0" wp14:anchorId="03B53D4D" wp14:editId="5AFD74D5">
+            <wp:extent cx="990600" cy="393700"/>
+            <wp:effectExtent l="0" t="0" r="0" b="0"/>
+            <wp:docPr id="1235807005" name="Picture 1"/>
+            <wp:cNvGraphicFramePr>
+              <a:graphicFrameLocks xmlns:a="http://schemas.openxmlformats.org/drawingml/2006/main" noChangeAspect="1"/>
+            </wp:cNvGraphicFramePr>
+            <a:graphic xmlns:a="http://schemas.openxmlformats.org/drawingml/2006/main">
+              <a:graphicData uri="http://schemas.openxmlformats.org/drawingml/2006/picture">
+                <pic:pic xmlns:pic="http://schemas.openxmlformats.org/drawingml/2006/picture">
+                  <pic:nvPicPr>
+                    <pic:cNvPr id="1235807005" name=""/>
+                    <pic:cNvPicPr/>
+                  </pic:nvPicPr>
+                  <pic:blipFill>
+                    <a:blip r:embed="rId29"/>
+                    <a:stretch>
+                      <a:fillRect/>
+                    </a:stretch>
+                  </pic:blipFill>
+                  <pic:spPr>
+                    <a:xfrm>
+                      <a:off x="0" y="0"/>
+                      <a:ext cx="990600" cy="393700"/>
+                    </a:xfrm>
+                    <a:prstGeom prst="rect">
+                      <a:avLst/>
+                    </a:prstGeom>
+                  </pic:spPr>
+                </pic:pic>
+              </a:graphicData>
+            </a:graphic>
+          </wp:inline>
+        </w:drawing>
+      </w:r>
+    </w:p>
+    <w:p>
+      <w:pPr>
+        <w:pStyle w:val="ListParagraph"/>
+        <w:ind w:left="1440"/>
+      </w:pPr>
+      <w:r>
+        <w:t>Dans une optique d'accessibilité multiplateforme, cet environnement a été utilisé spécifiquement pour valider la compatibilité de notre solution avec l'écosystème Apple. Il nous a permis d'effectuer des tests de vérification technique, garantissant que l'interface de gestion et la réception des alertes fonctionnent de manière optimale sous iOS, offrant ainsi une expérience utilisateur équivalente à la version Android.</w:t>
+      </w:r>
+    </w:p>
+    <w:p>
+      <w:pPr>
+        <w:pStyle w:val="ListParagraph"/>
+        <w:ind w:left="1440"/>
+      </w:pPr>
+    </w:p>
+    <w:p>
+      <w:pPr>
+        <w:pStyle w:val="ListParagraph"/>
+        <w:ind w:left="1440"/>
+      </w:pPr>
+    </w:p>
+    <w:p>
+      <w:pPr>
+        <w:pStyle w:val="ListParagraph"/>
+        <w:numPr>
+          <w:ilvl w:val="2"/>
+          <w:numId w:val="35"/>
+        </w:numPr>
+      </w:pPr>
+      <w:r>
+        <w:lastRenderedPageBreak/>
+        <w:t>Éditeur d’Environnement Intégré : Intelliji</w:t>
+      </w:r>
+    </w:p>
+    <w:p>
+      <w:pPr>
+        <w:pStyle w:val="ListParagraph"/>
+        <w:ind w:left="1440"/>
+      </w:pPr>
+      <w:r>
+        <w:drawing>
+          <wp:inline distT="0" distB="0" distL="0" distR="0" wp14:anchorId="79B4401D" wp14:editId="3AD0B041">
+            <wp:extent cx="478971" cy="421780"/>
+            <wp:effectExtent l="0" t="0" r="3810" b="0"/>
+            <wp:docPr id="2097944274" name="Picture 1"/>
+            <wp:cNvGraphicFramePr>
+              <a:graphicFrameLocks xmlns:a="http://schemas.openxmlformats.org/drawingml/2006/main" noChangeAspect="1"/>
+            </wp:cNvGraphicFramePr>
+            <a:graphic xmlns:a="http://schemas.openxmlformats.org/drawingml/2006/main">
+              <a:graphicData uri="http://schemas.openxmlformats.org/drawingml/2006/picture">
+                <pic:pic xmlns:pic="http://schemas.openxmlformats.org/drawingml/2006/picture">
+                  <pic:nvPicPr>
+                    <pic:cNvPr id="2097944274" name=""/>
+                    <pic:cNvPicPr/>
+                  </pic:nvPicPr>
+                  <pic:blipFill>
+                    <a:blip r:embed="rId30"/>
+                    <a:stretch>
+                      <a:fillRect/>
+                    </a:stretch>
+                  </pic:blipFill>
+                  <pic:spPr>
+                    <a:xfrm>
+                      <a:off x="0" y="0"/>
+                      <a:ext cx="499066" cy="439475"/>
+                    </a:xfrm>
+                    <a:prstGeom prst="rect">
+                      <a:avLst/>
+                    </a:prstGeom>
+                  </pic:spPr>
+                </pic:pic>
+              </a:graphicData>
+            </a:graphic>
+          </wp:inline>
+        </w:drawing>
+      </w:r>
+    </w:p>
+    <w:p>
+      <w:pPr>
+        <w:pStyle w:val="ListParagraph"/>
+        <w:ind w:left="1440"/>
+      </w:pPr>
+      <w:r>
+        <w:t>Cet IDE a constitué notre environnement de développement principal pour la production du code source. Choisi pour son ergonomie et sa puissance, il a servi à l'écriture et à la structuration de la logique applicative du projet.</w:t>
+      </w:r>
+    </w:p>
+    <w:p>
+      <w:pPr>
+        <w:pStyle w:val="ListParagraph"/>
+        <w:ind w:left="1440"/>
+      </w:pPr>
+    </w:p>
+    <w:p>
+      <w:pPr>
+        <w:pStyle w:val="ListParagraph"/>
+        <w:numPr>
+          <w:ilvl w:val="2"/>
+          <w:numId w:val="35"/>
+        </w:numPr>
+      </w:pPr>
+      <w:r>
+        <w:t>Arduino IDE</w:t>
+      </w:r>
+    </w:p>
+    <w:p>
+      <w:pPr>
+        <w:pStyle w:val="ListParagraph"/>
+        <w:ind w:left="1440"/>
+      </w:pPr>
+      <w:r>
+        <w:drawing>
+          <wp:inline distT="0" distB="0" distL="0" distR="0" wp14:anchorId="27413EFD" wp14:editId="5865D239">
+            <wp:extent cx="729343" cy="385916"/>
+            <wp:effectExtent l="0" t="0" r="0" b="0"/>
+            <wp:docPr id="484978635" name="Picture 1"/>
+            <wp:cNvGraphicFramePr>
+              <a:graphicFrameLocks xmlns:a="http://schemas.openxmlformats.org/drawingml/2006/main" noChangeAspect="1"/>
+            </wp:cNvGraphicFramePr>
+            <a:graphic xmlns:a="http://schemas.openxmlformats.org/drawingml/2006/main">
+              <a:graphicData uri="http://schemas.openxmlformats.org/drawingml/2006/picture">
+                <pic:pic xmlns:pic="http://schemas.openxmlformats.org/drawingml/2006/picture">
+                  <pic:nvPicPr>
+                    <pic:cNvPr id="484978635" name=""/>
+                    <pic:cNvPicPr/>
+                  </pic:nvPicPr>
+                  <pic:blipFill>
+                    <a:blip r:embed="rId31"/>
+                    <a:stretch>
+                      <a:fillRect/>
+                    </a:stretch>
+                  </pic:blipFill>
+                  <pic:spPr>
+                    <a:xfrm>
+                      <a:off x="0" y="0"/>
+                      <a:ext cx="788940" cy="417450"/>
+                    </a:xfrm>
+                    <a:prstGeom prst="rect">
+                      <a:avLst/>
+                    </a:prstGeom>
+                  </pic:spPr>
+                </pic:pic>
+              </a:graphicData>
+            </a:graphic>
+          </wp:inline>
+        </w:drawing>
+      </w:r>
+    </w:p>
+    <w:p>
+      <w:pPr>
+        <w:pStyle w:val="ListParagraph"/>
+        <w:ind w:left="1440"/>
+      </w:pPr>
+      <w:r>
+        <w:t>L</w:t>
+      </w:r>
+      <w:r>
+        <w:t>'environnement de développement officiel Arduino a été utilisé pour écrire, compiler et téléverser le code (firmware) dans le microcontrôleur de la carte Uno.</w:t>
+      </w:r>
+    </w:p>
+    <w:p>
+      <w:pPr>
+        <w:pStyle w:val="ListParagraph"/>
+        <w:ind w:left="1440"/>
+      </w:pPr>
+    </w:p>
+    <w:p>
+      <w:pPr>
+        <w:pStyle w:val="ListParagraph"/>
+        <w:numPr>
+          <w:ilvl w:val="2"/>
+          <w:numId w:val="35"/>
+        </w:numPr>
+      </w:pPr>
+      <w:r>
+        <w:t>Fritzing</w:t>
+      </w:r>
+    </w:p>
+    <w:p>
+      <w:pPr>
+        <w:ind w:left="1080" w:firstLine="360"/>
+      </w:pPr>
+      <w:r>
+        <w:drawing>
+          <wp:inline distT="0" distB="0" distL="0" distR="0" wp14:anchorId="58348EF7" wp14:editId="27CF2EBC">
+            <wp:extent cx="947057" cy="315686"/>
+            <wp:effectExtent l="0" t="0" r="5715" b="1905"/>
+            <wp:docPr id="779755059" name="Picture 1"/>
+            <wp:cNvGraphicFramePr>
+              <a:graphicFrameLocks xmlns:a="http://schemas.openxmlformats.org/drawingml/2006/main" noChangeAspect="1"/>
+            </wp:cNvGraphicFramePr>
+            <a:graphic xmlns:a="http://schemas.openxmlformats.org/drawingml/2006/main">
+              <a:graphicData uri="http://schemas.openxmlformats.org/drawingml/2006/picture">
+                <pic:pic xmlns:pic="http://schemas.openxmlformats.org/drawingml/2006/picture">
+                  <pic:nvPicPr>
+                    <pic:cNvPr id="779755059" name=""/>
+                    <pic:cNvPicPr/>
+                  </pic:nvPicPr>
+                  <pic:blipFill>
+                    <a:blip r:embed="rId32"/>
+                    <a:stretch>
+                      <a:fillRect/>
+                    </a:stretch>
+                  </pic:blipFill>
+                  <pic:spPr>
+                    <a:xfrm>
+                      <a:off x="0" y="0"/>
+                      <a:ext cx="959907" cy="319969"/>
+                    </a:xfrm>
+                    <a:prstGeom prst="rect">
+                      <a:avLst/>
+                    </a:prstGeom>
+                  </pic:spPr>
+                </pic:pic>
+              </a:graphicData>
+            </a:graphic>
+          </wp:inline>
+        </w:drawing>
+      </w:r>
+    </w:p>
+    <w:p>
+      <w:pPr>
+        <w:ind w:left="1440"/>
+      </w:pPr>
+      <w:r>
+        <w:t>C</w:t>
+      </w:r>
+      <w:r>
+        <w:t>e logiciel de C</w:t>
+      </w:r>
+      <w:r>
+        <w:t>onception Assistée par l’Ordinateur (CAO)</w:t>
+      </w:r>
+      <w:r>
+        <w:t xml:space="preserve"> a été utilisé pour modéliser et schématiser l'architecture matérielle du projet. Il nous a permis de transcrire le montage physique en une vue de câblage virtuelle claire, détaillant les connexions exactes entre l'Arduino et les différents capteurs</w:t>
+      </w:r>
+    </w:p>
+    <w:p>
+      <w:pPr>
+        <w:ind w:left="1080" w:firstLine="360"/>
+      </w:pPr>
+    </w:p>
+    <w:p/>
+    <w:p/>
+    <w:p>
+      <w:pPr>
+        <w:pStyle w:val="Heading2"/>
+        <w:numPr>
+          <w:ilvl w:val="1"/>
+          <w:numId w:val="35"/>
+        </w:numPr>
+      </w:pPr>
+      <w:bookmarkStart w:id="87" w:name="_Toc212338055"/>
+      <w:bookmarkStart w:id="88" w:name="_Toc212338112"/>
+      <w:r>
+        <w:t>Procédure</w:t>
+      </w:r>
+      <w:bookmarkEnd w:id="87"/>
+      <w:bookmarkEnd w:id="88"/>
+    </w:p>
+    <w:p>
+      <w:pPr>
+        <w:ind w:left="1080"/>
+      </w:pPr>
+      <w:r>
+        <w:t xml:space="preserve">La procédure de mise en œuvre a suivi une méthodologie incrémentale, débutant par l'assemblage de l'architecture centrale sur une platine d’expérimentation (breadboard). Dans un premier temps, l'effort s'est concentré sur l'intégration physique des quatre capteurs de pesage : ces derniers ont été câblés en pont complet et reliés au microcontrôleur pour assurer la précision du signal. Une fois le circuit établi, nous avons procédé à une phase de validation locale. Bien que la finalité du système soit la </w:t>
+      </w:r>
+      <w:r>
+        <w:lastRenderedPageBreak/>
+        <w:t>transmission des données vers une interface mobile, nous avons exploité les afficheurs 7 segments du kit comme témoins de contrôle. Cette étape intermédiaire a permis de visualiser instantanément les valeurs brutes traitées par l'Arduino et de vérifier le bon fonctionnement de la chaîne d'acquisition avant toute complexification.</w:t>
+      </w:r>
+      <w:r>
+        <w:t xml:space="preserve"> A</w:t>
+      </w:r>
+      <w:r>
+        <w:t>près avoir calibré les capteurs via le logiciel Arduino IDE pour obtenir des valeurs en kilogrammes cohérentes, nous avons activé la communication sans fil. Le système a alors été couplé à l'application mobile, transformant le prototype en une solution connectée fonctionnelle, capable d'alerter l'utilisateur</w:t>
+      </w:r>
+      <w:r>
+        <w:t xml:space="preserve">. </w:t>
+      </w:r>
+      <w:r>
+        <w:t>Parallèlement à l'instrumentation matérielle</w:t>
+      </w:r>
+      <w:r>
+        <w:t xml:space="preserve"> et le développement de l’interface mobile pour les utilisateurs, quelques interfaces  et logiques métiers ont été développées dans un autre projet mobile pour les gérants de gaz, les revendeurs.</w:t>
+      </w:r>
+    </w:p>
     <w:p/>
     <w:p/>
     <w:p/>
-    <w:p/>
-    <w:p/>
     <w:p>
       <w:pPr>
         <w:pStyle w:val="Heading2"/>
         <w:numPr>
           <w:ilvl w:val="1"/>
-          <w:numId w:val="27"/>
+          <w:numId w:val="35"/>
         </w:numPr>
       </w:pPr>
-      <w:bookmarkStart w:id="85" w:name="_Toc212338054"/>
-      <w:bookmarkStart w:id="86" w:name="_Toc212338111"/>
-      <w:r>
-        <w:t>Logiciels utilisés</w:t>
-      </w:r>
-      <w:bookmarkEnd w:id="85"/>
-      <w:bookmarkEnd w:id="86"/>
+      <w:bookmarkStart w:id="89" w:name="_Toc212338056"/>
+      <w:bookmarkStart w:id="90" w:name="_Toc212338113"/>
+      <w:r>
+        <w:t>Ét</w:t>
+      </w:r>
+      <w:r>
+        <w:t>ude de co</w:t>
+      </w:r>
+      <w:r>
+        <w:t>û</w:t>
+      </w:r>
+      <w:r>
+        <w:t>t</w:t>
+      </w:r>
+      <w:bookmarkEnd w:id="89"/>
+      <w:bookmarkEnd w:id="90"/>
+    </w:p>
+    <w:p>
+      <w:r>
+        <w:t>Le tableau ci-dessous détaille la nomenclature des composants nécessaires à la réalisation du prototype. Les prix indiqués correspondent aux tarifs du marché lors de la phase d'acquisition.</w:t>
+      </w:r>
+    </w:p>
+    <w:tbl>
+      <w:tblPr>
+        <w:tblStyle w:val="GridTable4-Accent3"/>
+        <w:tblW w:w="10774" w:type="dxa"/>
+        <w:tblInd w:w="-431" w:type="dxa"/>
+        <w:tblLook w:val="04A0" w:firstRow="1" w:lastRow="0" w:firstColumn="1" w:lastColumn="0" w:noHBand="0" w:noVBand="1"/>
+      </w:tblPr>
+      <w:tblGrid>
+        <w:gridCol w:w="2553"/>
+        <w:gridCol w:w="1559"/>
+        <w:gridCol w:w="3685"/>
+        <w:gridCol w:w="2977"/>
+      </w:tblGrid>
+      <w:tr>
+        <w:trPr>
+          <w:cnfStyle w:val="100000000000" w:firstRow="1" w:lastRow="0" w:firstColumn="0" w:lastColumn="0" w:oddVBand="0" w:evenVBand="0" w:oddHBand="0" w:evenHBand="0" w:firstRowFirstColumn="0" w:firstRowLastColumn="0" w:lastRowFirstColumn="0" w:lastRowLastColumn="0"/>
+        </w:trPr>
+        <w:tc>
+          <w:tcPr>
+            <w:cnfStyle w:val="001000000000" w:firstRow="0" w:lastRow="0" w:firstColumn="1" w:lastColumn="0" w:oddVBand="0" w:evenVBand="0" w:oddHBand="0" w:evenHBand="0" w:firstRowFirstColumn="0" w:firstRowLastColumn="0" w:lastRowFirstColumn="0" w:lastRowLastColumn="0"/>
+            <w:tcW w:w="2553" w:type="dxa"/>
+          </w:tcPr>
+          <w:p>
+            <w:pPr>
+              <w:jc w:val="center"/>
+            </w:pPr>
+            <w:r>
+              <w:t>Composant</w:t>
+            </w:r>
+          </w:p>
+        </w:tc>
+        <w:tc>
+          <w:tcPr>
+            <w:tcW w:w="1559" w:type="dxa"/>
+          </w:tcPr>
+          <w:p>
+            <w:pPr>
+              <w:jc w:val="center"/>
+              <w:cnfStyle w:val="100000000000" w:firstRow="1" w:lastRow="0" w:firstColumn="0" w:lastColumn="0" w:oddVBand="0" w:evenVBand="0" w:oddHBand="0" w:evenHBand="0" w:firstRowFirstColumn="0" w:firstRowLastColumn="0" w:lastRowFirstColumn="0" w:lastRowLastColumn="0"/>
+            </w:pPr>
+            <w:r>
+              <w:t>Quantité</w:t>
+            </w:r>
+          </w:p>
+        </w:tc>
+        <w:tc>
+          <w:tcPr>
+            <w:tcW w:w="3685" w:type="dxa"/>
+          </w:tcPr>
+          <w:p>
+            <w:pPr>
+              <w:jc w:val="center"/>
+              <w:cnfStyle w:val="100000000000" w:firstRow="1" w:lastRow="0" w:firstColumn="0" w:lastColumn="0" w:oddVBand="0" w:evenVBand="0" w:oddHBand="0" w:evenHBand="0" w:firstRowFirstColumn="0" w:firstRowLastColumn="0" w:lastRowFirstColumn="0" w:lastRowLastColumn="0"/>
+            </w:pPr>
+            <w:r>
+              <w:t>Prix Unitaire (CFA / € / $)</w:t>
+            </w:r>
+          </w:p>
+        </w:tc>
+        <w:tc>
+          <w:tcPr>
+            <w:tcW w:w="2977" w:type="dxa"/>
+          </w:tcPr>
+          <w:p>
+            <w:pPr>
+              <w:jc w:val="center"/>
+              <w:cnfStyle w:val="100000000000" w:firstRow="1" w:lastRow="0" w:firstColumn="0" w:lastColumn="0" w:oddVBand="0" w:evenVBand="0" w:oddHBand="0" w:evenHBand="0" w:firstRowFirstColumn="0" w:firstRowLastColumn="0" w:lastRowFirstColumn="0" w:lastRowLastColumn="0"/>
+            </w:pPr>
+            <w:r>
+              <w:t>Prix Total</w:t>
+            </w:r>
+            <w:r>
+              <w:t xml:space="preserve"> en Fcfa</w:t>
+            </w:r>
+          </w:p>
+        </w:tc>
+      </w:tr>
+      <w:tr>
+        <w:trPr>
+          <w:cnfStyle w:val="000000100000" w:firstRow="0" w:lastRow="0" w:firstColumn="0" w:lastColumn="0" w:oddVBand="0" w:evenVBand="0" w:oddHBand="1" w:evenHBand="0" w:firstRowFirstColumn="0" w:firstRowLastColumn="0" w:lastRowFirstColumn="0" w:lastRowLastColumn="0"/>
+        </w:trPr>
+        <w:tc>
+          <w:tcPr>
+            <w:cnfStyle w:val="001000000000" w:firstRow="0" w:lastRow="0" w:firstColumn="1" w:lastColumn="0" w:oddVBand="0" w:evenVBand="0" w:oddHBand="0" w:evenHBand="0" w:firstRowFirstColumn="0" w:firstRowLastColumn="0" w:lastRowFirstColumn="0" w:lastRowLastColumn="0"/>
+            <w:tcW w:w="2553" w:type="dxa"/>
+          </w:tcPr>
+          <w:p>
+            <w:r>
+              <w:t>Kit de développement Arduino complet</w:t>
+            </w:r>
+            <w:r>
+              <w:t xml:space="preserve"> </w:t>
+            </w:r>
+            <w:r>
+              <w:t xml:space="preserve"> (Arduino UNO R3)</w:t>
+            </w:r>
+          </w:p>
+        </w:tc>
+        <w:tc>
+          <w:tcPr>
+            <w:tcW w:w="1559" w:type="dxa"/>
+          </w:tcPr>
+          <w:p>
+            <w:pPr>
+              <w:jc w:val="center"/>
+              <w:cnfStyle w:val="000000100000" w:firstRow="0" w:lastRow="0" w:firstColumn="0" w:lastColumn="0" w:oddVBand="0" w:evenVBand="0" w:oddHBand="1" w:evenHBand="0" w:firstRowFirstColumn="0" w:firstRowLastColumn="0" w:lastRowFirstColumn="0" w:lastRowLastColumn="0"/>
+            </w:pPr>
+          </w:p>
+          <w:p>
+            <w:pPr>
+              <w:jc w:val="center"/>
+              <w:cnfStyle w:val="000000100000" w:firstRow="0" w:lastRow="0" w:firstColumn="0" w:lastColumn="0" w:oddVBand="0" w:evenVBand="0" w:oddHBand="1" w:evenHBand="0" w:firstRowFirstColumn="0" w:firstRowLastColumn="0" w:lastRowFirstColumn="0" w:lastRowLastColumn="0"/>
+            </w:pPr>
+            <w:r>
+              <w:t>1</w:t>
+            </w:r>
+          </w:p>
+        </w:tc>
+        <w:tc>
+          <w:tcPr>
+            <w:tcW w:w="3685" w:type="dxa"/>
+          </w:tcPr>
+          <w:p>
+            <w:pPr>
+              <w:jc w:val="center"/>
+              <w:cnfStyle w:val="000000100000" w:firstRow="0" w:lastRow="0" w:firstColumn="0" w:lastColumn="0" w:oddVBand="0" w:evenVBand="0" w:oddHBand="1" w:evenHBand="0" w:firstRowFirstColumn="0" w:firstRowLastColumn="0" w:lastRowFirstColumn="0" w:lastRowLastColumn="0"/>
+            </w:pPr>
+          </w:p>
+          <w:p>
+            <w:pPr>
+              <w:jc w:val="center"/>
+              <w:cnfStyle w:val="000000100000" w:firstRow="0" w:lastRow="0" w:firstColumn="0" w:lastColumn="0" w:oddVBand="0" w:evenVBand="0" w:oddHBand="1" w:evenHBand="0" w:firstRowFirstColumn="0" w:firstRowLastColumn="0" w:lastRowFirstColumn="0" w:lastRowLastColumn="0"/>
+            </w:pPr>
+            <w:r>
+              <w:t>21</w:t>
+            </w:r>
+            <w:r>
+              <w:t>,</w:t>
+            </w:r>
+            <w:r>
+              <w:t>15</w:t>
+            </w:r>
+            <w:r>
+              <w:t xml:space="preserve"> </w:t>
+            </w:r>
+            <w:r>
+              <w:t>$</w:t>
+            </w:r>
+          </w:p>
+        </w:tc>
+        <w:tc>
+          <w:tcPr>
+            <w:tcW w:w="2977" w:type="dxa"/>
+          </w:tcPr>
+          <w:p>
+            <w:pPr>
+              <w:jc w:val="center"/>
+              <w:cnfStyle w:val="000000100000" w:firstRow="0" w:lastRow="0" w:firstColumn="0" w:lastColumn="0" w:oddVBand="0" w:evenVBand="0" w:oddHBand="1" w:evenHBand="0" w:firstRowFirstColumn="0" w:firstRowLastColumn="0" w:lastRowFirstColumn="0" w:lastRowLastColumn="0"/>
+            </w:pPr>
+          </w:p>
+          <w:p>
+            <w:pPr>
+              <w:jc w:val="center"/>
+              <w:cnfStyle w:val="000000100000" w:firstRow="0" w:lastRow="0" w:firstColumn="0" w:lastColumn="0" w:oddVBand="0" w:evenVBand="0" w:oddHBand="1" w:evenHBand="0" w:firstRowFirstColumn="0" w:firstRowLastColumn="0" w:lastRowFirstColumn="0" w:lastRowLastColumn="0"/>
+            </w:pPr>
+            <w:r>
+              <w:t>11 975,91</w:t>
+            </w:r>
+          </w:p>
+        </w:tc>
+      </w:tr>
+      <w:tr>
+        <w:tc>
+          <w:tcPr>
+            <w:cnfStyle w:val="001000000000" w:firstRow="0" w:lastRow="0" w:firstColumn="1" w:lastColumn="0" w:oddVBand="0" w:evenVBand="0" w:oddHBand="0" w:evenHBand="0" w:firstRowFirstColumn="0" w:firstRowLastColumn="0" w:lastRowFirstColumn="0" w:lastRowLastColumn="0"/>
+            <w:tcW w:w="2553" w:type="dxa"/>
+          </w:tcPr>
+          <w:p>
+            <w:r>
+              <w:t>Capteurs de charge</w:t>
+            </w:r>
+            <w:r>
+              <w:t xml:space="preserve"> demi-pont</w:t>
+            </w:r>
+            <w:r>
+              <w:t xml:space="preserve"> (50kg)</w:t>
+            </w:r>
+          </w:p>
+        </w:tc>
+        <w:tc>
+          <w:tcPr>
+            <w:tcW w:w="1559" w:type="dxa"/>
+          </w:tcPr>
+          <w:p>
+            <w:pPr>
+              <w:jc w:val="center"/>
+              <w:cnfStyle w:val="000000000000" w:firstRow="0" w:lastRow="0" w:firstColumn="0" w:lastColumn="0" w:oddVBand="0" w:evenVBand="0" w:oddHBand="0" w:evenHBand="0" w:firstRowFirstColumn="0" w:firstRowLastColumn="0" w:lastRowFirstColumn="0" w:lastRowLastColumn="0"/>
+            </w:pPr>
+            <w:r>
+              <w:t>8</w:t>
+            </w:r>
+          </w:p>
+        </w:tc>
+        <w:tc>
+          <w:tcPr>
+            <w:tcW w:w="3685" w:type="dxa"/>
+          </w:tcPr>
+          <w:p>
+            <w:pPr>
+              <w:jc w:val="center"/>
+              <w:cnfStyle w:val="000000000000" w:firstRow="0" w:lastRow="0" w:firstColumn="0" w:lastColumn="0" w:oddVBand="0" w:evenVBand="0" w:oddHBand="0" w:evenHBand="0" w:firstRowFirstColumn="0" w:firstRowLastColumn="0" w:lastRowFirstColumn="0" w:lastRowLastColumn="0"/>
+            </w:pPr>
+            <w:r>
+              <w:t>1</w:t>
+            </w:r>
+            <w:r>
+              <w:t>,</w:t>
+            </w:r>
+            <w:r>
+              <w:t>875 €</w:t>
+            </w:r>
+          </w:p>
+        </w:tc>
+        <w:tc>
+          <w:tcPr>
+            <w:tcW w:w="2977" w:type="dxa"/>
+          </w:tcPr>
+          <w:p>
+            <w:pPr>
+              <w:jc w:val="center"/>
+              <w:cnfStyle w:val="000000000000" w:firstRow="0" w:lastRow="0" w:firstColumn="0" w:lastColumn="0" w:oddVBand="0" w:evenVBand="0" w:oddHBand="0" w:evenHBand="0" w:firstRowFirstColumn="0" w:firstRowLastColumn="0" w:lastRowFirstColumn="0" w:lastRowLastColumn="0"/>
+            </w:pPr>
+            <w:r>
+              <w:t>9 839,36</w:t>
+            </w:r>
+          </w:p>
+        </w:tc>
+      </w:tr>
+      <w:tr>
+        <w:trPr>
+          <w:cnfStyle w:val="000000100000" w:firstRow="0" w:lastRow="0" w:firstColumn="0" w:lastColumn="0" w:oddVBand="0" w:evenVBand="0" w:oddHBand="1" w:evenHBand="0" w:firstRowFirstColumn="0" w:firstRowLastColumn="0" w:lastRowFirstColumn="0" w:lastRowLastColumn="0"/>
+        </w:trPr>
+        <w:tc>
+          <w:tcPr>
+            <w:cnfStyle w:val="001000000000" w:firstRow="0" w:lastRow="0" w:firstColumn="1" w:lastColumn="0" w:oddVBand="0" w:evenVBand="0" w:oddHBand="0" w:evenHBand="0" w:firstRowFirstColumn="0" w:firstRowLastColumn="0" w:lastRowFirstColumn="0" w:lastRowLastColumn="0"/>
+            <w:tcW w:w="2553" w:type="dxa"/>
+          </w:tcPr>
+          <w:p>
+            <w:r>
+              <w:t>Capteur de pression HX711 (10Kg)</w:t>
+            </w:r>
+          </w:p>
+        </w:tc>
+        <w:tc>
+          <w:tcPr>
+            <w:tcW w:w="1559" w:type="dxa"/>
+          </w:tcPr>
+          <w:p>
+            <w:pPr>
+              <w:jc w:val="center"/>
+              <w:cnfStyle w:val="000000100000" w:firstRow="0" w:lastRow="0" w:firstColumn="0" w:lastColumn="0" w:oddVBand="0" w:evenVBand="0" w:oddHBand="1" w:evenHBand="0" w:firstRowFirstColumn="0" w:firstRowLastColumn="0" w:lastRowFirstColumn="0" w:lastRowLastColumn="0"/>
+            </w:pPr>
+            <w:r>
+              <w:t>1</w:t>
+            </w:r>
+          </w:p>
+        </w:tc>
+        <w:tc>
+          <w:tcPr>
+            <w:tcW w:w="3685" w:type="dxa"/>
+          </w:tcPr>
+          <w:p>
+            <w:pPr>
+              <w:jc w:val="center"/>
+              <w:cnfStyle w:val="000000100000" w:firstRow="0" w:lastRow="0" w:firstColumn="0" w:lastColumn="0" w:oddVBand="0" w:evenVBand="0" w:oddHBand="1" w:evenHBand="0" w:firstRowFirstColumn="0" w:firstRowLastColumn="0" w:lastRowFirstColumn="0" w:lastRowLastColumn="0"/>
+            </w:pPr>
+            <w:r>
+              <w:t>1</w:t>
+            </w:r>
+            <w:r>
+              <w:t>,</w:t>
+            </w:r>
+            <w:r>
+              <w:t>98 $</w:t>
+            </w:r>
+          </w:p>
+        </w:tc>
+        <w:tc>
+          <w:tcPr>
+            <w:tcW w:w="2977" w:type="dxa"/>
+          </w:tcPr>
+          <w:p>
+            <w:pPr>
+              <w:jc w:val="center"/>
+              <w:cnfStyle w:val="000000100000" w:firstRow="0" w:lastRow="0" w:firstColumn="0" w:lastColumn="0" w:oddVBand="0" w:evenVBand="0" w:oddHBand="1" w:evenHBand="0" w:firstRowFirstColumn="0" w:firstRowLastColumn="0" w:lastRowFirstColumn="0" w:lastRowLastColumn="0"/>
+            </w:pPr>
+            <w:r>
+              <w:t>1 121,15</w:t>
+            </w:r>
+          </w:p>
+        </w:tc>
+      </w:tr>
+      <w:tr>
+        <w:trPr>
+          <w:trHeight w:val="1797"/>
+        </w:trPr>
+        <w:tc>
+          <w:tcPr>
+            <w:cnfStyle w:val="001000000000" w:firstRow="0" w:lastRow="0" w:firstColumn="1" w:lastColumn="0" w:oddVBand="0" w:evenVBand="0" w:oddHBand="0" w:evenHBand="0" w:firstRowFirstColumn="0" w:firstRowLastColumn="0" w:lastRowFirstColumn="0" w:lastRowLastColumn="0"/>
+            <w:tcW w:w="2553" w:type="dxa"/>
+          </w:tcPr>
+          <w:p>
+            <w:r>
+              <w:t>Kit De Fer à Souder électrique Avec Outils, Pointes, Multimètre</w:t>
+            </w:r>
+          </w:p>
+        </w:tc>
+        <w:tc>
+          <w:tcPr>
+            <w:tcW w:w="1559" w:type="dxa"/>
+          </w:tcPr>
+          <w:p>
+            <w:pPr>
+              <w:jc w:val="center"/>
+              <w:cnfStyle w:val="000000000000" w:firstRow="0" w:lastRow="0" w:firstColumn="0" w:lastColumn="0" w:oddVBand="0" w:evenVBand="0" w:oddHBand="0" w:evenHBand="0" w:firstRowFirstColumn="0" w:firstRowLastColumn="0" w:lastRowFirstColumn="0" w:lastRowLastColumn="0"/>
+            </w:pPr>
+            <w:r>
+              <w:t>1</w:t>
+            </w:r>
+          </w:p>
+        </w:tc>
+        <w:tc>
+          <w:tcPr>
+            <w:tcW w:w="3685" w:type="dxa"/>
+          </w:tcPr>
+          <w:p>
+            <w:pPr>
+              <w:jc w:val="center"/>
+              <w:cnfStyle w:val="000000000000" w:firstRow="0" w:lastRow="0" w:firstColumn="0" w:lastColumn="0" w:oddVBand="0" w:evenVBand="0" w:oddHBand="0" w:evenHBand="0" w:firstRowFirstColumn="0" w:firstRowLastColumn="0" w:lastRowFirstColumn="0" w:lastRowLastColumn="0"/>
+            </w:pPr>
+            <w:r>
+              <w:t>12.600 fcfa</w:t>
+            </w:r>
+          </w:p>
+        </w:tc>
+        <w:tc>
+          <w:tcPr>
+            <w:tcW w:w="2977" w:type="dxa"/>
+          </w:tcPr>
+          <w:p>
+            <w:pPr>
+              <w:jc w:val="center"/>
+              <w:cnfStyle w:val="000000000000" w:firstRow="0" w:lastRow="0" w:firstColumn="0" w:lastColumn="0" w:oddVBand="0" w:evenVBand="0" w:oddHBand="0" w:evenHBand="0" w:firstRowFirstColumn="0" w:firstRowLastColumn="0" w:lastRowFirstColumn="0" w:lastRowLastColumn="0"/>
+            </w:pPr>
+            <w:r>
+              <w:t>12600</w:t>
+            </w:r>
+          </w:p>
+        </w:tc>
+      </w:tr>
+      <w:tr>
+        <w:trPr>
+          <w:cnfStyle w:val="000000100000" w:firstRow="0" w:lastRow="0" w:firstColumn="0" w:lastColumn="0" w:oddVBand="0" w:evenVBand="0" w:oddHBand="1" w:evenHBand="0" w:firstRowFirstColumn="0" w:firstRowLastColumn="0" w:lastRowFirstColumn="0" w:lastRowLastColumn="0"/>
+          <w:trHeight w:val="468"/>
+        </w:trPr>
+        <w:tc>
+          <w:tcPr>
+            <w:cnfStyle w:val="001000000000" w:firstRow="0" w:lastRow="0" w:firstColumn="1" w:lastColumn="0" w:oddVBand="0" w:evenVBand="0" w:oddHBand="0" w:evenHBand="0" w:firstRowFirstColumn="0" w:firstRowLastColumn="0" w:lastRowFirstColumn="0" w:lastRowLastColumn="0"/>
+            <w:tcW w:w="2553" w:type="dxa"/>
+          </w:tcPr>
+          <w:p>
+            <w:r>
+              <w:lastRenderedPageBreak/>
+              <w:t>Frais</w:t>
+            </w:r>
+            <w:r>
+              <w:t xml:space="preserve"> de livraison</w:t>
+            </w:r>
+          </w:p>
+        </w:tc>
+        <w:tc>
+          <w:tcPr>
+            <w:tcW w:w="1559" w:type="dxa"/>
+          </w:tcPr>
+          <w:p>
+            <w:pPr>
+              <w:jc w:val="center"/>
+              <w:cnfStyle w:val="000000100000" w:firstRow="0" w:lastRow="0" w:firstColumn="0" w:lastColumn="0" w:oddVBand="0" w:evenVBand="0" w:oddHBand="1" w:evenHBand="0" w:firstRowFirstColumn="0" w:firstRowLastColumn="0" w:lastRowFirstColumn="0" w:lastRowLastColumn="0"/>
+            </w:pPr>
+            <w:r>
+              <w:t>-</w:t>
+            </w:r>
+          </w:p>
+        </w:tc>
+        <w:tc>
+          <w:tcPr>
+            <w:tcW w:w="3685" w:type="dxa"/>
+          </w:tcPr>
+          <w:p>
+            <w:pPr>
+              <w:jc w:val="center"/>
+              <w:cnfStyle w:val="000000100000" w:firstRow="0" w:lastRow="0" w:firstColumn="0" w:lastColumn="0" w:oddVBand="0" w:evenVBand="0" w:oddHBand="1" w:evenHBand="0" w:firstRowFirstColumn="0" w:firstRowLastColumn="0" w:lastRowFirstColumn="0" w:lastRowLastColumn="0"/>
+            </w:pPr>
+            <w:r>
+              <w:t>-</w:t>
+            </w:r>
+          </w:p>
+        </w:tc>
+        <w:tc>
+          <w:tcPr>
+            <w:tcW w:w="2977" w:type="dxa"/>
+          </w:tcPr>
+          <w:p>
+            <w:pPr>
+              <w:jc w:val="center"/>
+              <w:cnfStyle w:val="000000100000" w:firstRow="0" w:lastRow="0" w:firstColumn="0" w:lastColumn="0" w:oddVBand="0" w:evenVBand="0" w:oddHBand="1" w:evenHBand="0" w:firstRowFirstColumn="0" w:firstRowLastColumn="0" w:lastRowFirstColumn="0" w:lastRowLastColumn="0"/>
+            </w:pPr>
+            <w:r>
+              <w:t>29 532,8</w:t>
+            </w:r>
+          </w:p>
+          <w:p>
+            <w:pPr>
+              <w:jc w:val="center"/>
+              <w:cnfStyle w:val="000000100000" w:firstRow="0" w:lastRow="0" w:firstColumn="0" w:lastColumn="0" w:oddVBand="0" w:evenVBand="0" w:oddHBand="1" w:evenHBand="0" w:firstRowFirstColumn="0" w:firstRowLastColumn="0" w:lastRowFirstColumn="0" w:lastRowLastColumn="0"/>
+            </w:pPr>
+          </w:p>
+        </w:tc>
+      </w:tr>
+      <w:tr>
+        <w:tc>
+          <w:tcPr>
+            <w:cnfStyle w:val="001000000000" w:firstRow="0" w:lastRow="0" w:firstColumn="1" w:lastColumn="0" w:oddVBand="0" w:evenVBand="0" w:oddHBand="0" w:evenHBand="0" w:firstRowFirstColumn="0" w:firstRowLastColumn="0" w:lastRowFirstColumn="0" w:lastRowLastColumn="0"/>
+            <w:tcW w:w="2553" w:type="dxa"/>
+          </w:tcPr>
+          <w:p>
+            <w:r>
+              <w:t>Coût Total</w:t>
+            </w:r>
+          </w:p>
+        </w:tc>
+        <w:tc>
+          <w:tcPr>
+            <w:tcW w:w="1559" w:type="dxa"/>
+          </w:tcPr>
+          <w:p>
+            <w:pPr>
+              <w:jc w:val="center"/>
+              <w:cnfStyle w:val="000000000000" w:firstRow="0" w:lastRow="0" w:firstColumn="0" w:lastColumn="0" w:oddVBand="0" w:evenVBand="0" w:oddHBand="0" w:evenHBand="0" w:firstRowFirstColumn="0" w:firstRowLastColumn="0" w:lastRowFirstColumn="0" w:lastRowLastColumn="0"/>
+            </w:pPr>
+            <w:r>
+              <w:t>-</w:t>
+            </w:r>
+          </w:p>
+        </w:tc>
+        <w:tc>
+          <w:tcPr>
+            <w:tcW w:w="3685" w:type="dxa"/>
+          </w:tcPr>
+          <w:p>
+            <w:pPr>
+              <w:jc w:val="center"/>
+              <w:cnfStyle w:val="000000000000" w:firstRow="0" w:lastRow="0" w:firstColumn="0" w:lastColumn="0" w:oddVBand="0" w:evenVBand="0" w:oddHBand="0" w:evenHBand="0" w:firstRowFirstColumn="0" w:firstRowLastColumn="0" w:lastRowFirstColumn="0" w:lastRowLastColumn="0"/>
+            </w:pPr>
+            <w:r>
+              <w:t>-</w:t>
+            </w:r>
+          </w:p>
+        </w:tc>
+        <w:tc>
+          <w:tcPr>
+            <w:tcW w:w="2977" w:type="dxa"/>
+          </w:tcPr>
+          <w:p>
+            <w:pPr>
+              <w:jc w:val="center"/>
+              <w:cnfStyle w:val="000000000000" w:firstRow="0" w:lastRow="0" w:firstColumn="0" w:lastColumn="0" w:oddVBand="0" w:evenVBand="0" w:oddHBand="0" w:evenHBand="0" w:firstRowFirstColumn="0" w:firstRowLastColumn="0" w:lastRowFirstColumn="0" w:lastRowLastColumn="0"/>
+              <w:rPr>
+                <w:b/>
+                <w:bCs/>
+              </w:rPr>
+            </w:pPr>
+            <w:r>
+              <w:rPr>
+                <w:b/>
+                <w:bCs/>
+              </w:rPr>
+              <w:t>65 069,22</w:t>
+            </w:r>
+          </w:p>
+        </w:tc>
+      </w:tr>
+    </w:tbl>
+    <w:p/>
+    <w:p>
+      <w:r>
+        <w:t xml:space="preserve">Initialement, l'architecture du projet intégrait </w:t>
+      </w:r>
+      <w:r>
+        <w:t>le</w:t>
+      </w:r>
+      <w:r>
+        <w:t xml:space="preserve"> module </w:t>
+      </w:r>
+      <w:r>
+        <w:rPr>
+          <w:b/>
+          <w:bCs/>
+          <w:i/>
+          <w:iCs/>
+        </w:rPr>
+        <w:t>HX711</w:t>
+      </w:r>
+      <w:r>
+        <w:t xml:space="preserve"> pour l'interface avec les capteurs de poids. Cependant, lors des phases de tests, ce composant a été écarté de la solution finale. En effet, nous avons constaté une instabilité significative des relevés incompatible avec la précision requise pour le monitoring fiable d'une bouteille de gaz. Bien que faisant partie des dépenses initiales, ce module n'a pas été intégré au prototype opérationnel</w:t>
+      </w:r>
+      <w:r>
+        <w:t xml:space="preserve"> d’où l’acquisition des </w:t>
+      </w:r>
+      <w:r>
+        <w:t>Capteurs de charge</w:t>
+      </w:r>
+      <w:r>
+        <w:t xml:space="preserve"> demi-pont</w:t>
+      </w:r>
+      <w:r>
+        <w:t xml:space="preserve"> ( 50kg).</w:t>
+      </w:r>
+    </w:p>
+    <w:p/>
+    <w:p/>
+    <w:p>
+      <w:r>
+        <w:t xml:space="preserve">En somme, cette étude financière </w:t>
+      </w:r>
+      <w:r>
+        <w:t>montre</w:t>
+      </w:r>
+      <w:r>
+        <w:t xml:space="preserve"> la faisabilité du projet, mais elle met surtout en lumière une condition indispensable pour sa réussite commerciale : la nécessité absolue de réduire les coûts unitaires. Pour que le modèle économique soit viable et le produit attractif sur le marché, le passage à une production à grande échelle est un impératif. Seule l'industrialisation, en éliminant les frais logistiques unitaires et en optimisant l'achat des composants, permettra d'atteindre un prix de vente compétitif, condition </w:t>
+      </w:r>
+      <w:r>
+        <w:rPr>
+          <w:i/>
+          <w:iCs/>
+        </w:rPr>
+        <w:t>sine qua non</w:t>
+      </w:r>
+      <w:r>
+        <w:t xml:space="preserve"> pour transformer ce prototype technique en un véritable succès commercial.</w:t>
+      </w:r>
+      <w:r>
+        <w:t xml:space="preserve"> </w:t>
+      </w:r>
+      <w:r>
+        <w:br w:type="page"/>
+      </w:r>
+    </w:p>
+    <w:p>
+      <w:pPr>
+        <w:pStyle w:val="Heading1"/>
+      </w:pPr>
+      <w:bookmarkStart w:id="91" w:name="_Toc212338057"/>
+      <w:bookmarkStart w:id="92" w:name="_Toc212338114"/>
+      <w:r>
+        <w:lastRenderedPageBreak/>
+        <w:t>Chapitre 5: Résultats et discussion</w:t>
+      </w:r>
+      <w:bookmarkEnd w:id="91"/>
+      <w:bookmarkEnd w:id="92"/>
+    </w:p>
+    <w:p>
+      <w:r>
+        <w:rPr>
+          <w:highlight w:val="yellow"/>
+        </w:rPr>
+        <w:t>Petite introduction</w:t>
+      </w:r>
+    </w:p>
+    <w:p/>
+    <w:p>
+      <w:pPr>
+        <w:pStyle w:val="Heading2"/>
+        <w:numPr>
+          <w:ilvl w:val="1"/>
+          <w:numId w:val="29"/>
+        </w:numPr>
+      </w:pPr>
+      <w:bookmarkStart w:id="93" w:name="_Toc212338058"/>
+      <w:bookmarkStart w:id="94" w:name="_Toc212338115"/>
+      <w:r>
+        <w:t>Présentation des résultats</w:t>
+      </w:r>
+      <w:bookmarkEnd w:id="93"/>
+      <w:bookmarkEnd w:id="94"/>
+    </w:p>
+    <w:p/>
+    <w:p/>
+    <w:p>
+      <w:pPr>
+        <w:pStyle w:val="Heading2"/>
+        <w:numPr>
+          <w:ilvl w:val="1"/>
+          <w:numId w:val="29"/>
+        </w:numPr>
+      </w:pPr>
+      <w:bookmarkStart w:id="95" w:name="_Toc212338059"/>
+      <w:bookmarkStart w:id="96" w:name="_Toc212338116"/>
+      <w:r>
+        <w:t>Recommandations</w:t>
+      </w:r>
+      <w:bookmarkEnd w:id="95"/>
+      <w:bookmarkEnd w:id="96"/>
     </w:p>
     <w:p/>
     <w:p/>
     <w:p/>
-    <w:p/>
-    <w:p/>
     <w:p>
       <w:pPr>
         <w:pStyle w:val="Heading2"/>
         <w:numPr>
           <w:ilvl w:val="1"/>
-          <w:numId w:val="27"/>
+          <w:numId w:val="29"/>
         </w:numPr>
       </w:pPr>
-      <w:bookmarkStart w:id="87" w:name="_Toc212338055"/>
-      <w:bookmarkStart w:id="88" w:name="_Toc212338112"/>
-      <w:r>
-        <w:t>Procédure</w:t>
-      </w:r>
-      <w:bookmarkEnd w:id="87"/>
-      <w:bookmarkEnd w:id="88"/>
+      <w:bookmarkStart w:id="97" w:name="_Toc212338060"/>
+      <w:bookmarkStart w:id="98" w:name="_Toc212338117"/>
+      <w:r>
+        <w:t>É</w:t>
+      </w:r>
+      <w:r>
+        <w:t>tude comparative</w:t>
+      </w:r>
+      <w:bookmarkEnd w:id="97"/>
+      <w:bookmarkEnd w:id="98"/>
+    </w:p>
+    <w:p/>
+    <w:p/>
+    <w:p/>
+    <w:p>
+      <w:pPr>
+        <w:pStyle w:val="Heading2"/>
+        <w:numPr>
+          <w:ilvl w:val="1"/>
+          <w:numId w:val="29"/>
+        </w:numPr>
+      </w:pPr>
+      <w:bookmarkStart w:id="99" w:name="_Toc212338061"/>
+      <w:bookmarkStart w:id="100" w:name="_Toc212338118"/>
+      <w:r>
+        <w:t>Impacts potentiels</w:t>
+      </w:r>
+      <w:bookmarkEnd w:id="99"/>
+      <w:bookmarkEnd w:id="100"/>
     </w:p>
     <w:p/>
     <w:p/>
@@ -11304,181 +12786,41 @@
     <w:p/>
     <w:p/>
     <w:p>
-      <w:pPr>
-        <w:pStyle w:val="Heading2"/>
-        <w:numPr>
-          <w:ilvl w:val="1"/>
-          <w:numId w:val="27"/>
-        </w:numPr>
-      </w:pPr>
-      <w:bookmarkStart w:id="89" w:name="_Toc212338056"/>
-      <w:bookmarkStart w:id="90" w:name="_Toc212338113"/>
-      <w:r>
-        <w:t>Ét</w:t>
-      </w:r>
-      <w:r>
-        <w:t>ude de co</w:t>
-      </w:r>
-      <w:r>
-        <w:t>û</w:t>
-      </w:r>
-      <w:r>
-        <w:t>t</w:t>
-      </w:r>
-      <w:bookmarkEnd w:id="89"/>
-      <w:bookmarkEnd w:id="90"/>
+      <w:r>
+        <w:rPr>
+          <w:highlight w:val="yellow"/>
+        </w:rPr>
+        <w:t>Petite conclusion</w:t>
+      </w:r>
+    </w:p>
+    <w:p/>
+    <w:p>
+      <w:r>
+        <w:br w:type="page"/>
+      </w:r>
+    </w:p>
+    <w:p>
+      <w:pPr>
+        <w:pStyle w:val="Heading1"/>
+      </w:pPr>
+      <w:bookmarkStart w:id="101" w:name="_Toc212338062"/>
+      <w:bookmarkStart w:id="102" w:name="_Toc212338119"/>
+      <w:r>
+        <w:lastRenderedPageBreak/>
+        <w:t>C</w:t>
+      </w:r>
+      <w:r>
+        <w:t>onclusion</w:t>
+      </w:r>
+      <w:bookmarkEnd w:id="101"/>
+      <w:bookmarkEnd w:id="102"/>
     </w:p>
     <w:p/>
     <w:p/>
     <w:p>
-      <w:r>
-        <w:rPr>
-          <w:highlight w:val="yellow"/>
-        </w:rPr>
-        <w:t>Petite conclusion</w:t>
-      </w:r>
-    </w:p>
-    <w:p>
-      <w:r>
-        <w:br w:type="page"/>
-      </w:r>
-    </w:p>
-    <w:p>
-      <w:pPr>
-        <w:pStyle w:val="Heading1"/>
-      </w:pPr>
-      <w:bookmarkStart w:id="91" w:name="_Toc212338057"/>
-      <w:bookmarkStart w:id="92" w:name="_Toc212338114"/>
-      <w:r>
-        <w:lastRenderedPageBreak/>
-        <w:t>Chapitre 5: Résultats et discussion</w:t>
-      </w:r>
-      <w:bookmarkEnd w:id="91"/>
-      <w:bookmarkEnd w:id="92"/>
-    </w:p>
-    <w:p>
-      <w:r>
-        <w:rPr>
-          <w:highlight w:val="yellow"/>
-        </w:rPr>
-        <w:t>Petite introduction</w:t>
-      </w:r>
-    </w:p>
-    <w:p/>
-    <w:p>
-      <w:pPr>
-        <w:pStyle w:val="Heading2"/>
-        <w:numPr>
-          <w:ilvl w:val="1"/>
-          <w:numId w:val="29"/>
-        </w:numPr>
-      </w:pPr>
-      <w:bookmarkStart w:id="93" w:name="_Toc212338058"/>
-      <w:bookmarkStart w:id="94" w:name="_Toc212338115"/>
-      <w:r>
-        <w:t>Présentation des résultats</w:t>
-      </w:r>
-      <w:bookmarkEnd w:id="93"/>
-      <w:bookmarkEnd w:id="94"/>
-    </w:p>
-    <w:p/>
-    <w:p/>
-    <w:p>
-      <w:pPr>
-        <w:pStyle w:val="Heading2"/>
-        <w:numPr>
-          <w:ilvl w:val="1"/>
-          <w:numId w:val="29"/>
-        </w:numPr>
-      </w:pPr>
-      <w:bookmarkStart w:id="95" w:name="_Toc212338059"/>
-      <w:bookmarkStart w:id="96" w:name="_Toc212338116"/>
-      <w:r>
-        <w:t>Recommandations</w:t>
-      </w:r>
-      <w:bookmarkEnd w:id="95"/>
-      <w:bookmarkEnd w:id="96"/>
-    </w:p>
-    <w:p/>
-    <w:p/>
-    <w:p/>
-    <w:p>
-      <w:pPr>
-        <w:pStyle w:val="Heading2"/>
-        <w:numPr>
-          <w:ilvl w:val="1"/>
-          <w:numId w:val="29"/>
-        </w:numPr>
-      </w:pPr>
-      <w:bookmarkStart w:id="97" w:name="_Toc212338060"/>
-      <w:bookmarkStart w:id="98" w:name="_Toc212338117"/>
-      <w:r>
-        <w:t>Etude comparative</w:t>
-      </w:r>
-      <w:bookmarkEnd w:id="97"/>
-      <w:bookmarkEnd w:id="98"/>
-    </w:p>
-    <w:p/>
-    <w:p/>
-    <w:p/>
-    <w:p>
-      <w:pPr>
-        <w:pStyle w:val="Heading2"/>
-        <w:numPr>
-          <w:ilvl w:val="1"/>
-          <w:numId w:val="29"/>
-        </w:numPr>
-      </w:pPr>
-      <w:bookmarkStart w:id="99" w:name="_Toc212338061"/>
-      <w:bookmarkStart w:id="100" w:name="_Toc212338118"/>
-      <w:r>
-        <w:t>Impacts potentiels</w:t>
-      </w:r>
-      <w:bookmarkEnd w:id="99"/>
-      <w:bookmarkEnd w:id="100"/>
-    </w:p>
-    <w:p/>
-    <w:p/>
-    <w:p/>
-    <w:p/>
-    <w:p/>
-    <w:p/>
-    <w:p>
-      <w:r>
-        <w:rPr>
-          <w:highlight w:val="yellow"/>
-        </w:rPr>
-        <w:t>Petite conclusion</w:t>
-      </w:r>
-    </w:p>
-    <w:p/>
-    <w:p>
-      <w:r>
-        <w:br w:type="page"/>
-      </w:r>
-    </w:p>
-    <w:p>
-      <w:pPr>
-        <w:pStyle w:val="Heading1"/>
-      </w:pPr>
-      <w:bookmarkStart w:id="101" w:name="_Toc212338062"/>
-      <w:bookmarkStart w:id="102" w:name="_Toc212338119"/>
-      <w:r>
-        <w:lastRenderedPageBreak/>
-        <w:t>C</w:t>
-      </w:r>
-      <w:r>
-        <w:t>onclusion</w:t>
-      </w:r>
-      <w:bookmarkEnd w:id="101"/>
-      <w:bookmarkEnd w:id="102"/>
-    </w:p>
-    <w:p/>
-    <w:p/>
-    <w:p>
       <w:pPr>
         <w:sectPr>
-          <w:footerReference w:type="default" r:id="rId24"/>
+          <w:footerReference w:type="default" r:id="rId33"/>
           <w:pgSz w:w="12240" w:h="15840"/>
           <w:pgMar w:top="1134" w:right="1134" w:bottom="1134" w:left="1701" w:header="709" w:footer="737" w:gutter="0"/>
           <w:pgNumType w:start="1"/>
@@ -11752,7 +13094,7 @@
           <w:numId w:val="16"/>
         </w:numPr>
       </w:pPr>
-      <w:hyperlink r:id="rId25" w:history="1">
+      <w:hyperlink r:id="rId34" w:history="1">
         <w:r>
           <w:rPr>
             <w:rStyle w:val="Hyperlink"/>
@@ -11776,7 +13118,7 @@
           <w:numId w:val="16"/>
         </w:numPr>
       </w:pPr>
-      <w:hyperlink r:id="rId26" w:history="1">
+      <w:hyperlink r:id="rId35" w:history="1">
         <w:r>
           <w:rPr>
             <w:rStyle w:val="Hyperlink"/>
@@ -11800,7 +13142,7 @@
           <w:numId w:val="16"/>
         </w:numPr>
       </w:pPr>
-      <w:hyperlink r:id="rId27" w:anchor=":~:text=Le" w:history="1">
+      <w:hyperlink r:id="rId36" w:anchor=":~:text=Le" w:history="1">
         <w:r>
           <w:rPr>
             <w:rStyle w:val="Hyperlink"/>
@@ -11824,7 +13166,7 @@
           <w:numId w:val="16"/>
         </w:numPr>
       </w:pPr>
-      <w:hyperlink r:id="rId28" w:history="1">
+      <w:hyperlink r:id="rId37" w:history="1">
         <w:r>
           <w:rPr>
             <w:rStyle w:val="Hyperlink"/>
@@ -11848,7 +13190,7 @@
           <w:numId w:val="16"/>
         </w:numPr>
       </w:pPr>
-      <w:hyperlink r:id="rId29" w:history="1">
+      <w:hyperlink r:id="rId38" w:history="1">
         <w:r>
           <w:rPr>
             <w:rStyle w:val="Hyperlink"/>
@@ -11872,7 +13214,7 @@
           <w:numId w:val="16"/>
         </w:numPr>
       </w:pPr>
-      <w:hyperlink r:id="rId30" w:history="1">
+      <w:hyperlink r:id="rId39" w:history="1">
         <w:r>
           <w:rPr>
             <w:rStyle w:val="Hyperlink"/>
@@ -11896,7 +13238,7 @@
           <w:numId w:val="16"/>
         </w:numPr>
       </w:pPr>
-      <w:hyperlink r:id="rId31" w:history="1">
+      <w:hyperlink r:id="rId40" w:history="1">
         <w:r>
           <w:rPr>
             <w:rStyle w:val="Hyperlink"/>
@@ -11920,7 +13262,7 @@
           <w:numId w:val="16"/>
         </w:numPr>
       </w:pPr>
-      <w:hyperlink r:id="rId32" w:history="1">
+      <w:hyperlink r:id="rId41" w:history="1">
         <w:r>
           <w:rPr>
             <w:rStyle w:val="Hyperlink"/>
@@ -11944,7 +13286,7 @@
           <w:numId w:val="16"/>
         </w:numPr>
       </w:pPr>
-      <w:hyperlink r:id="rId33" w:history="1">
+      <w:hyperlink r:id="rId42" w:history="1">
         <w:r>
           <w:rPr>
             <w:rStyle w:val="Hyperlink"/>
@@ -17264,7 +18606,7 @@
     <w:p>
       <w:pPr>
         <w:sectPr>
-          <w:footerReference w:type="default" r:id="rId34"/>
+          <w:footerReference w:type="default" r:id="rId43"/>
           <w:pgSz w:w="12240" w:h="15840"/>
           <w:pgMar w:top="1134" w:right="1134" w:bottom="1134" w:left="1701" w:header="709" w:footer="709" w:gutter="0"/>
           <w:pgNumType w:fmt="upperRoman" w:start="1"/>
@@ -17307,8 +18649,8 @@
     <w:p/>
     <w:p/>
     <w:sectPr>
-      <w:headerReference w:type="default" r:id="rId35"/>
-      <w:footerReference w:type="default" r:id="rId36"/>
+      <w:headerReference w:type="default" r:id="rId44"/>
+      <w:footerReference w:type="default" r:id="rId45"/>
       <w:pgSz w:w="12240" w:h="15840"/>
       <w:pgMar w:top="1134" w:right="1134" w:bottom="1134" w:left="1701" w:header="709" w:footer="709" w:gutter="0"/>
       <w:pgNumType w:fmt="upperRoman" w:start="1"/>
@@ -18242,7 +19584,7 @@
         <w:rFonts w:ascii="Franklin Gothic Book" w:hAnsi="Franklin Gothic Book"/>
         <w:b/>
       </w:rPr>
-      <w:pict w14:anchorId="30C4C4EF">
+      <w:pict w14:anchorId="3DF5530B">
         <v:shapetype id="_x0000_t75" coordsize="21600,21600" o:spt="75" o:preferrelative="t" path="m@4@5l@4@11@9@11@9@5xe" filled="f" stroked="f">
           <v:stroke joinstyle="miter"/>
           <v:formulas>
@@ -18385,7 +19727,7 @@
         <w:lang w:eastAsia="fr-FR"/>
         <w14:ligatures w14:val="standardContextual"/>
       </w:rPr>
-      <w:pict w14:anchorId="5F8FE76C">
+      <w:pict w14:anchorId="5387F5EB">
         <v:shapetype id="_x0000_t75" coordsize="21600,21600" o:spt="75" o:preferrelative="t" path="m@4@5l@4@11@9@11@9@5xe" filled="f" stroked="f">
           <v:stroke joinstyle="miter"/>
           <v:formulas>
@@ -20224,6 +21566,119 @@
     </w:lvl>
   </w:abstractNum>
   <w:abstractNum w:abstractNumId="17" w15:restartNumberingAfterBreak="0">
+    <w:nsid w:val="428A7646"/>
+    <w:multiLevelType w:val="multilevel"/>
+    <w:tmpl w:val="762A8762"/>
+    <w:lvl w:ilvl="0">
+      <w:start w:val="4"/>
+      <w:numFmt w:val="decimal"/>
+      <w:lvlText w:val="%1."/>
+      <w:lvlJc w:val="left"/>
+      <w:pPr>
+        <w:ind w:left="450" w:hanging="450"/>
+      </w:pPr>
+      <w:rPr>
+        <w:rFonts w:hint="default"/>
+      </w:rPr>
+    </w:lvl>
+    <w:lvl w:ilvl="1">
+      <w:start w:val="1"/>
+      <w:numFmt w:val="decimal"/>
+      <w:lvlText w:val="%1.%2."/>
+      <w:lvlJc w:val="left"/>
+      <w:pPr>
+        <w:ind w:left="1080" w:hanging="720"/>
+      </w:pPr>
+      <w:rPr>
+        <w:rFonts w:hint="default"/>
+      </w:rPr>
+    </w:lvl>
+    <w:lvl w:ilvl="2">
+      <w:start w:val="1"/>
+      <w:numFmt w:val="decimal"/>
+      <w:lvlText w:val="%1.%2.%3."/>
+      <w:lvlJc w:val="left"/>
+      <w:pPr>
+        <w:ind w:left="1440" w:hanging="720"/>
+      </w:pPr>
+      <w:rPr>
+        <w:rFonts w:hint="default"/>
+      </w:rPr>
+    </w:lvl>
+    <w:lvl w:ilvl="3">
+      <w:start w:val="1"/>
+      <w:numFmt w:val="decimal"/>
+      <w:lvlText w:val="%1.%2.%3.%4."/>
+      <w:lvlJc w:val="left"/>
+      <w:pPr>
+        <w:ind w:left="2160" w:hanging="1080"/>
+      </w:pPr>
+      <w:rPr>
+        <w:rFonts w:hint="default"/>
+      </w:rPr>
+    </w:lvl>
+    <w:lvl w:ilvl="4">
+      <w:start w:val="1"/>
+      <w:numFmt w:val="decimal"/>
+      <w:lvlText w:val="%1.%2.%3.%4.%5."/>
+      <w:lvlJc w:val="left"/>
+      <w:pPr>
+        <w:ind w:left="2520" w:hanging="1080"/>
+      </w:pPr>
+      <w:rPr>
+        <w:rFonts w:hint="default"/>
+      </w:rPr>
+    </w:lvl>
+    <w:lvl w:ilvl="5">
+      <w:start w:val="1"/>
+      <w:numFmt w:val="decimal"/>
+      <w:lvlText w:val="%1.%2.%3.%4.%5.%6."/>
+      <w:lvlJc w:val="left"/>
+      <w:pPr>
+        <w:ind w:left="3240" w:hanging="1440"/>
+      </w:pPr>
+      <w:rPr>
+        <w:rFonts w:hint="default"/>
+      </w:rPr>
+    </w:lvl>
+    <w:lvl w:ilvl="6">
+      <w:start w:val="1"/>
+      <w:numFmt w:val="decimal"/>
+      <w:lvlText w:val="%1.%2.%3.%4.%5.%6.%7."/>
+      <w:lvlJc w:val="left"/>
+      <w:pPr>
+        <w:ind w:left="3960" w:hanging="1800"/>
+      </w:pPr>
+      <w:rPr>
+        <w:rFonts w:hint="default"/>
+      </w:rPr>
+    </w:lvl>
+    <w:lvl w:ilvl="7">
+      <w:start w:val="1"/>
+      <w:numFmt w:val="decimal"/>
+      <w:lvlText w:val="%1.%2.%3.%4.%5.%6.%7.%8."/>
+      <w:lvlJc w:val="left"/>
+      <w:pPr>
+        <w:ind w:left="4320" w:hanging="1800"/>
+      </w:pPr>
+      <w:rPr>
+        <w:rFonts w:hint="default"/>
+      </w:rPr>
+    </w:lvl>
+    <w:lvl w:ilvl="8">
+      <w:start w:val="1"/>
+      <w:numFmt w:val="decimal"/>
+      <w:lvlText w:val="%1.%2.%3.%4.%5.%6.%7.%8.%9."/>
+      <w:lvlJc w:val="left"/>
+      <w:pPr>
+        <w:ind w:left="5040" w:hanging="2160"/>
+      </w:pPr>
+      <w:rPr>
+        <w:rFonts w:hint="default"/>
+      </w:rPr>
+    </w:lvl>
+  </w:abstractNum>
+  <w:abstractNum w:abstractNumId="18" w15:restartNumberingAfterBreak="0">
     <w:nsid w:val="43880818"/>
     <w:multiLevelType w:val="multilevel"/>
     <w:tmpl w:val="845644D6"/>
@@ -20336,7 +21791,120 @@
       </w:rPr>
     </w:lvl>
   </w:abstractNum>
-  <w:abstractNum w:abstractNumId="18" w15:restartNumberingAfterBreak="0">
+  <w:abstractNum w:abstractNumId="19" w15:restartNumberingAfterBreak="0">
+    <w:nsid w:val="46031F92"/>
+    <w:multiLevelType w:val="multilevel"/>
+    <w:tmpl w:val="762A8762"/>
+    <w:lvl w:ilvl="0">
+      <w:start w:val="4"/>
+      <w:numFmt w:val="decimal"/>
+      <w:lvlText w:val="%1."/>
+      <w:lvlJc w:val="left"/>
+      <w:pPr>
+        <w:ind w:left="450" w:hanging="450"/>
+      </w:pPr>
+      <w:rPr>
+        <w:rFonts w:hint="default"/>
+      </w:rPr>
+    </w:lvl>
+    <w:lvl w:ilvl="1">
+      <w:start w:val="1"/>
+      <w:numFmt w:val="decimal"/>
+      <w:lvlText w:val="%1.%2."/>
+      <w:lvlJc w:val="left"/>
+      <w:pPr>
+        <w:ind w:left="1080" w:hanging="720"/>
+      </w:pPr>
+      <w:rPr>
+        <w:rFonts w:hint="default"/>
+      </w:rPr>
+    </w:lvl>
+    <w:lvl w:ilvl="2">
+      <w:start w:val="1"/>
+      <w:numFmt w:val="decimal"/>
+      <w:lvlText w:val="%1.%2.%3."/>
+      <w:lvlJc w:val="left"/>
+      <w:pPr>
+        <w:ind w:left="1440" w:hanging="720"/>
+      </w:pPr>
+      <w:rPr>
+        <w:rFonts w:hint="default"/>
+      </w:rPr>
+    </w:lvl>
+    <w:lvl w:ilvl="3">
+      <w:start w:val="1"/>
+      <w:numFmt w:val="decimal"/>
+      <w:lvlText w:val="%1.%2.%3.%4."/>
+      <w:lvlJc w:val="left"/>
+      <w:pPr>
+        <w:ind w:left="2160" w:hanging="1080"/>
+      </w:pPr>
+      <w:rPr>
+        <w:rFonts w:hint="default"/>
+      </w:rPr>
+    </w:lvl>
+    <w:lvl w:ilvl="4">
+      <w:start w:val="1"/>
+      <w:numFmt w:val="decimal"/>
+      <w:lvlText w:val="%1.%2.%3.%4.%5."/>
+      <w:lvlJc w:val="left"/>
+      <w:pPr>
+        <w:ind w:left="2520" w:hanging="1080"/>
+      </w:pPr>
+      <w:rPr>
+        <w:rFonts w:hint="default"/>
+      </w:rPr>
+    </w:lvl>
+    <w:lvl w:ilvl="5">
+      <w:start w:val="1"/>
+      <w:numFmt w:val="decimal"/>
+      <w:lvlText w:val="%1.%2.%3.%4.%5.%6."/>
+      <w:lvlJc w:val="left"/>
+      <w:pPr>
+        <w:ind w:left="3240" w:hanging="1440"/>
+      </w:pPr>
+      <w:rPr>
+        <w:rFonts w:hint="default"/>
+      </w:rPr>
+    </w:lvl>
+    <w:lvl w:ilvl="6">
+      <w:start w:val="1"/>
+      <w:numFmt w:val="decimal"/>
+      <w:lvlText w:val="%1.%2.%3.%4.%5.%6.%7."/>
+      <w:lvlJc w:val="left"/>
+      <w:pPr>
+        <w:ind w:left="3960" w:hanging="1800"/>
+      </w:pPr>
+      <w:rPr>
+        <w:rFonts w:hint="default"/>
+      </w:rPr>
+    </w:lvl>
+    <w:lvl w:ilvl="7">
+      <w:start w:val="1"/>
+      <w:numFmt w:val="decimal"/>
+      <w:lvlText w:val="%1.%2.%3.%4.%5.%6.%7.%8."/>
+      <w:lvlJc w:val="left"/>
+      <w:pPr>
+        <w:ind w:left="4320" w:hanging="1800"/>
+      </w:pPr>
+      <w:rPr>
+        <w:rFonts w:hint="default"/>
+      </w:rPr>
+    </w:lvl>
+    <w:lvl w:ilvl="8">
+      <w:start w:val="1"/>
+      <w:numFmt w:val="decimal"/>
+      <w:lvlText w:val="%1.%2.%3.%4.%5.%6.%7.%8.%9."/>
+      <w:lvlJc w:val="left"/>
+      <w:pPr>
+        <w:ind w:left="5040" w:hanging="2160"/>
+      </w:pPr>
+      <w:rPr>
+        <w:rFonts w:hint="default"/>
+      </w:rPr>
+    </w:lvl>
+  </w:abstractNum>
+  <w:abstractNum w:abstractNumId="20" w15:restartNumberingAfterBreak="0">
     <w:nsid w:val="46E04464"/>
     <w:multiLevelType w:val="multilevel"/>
     <w:tmpl w:val="762A8762"/>
@@ -20449,7 +22017,7 @@
       </w:rPr>
     </w:lvl>
   </w:abstractNum>
-  <w:abstractNum w:abstractNumId="19" w15:restartNumberingAfterBreak="0">
+  <w:abstractNum w:abstractNumId="21" w15:restartNumberingAfterBreak="0">
     <w:nsid w:val="4B9567BB"/>
     <w:multiLevelType w:val="multilevel"/>
     <w:tmpl w:val="762A8762"/>
@@ -20562,7 +22130,7 @@
       </w:rPr>
     </w:lvl>
   </w:abstractNum>
-  <w:abstractNum w:abstractNumId="20" w15:restartNumberingAfterBreak="0">
+  <w:abstractNum w:abstractNumId="22" w15:restartNumberingAfterBreak="0">
     <w:nsid w:val="4EF8522C"/>
     <w:multiLevelType w:val="hybridMultilevel"/>
     <w:tmpl w:val="3B50F2A4"/>
@@ -20651,7 +22219,7 @@
       </w:pPr>
     </w:lvl>
   </w:abstractNum>
-  <w:abstractNum w:abstractNumId="21" w15:restartNumberingAfterBreak="0">
+  <w:abstractNum w:abstractNumId="23" w15:restartNumberingAfterBreak="0">
     <w:nsid w:val="4F6A5B7D"/>
     <w:multiLevelType w:val="hybridMultilevel"/>
     <w:tmpl w:val="61460E82"/>
@@ -20764,7 +22332,7 @@
       </w:rPr>
     </w:lvl>
   </w:abstractNum>
-  <w:abstractNum w:abstractNumId="22" w15:restartNumberingAfterBreak="0">
+  <w:abstractNum w:abstractNumId="24" w15:restartNumberingAfterBreak="0">
     <w:nsid w:val="52956CF8"/>
     <w:multiLevelType w:val="multilevel"/>
     <w:tmpl w:val="5150F3B8"/>
@@ -20877,7 +22445,7 @@
       </w:rPr>
     </w:lvl>
   </w:abstractNum>
-  <w:abstractNum w:abstractNumId="23" w15:restartNumberingAfterBreak="0">
+  <w:abstractNum w:abstractNumId="25" w15:restartNumberingAfterBreak="0">
     <w:nsid w:val="56B400DF"/>
     <w:multiLevelType w:val="multilevel"/>
     <w:tmpl w:val="762A8762"/>
@@ -20990,7 +22558,7 @@
       </w:rPr>
     </w:lvl>
   </w:abstractNum>
-  <w:abstractNum w:abstractNumId="24" w15:restartNumberingAfterBreak="0">
+  <w:abstractNum w:abstractNumId="26" w15:restartNumberingAfterBreak="0">
     <w:nsid w:val="57B15B75"/>
     <w:multiLevelType w:val="hybridMultilevel"/>
     <w:tmpl w:val="BC267198"/>
@@ -21079,7 +22647,7 @@
       </w:pPr>
     </w:lvl>
   </w:abstractNum>
-  <w:abstractNum w:abstractNumId="25" w15:restartNumberingAfterBreak="0">
+  <w:abstractNum w:abstractNumId="27" w15:restartNumberingAfterBreak="0">
     <w:nsid w:val="5927052A"/>
     <w:multiLevelType w:val="hybridMultilevel"/>
     <w:tmpl w:val="0448BE60"/>
@@ -21168,7 +22736,7 @@
       </w:pPr>
     </w:lvl>
   </w:abstractNum>
-  <w:abstractNum w:abstractNumId="26" w15:restartNumberingAfterBreak="0">
+  <w:abstractNum w:abstractNumId="28" w15:restartNumberingAfterBreak="0">
     <w:nsid w:val="5A9E1B1F"/>
     <w:multiLevelType w:val="hybridMultilevel"/>
     <w:tmpl w:val="6FA6C4B8"/>
@@ -21257,7 +22825,7 @@
       </w:pPr>
     </w:lvl>
   </w:abstractNum>
-  <w:abstractNum w:abstractNumId="27" w15:restartNumberingAfterBreak="0">
+  <w:abstractNum w:abstractNumId="29" w15:restartNumberingAfterBreak="0">
     <w:nsid w:val="604628AB"/>
     <w:multiLevelType w:val="hybridMultilevel"/>
     <w:tmpl w:val="BA525070"/>
@@ -21346,7 +22914,7 @@
       </w:pPr>
     </w:lvl>
   </w:abstractNum>
-  <w:abstractNum w:abstractNumId="28" w15:restartNumberingAfterBreak="0">
+  <w:abstractNum w:abstractNumId="30" w15:restartNumberingAfterBreak="0">
     <w:nsid w:val="65B067DA"/>
     <w:multiLevelType w:val="hybridMultilevel"/>
     <w:tmpl w:val="B7107D1C"/>
@@ -21435,7 +23003,7 @@
       </w:pPr>
     </w:lvl>
   </w:abstractNum>
-  <w:abstractNum w:abstractNumId="29" w15:restartNumberingAfterBreak="0">
+  <w:abstractNum w:abstractNumId="31" w15:restartNumberingAfterBreak="0">
     <w:nsid w:val="6EC1333F"/>
     <w:multiLevelType w:val="multilevel"/>
     <w:tmpl w:val="762A8762"/>
@@ -21548,7 +23116,120 @@
       </w:rPr>
     </w:lvl>
   </w:abstractNum>
-  <w:abstractNum w:abstractNumId="30" w15:restartNumberingAfterBreak="0">
+  <w:abstractNum w:abstractNumId="32" w15:restartNumberingAfterBreak="0">
+    <w:nsid w:val="6F060FA7"/>
+    <w:multiLevelType w:val="multilevel"/>
+    <w:tmpl w:val="762A8762"/>
+    <w:lvl w:ilvl="0">
+      <w:start w:val="4"/>
+      <w:numFmt w:val="decimal"/>
+      <w:lvlText w:val="%1."/>
+      <w:lvlJc w:val="left"/>
+      <w:pPr>
+        <w:ind w:left="450" w:hanging="450"/>
+      </w:pPr>
+      <w:rPr>
+        <w:rFonts w:hint="default"/>
+      </w:rPr>
+    </w:lvl>
+    <w:lvl w:ilvl="1">
+      <w:start w:val="1"/>
+      <w:numFmt w:val="decimal"/>
+      <w:lvlText w:val="%1.%2."/>
+      <w:lvlJc w:val="left"/>
+      <w:pPr>
+        <w:ind w:left="1080" w:hanging="720"/>
+      </w:pPr>
+      <w:rPr>
+        <w:rFonts w:hint="default"/>
+      </w:rPr>
+    </w:lvl>
+    <w:lvl w:ilvl="2">
+      <w:start w:val="1"/>
+      <w:numFmt w:val="decimal"/>
+      <w:lvlText w:val="%1.%2.%3."/>
+      <w:lvlJc w:val="left"/>
+      <w:pPr>
+        <w:ind w:left="1440" w:hanging="720"/>
+      </w:pPr>
+      <w:rPr>
+        <w:rFonts w:hint="default"/>
+      </w:rPr>
+    </w:lvl>
+    <w:lvl w:ilvl="3">
+      <w:start w:val="1"/>
+      <w:numFmt w:val="decimal"/>
+      <w:lvlText w:val="%1.%2.%3.%4."/>
+      <w:lvlJc w:val="left"/>
+      <w:pPr>
+        <w:ind w:left="2160" w:hanging="1080"/>
+      </w:pPr>
+      <w:rPr>
+        <w:rFonts w:hint="default"/>
+      </w:rPr>
+    </w:lvl>
+    <w:lvl w:ilvl="4">
+      <w:start w:val="1"/>
+      <w:numFmt w:val="decimal"/>
+      <w:lvlText w:val="%1.%2.%3.%4.%5."/>
+      <w:lvlJc w:val="left"/>
+      <w:pPr>
+        <w:ind w:left="2520" w:hanging="1080"/>
+      </w:pPr>
+      <w:rPr>
+        <w:rFonts w:hint="default"/>
+      </w:rPr>
+    </w:lvl>
+    <w:lvl w:ilvl="5">
+      <w:start w:val="1"/>
+      <w:numFmt w:val="decimal"/>
+      <w:lvlText w:val="%1.%2.%3.%4.%5.%6."/>
+      <w:lvlJc w:val="left"/>
+      <w:pPr>
+        <w:ind w:left="3240" w:hanging="1440"/>
+      </w:pPr>
+      <w:rPr>
+        <w:rFonts w:hint="default"/>
+      </w:rPr>
+    </w:lvl>
+    <w:lvl w:ilvl="6">
+      <w:start w:val="1"/>
+      <w:numFmt w:val="decimal"/>
+      <w:lvlText w:val="%1.%2.%3.%4.%5.%6.%7."/>
+      <w:lvlJc w:val="left"/>
+      <w:pPr>
+        <w:ind w:left="3960" w:hanging="1800"/>
+      </w:pPr>
+      <w:rPr>
+        <w:rFonts w:hint="default"/>
+      </w:rPr>
+    </w:lvl>
+    <w:lvl w:ilvl="7">
+      <w:start w:val="1"/>
+      <w:numFmt w:val="decimal"/>
+      <w:lvlText w:val="%1.%2.%3.%4.%5.%6.%7.%8."/>
+      <w:lvlJc w:val="left"/>
+      <w:pPr>
+        <w:ind w:left="4320" w:hanging="1800"/>
+      </w:pPr>
+      <w:rPr>
+        <w:rFonts w:hint="default"/>
+      </w:rPr>
+    </w:lvl>
+    <w:lvl w:ilvl="8">
+      <w:start w:val="1"/>
+      <w:numFmt w:val="decimal"/>
+      <w:lvlText w:val="%1.%2.%3.%4.%5.%6.%7.%8.%9."/>
+      <w:lvlJc w:val="left"/>
+      <w:pPr>
+        <w:ind w:left="5040" w:hanging="2160"/>
+      </w:pPr>
+      <w:rPr>
+        <w:rFonts w:hint="default"/>
+      </w:rPr>
+    </w:lvl>
+  </w:abstractNum>
+  <w:abstractNum w:abstractNumId="33" w15:restartNumberingAfterBreak="0">
     <w:nsid w:val="73BD6926"/>
     <w:multiLevelType w:val="hybridMultilevel"/>
     <w:tmpl w:val="46323FEC"/>
@@ -21637,7 +23318,7 @@
       </w:pPr>
     </w:lvl>
   </w:abstractNum>
-  <w:abstractNum w:abstractNumId="31" w15:restartNumberingAfterBreak="0">
+  <w:abstractNum w:abstractNumId="34" w15:restartNumberingAfterBreak="0">
     <w:nsid w:val="76A31DFE"/>
     <w:multiLevelType w:val="hybridMultilevel"/>
     <w:tmpl w:val="4C6051F0"/>
@@ -21727,10 +23408,10 @@
     </w:lvl>
   </w:abstractNum>
   <w:num w:numId="1" w16cid:durableId="418523224">
-    <w:abstractNumId w:val="29"/>
+    <w:abstractNumId w:val="31"/>
   </w:num>
   <w:num w:numId="2" w16cid:durableId="1491360520">
-    <w:abstractNumId w:val="17"/>
+    <w:abstractNumId w:val="18"/>
   </w:num>
   <w:num w:numId="3" w16cid:durableId="1053844078">
     <w:abstractNumId w:val="9"/>
@@ -21742,10 +23423,10 @@
     <w:abstractNumId w:val="15"/>
   </w:num>
   <w:num w:numId="6" w16cid:durableId="1207136662">
-    <w:abstractNumId w:val="25"/>
+    <w:abstractNumId w:val="27"/>
   </w:num>
   <w:num w:numId="7" w16cid:durableId="671446100">
-    <w:abstractNumId w:val="31"/>
+    <w:abstractNumId w:val="34"/>
   </w:num>
   <w:num w:numId="8" w16cid:durableId="939262433">
     <w:abstractNumId w:val="0"/>
@@ -21772,28 +23453,28 @@
     <w:abstractNumId w:val="2"/>
   </w:num>
   <w:num w:numId="16" w16cid:durableId="963003979">
-    <w:abstractNumId w:val="21"/>
+    <w:abstractNumId w:val="23"/>
   </w:num>
   <w:num w:numId="17" w16cid:durableId="2128742032">
-    <w:abstractNumId w:val="26"/>
+    <w:abstractNumId w:val="28"/>
   </w:num>
   <w:num w:numId="18" w16cid:durableId="600842585">
     <w:abstractNumId w:val="8"/>
   </w:num>
   <w:num w:numId="19" w16cid:durableId="1912882769">
-    <w:abstractNumId w:val="28"/>
+    <w:abstractNumId w:val="30"/>
   </w:num>
   <w:num w:numId="20" w16cid:durableId="1826898841">
-    <w:abstractNumId w:val="19"/>
+    <w:abstractNumId w:val="21"/>
   </w:num>
   <w:num w:numId="21" w16cid:durableId="1719234667">
-    <w:abstractNumId w:val="20"/>
+    <w:abstractNumId w:val="22"/>
   </w:num>
   <w:num w:numId="22" w16cid:durableId="1871868592">
     <w:abstractNumId w:val="12"/>
   </w:num>
   <w:num w:numId="23" w16cid:durableId="594099421">
-    <w:abstractNumId w:val="24"/>
+    <w:abstractNumId w:val="26"/>
   </w:num>
   <w:num w:numId="24" w16cid:durableId="668291328">
     <w:abstractNumId w:val="7"/>
@@ -21802,25 +23483,34 @@
     <w:abstractNumId w:val="13"/>
   </w:num>
   <w:num w:numId="26" w16cid:durableId="2028940105">
-    <w:abstractNumId w:val="27"/>
+    <w:abstractNumId w:val="29"/>
   </w:num>
   <w:num w:numId="27" w16cid:durableId="1520392587">
     <w:abstractNumId w:val="10"/>
   </w:num>
   <w:num w:numId="28" w16cid:durableId="1108967191">
-    <w:abstractNumId w:val="30"/>
+    <w:abstractNumId w:val="33"/>
   </w:num>
   <w:num w:numId="29" w16cid:durableId="1342121648">
-    <w:abstractNumId w:val="18"/>
+    <w:abstractNumId w:val="20"/>
   </w:num>
   <w:num w:numId="30" w16cid:durableId="371074254">
-    <w:abstractNumId w:val="23"/>
+    <w:abstractNumId w:val="25"/>
   </w:num>
   <w:num w:numId="31" w16cid:durableId="1674533074">
     <w:abstractNumId w:val="1"/>
   </w:num>
   <w:num w:numId="32" w16cid:durableId="1044716196">
-    <w:abstractNumId w:val="22"/>
+    <w:abstractNumId w:val="24"/>
+  </w:num>
+  <w:num w:numId="33" w16cid:durableId="1647393710">
+    <w:abstractNumId w:val="19"/>
+  </w:num>
+  <w:num w:numId="34" w16cid:durableId="950162809">
+    <w:abstractNumId w:val="17"/>
+  </w:num>
+  <w:num w:numId="35" w16cid:durableId="767888784">
+    <w:abstractNumId w:val="32"/>
   </w:num>
 </w:numbering>
 </file>
@@ -23359,6 +25049,614 @@
       <w:vertAlign w:val="superscript"/>
     </w:rPr>
   </w:style>
+  <w:style w:type="table" w:styleId="GridTable1Light-Accent1">
+    <w:name w:val="Grid Table 1 Light Accent 1"/>
+    <w:basedOn w:val="TableNormal"/>
+    <w:uiPriority w:val="46"/>
+    <w:rsid w:val="00A0032D"/>
+    <w:pPr>
+      <w:spacing w:after="0" w:line="240" w:lineRule="auto"/>
+    </w:pPr>
+    <w:tblPr>
+      <w:tblStyleRowBandSize w:val="1"/>
+      <w:tblStyleColBandSize w:val="1"/>
+      <w:tblBorders>
+        <w:top w:val="single" w:sz="4" w:space="0" w:color="83CAEB" w:themeColor="accent1" w:themeTint="66"/>
+        <w:left w:val="single" w:sz="4" w:space="0" w:color="83CAEB" w:themeColor="accent1" w:themeTint="66"/>
+        <w:bottom w:val="single" w:sz="4" w:space="0" w:color="83CAEB" w:themeColor="accent1" w:themeTint="66"/>
+        <w:right w:val="single" w:sz="4" w:space="0" w:color="83CAEB" w:themeColor="accent1" w:themeTint="66"/>
+        <w:insideH w:val="single" w:sz="4" w:space="0" w:color="83CAEB" w:themeColor="accent1" w:themeTint="66"/>
+        <w:insideV w:val="single" w:sz="4" w:space="0" w:color="83CAEB" w:themeColor="accent1" w:themeTint="66"/>
+      </w:tblBorders>
+    </w:tblPr>
+    <w:tblStylePr w:type="firstRow">
+      <w:rPr>
+        <w:b/>
+        <w:bCs/>
+      </w:rPr>
+      <w:tblPr/>
+      <w:tcPr>
+        <w:tcBorders>
+          <w:bottom w:val="single" w:sz="12" w:space="0" w:color="45B0E1" w:themeColor="accent1" w:themeTint="99"/>
+        </w:tcBorders>
+      </w:tcPr>
+    </w:tblStylePr>
+    <w:tblStylePr w:type="lastRow">
+      <w:rPr>
+        <w:b/>
+        <w:bCs/>
+      </w:rPr>
+      <w:tblPr/>
+      <w:tcPr>
+        <w:tcBorders>
+          <w:top w:val="double" w:sz="2" w:space="0" w:color="45B0E1" w:themeColor="accent1" w:themeTint="99"/>
+        </w:tcBorders>
+      </w:tcPr>
+    </w:tblStylePr>
+    <w:tblStylePr w:type="firstCol">
+      <w:rPr>
+        <w:b/>
+        <w:bCs/>
+      </w:rPr>
+    </w:tblStylePr>
+    <w:tblStylePr w:type="lastCol">
+      <w:rPr>
+        <w:b/>
+        <w:bCs/>
+      </w:rPr>
+    </w:tblStylePr>
+  </w:style>
+  <w:style w:type="table" w:styleId="GridTable1Light-Accent2">
+    <w:name w:val="Grid Table 1 Light Accent 2"/>
+    <w:basedOn w:val="TableNormal"/>
+    <w:uiPriority w:val="46"/>
+    <w:rsid w:val="00A0032D"/>
+    <w:pPr>
+      <w:spacing w:after="0" w:line="240" w:lineRule="auto"/>
+    </w:pPr>
+    <w:tblPr>
+      <w:tblStyleRowBandSize w:val="1"/>
+      <w:tblStyleColBandSize w:val="1"/>
+      <w:tblBorders>
+        <w:top w:val="single" w:sz="4" w:space="0" w:color="F6C5AC" w:themeColor="accent2" w:themeTint="66"/>
+        <w:left w:val="single" w:sz="4" w:space="0" w:color="F6C5AC" w:themeColor="accent2" w:themeTint="66"/>
+        <w:bottom w:val="single" w:sz="4" w:space="0" w:color="F6C5AC" w:themeColor="accent2" w:themeTint="66"/>
+        <w:right w:val="single" w:sz="4" w:space="0" w:color="F6C5AC" w:themeColor="accent2" w:themeTint="66"/>
+        <w:insideH w:val="single" w:sz="4" w:space="0" w:color="F6C5AC" w:themeColor="accent2" w:themeTint="66"/>
+        <w:insideV w:val="single" w:sz="4" w:space="0" w:color="F6C5AC" w:themeColor="accent2" w:themeTint="66"/>
+      </w:tblBorders>
+    </w:tblPr>
+    <w:tblStylePr w:type="firstRow">
+      <w:rPr>
+        <w:b/>
+        <w:bCs/>
+      </w:rPr>
+      <w:tblPr/>
+      <w:tcPr>
+        <w:tcBorders>
+          <w:bottom w:val="single" w:sz="12" w:space="0" w:color="F1A983" w:themeColor="accent2" w:themeTint="99"/>
+        </w:tcBorders>
+      </w:tcPr>
+    </w:tblStylePr>
+    <w:tblStylePr w:type="lastRow">
+      <w:rPr>
+        <w:b/>
+        <w:bCs/>
+      </w:rPr>
+      <w:tblPr/>
+      <w:tcPr>
+        <w:tcBorders>
+          <w:top w:val="double" w:sz="2" w:space="0" w:color="F1A983" w:themeColor="accent2" w:themeTint="99"/>
+        </w:tcBorders>
+      </w:tcPr>
+    </w:tblStylePr>
+    <w:tblStylePr w:type="firstCol">
+      <w:rPr>
+        <w:b/>
+        <w:bCs/>
+      </w:rPr>
+    </w:tblStylePr>
+    <w:tblStylePr w:type="lastCol">
+      <w:rPr>
+        <w:b/>
+        <w:bCs/>
+      </w:rPr>
+    </w:tblStylePr>
+  </w:style>
+  <w:style w:type="table" w:styleId="GridTable1Light-Accent3">
+    <w:name w:val="Grid Table 1 Light Accent 3"/>
+    <w:basedOn w:val="TableNormal"/>
+    <w:uiPriority w:val="46"/>
+    <w:rsid w:val="00A0032D"/>
+    <w:pPr>
+      <w:spacing w:after="0" w:line="240" w:lineRule="auto"/>
+    </w:pPr>
+    <w:tblPr>
+      <w:tblStyleRowBandSize w:val="1"/>
+      <w:tblStyleColBandSize w:val="1"/>
+      <w:tblBorders>
+        <w:top w:val="single" w:sz="4" w:space="0" w:color="84E290" w:themeColor="accent3" w:themeTint="66"/>
+        <w:left w:val="single" w:sz="4" w:space="0" w:color="84E290" w:themeColor="accent3" w:themeTint="66"/>
+        <w:bottom w:val="single" w:sz="4" w:space="0" w:color="84E290" w:themeColor="accent3" w:themeTint="66"/>
+        <w:right w:val="single" w:sz="4" w:space="0" w:color="84E290" w:themeColor="accent3" w:themeTint="66"/>
+        <w:insideH w:val="single" w:sz="4" w:space="0" w:color="84E290" w:themeColor="accent3" w:themeTint="66"/>
+        <w:insideV w:val="single" w:sz="4" w:space="0" w:color="84E290" w:themeColor="accent3" w:themeTint="66"/>
+      </w:tblBorders>
+    </w:tblPr>
+    <w:tblStylePr w:type="firstRow">
+      <w:rPr>
+        <w:b/>
+        <w:bCs/>
+      </w:rPr>
+      <w:tblPr/>
+      <w:tcPr>
+        <w:tcBorders>
+          <w:bottom w:val="single" w:sz="12" w:space="0" w:color="47D459" w:themeColor="accent3" w:themeTint="99"/>
+        </w:tcBorders>
+      </w:tcPr>
+    </w:tblStylePr>
+    <w:tblStylePr w:type="lastRow">
+      <w:rPr>
+        <w:b/>
+        <w:bCs/>
+      </w:rPr>
+      <w:tblPr/>
+      <w:tcPr>
+        <w:tcBorders>
+          <w:top w:val="double" w:sz="2" w:space="0" w:color="47D459" w:themeColor="accent3" w:themeTint="99"/>
+        </w:tcBorders>
+      </w:tcPr>
+    </w:tblStylePr>
+    <w:tblStylePr w:type="firstCol">
+      <w:rPr>
+        <w:b/>
+        <w:bCs/>
+      </w:rPr>
+    </w:tblStylePr>
+    <w:tblStylePr w:type="lastCol">
+      <w:rPr>
+        <w:b/>
+        <w:bCs/>
+      </w:rPr>
+    </w:tblStylePr>
+  </w:style>
+  <w:style w:type="table" w:styleId="GridTable2-Accent3">
+    <w:name w:val="Grid Table 2 Accent 3"/>
+    <w:basedOn w:val="TableNormal"/>
+    <w:uiPriority w:val="47"/>
+    <w:rsid w:val="00A0032D"/>
+    <w:pPr>
+      <w:spacing w:after="0" w:line="240" w:lineRule="auto"/>
+    </w:pPr>
+    <w:tblPr>
+      <w:tblStyleRowBandSize w:val="1"/>
+      <w:tblStyleColBandSize w:val="1"/>
+      <w:tblBorders>
+        <w:top w:val="single" w:sz="2" w:space="0" w:color="47D459" w:themeColor="accent3" w:themeTint="99"/>
+        <w:bottom w:val="single" w:sz="2" w:space="0" w:color="47D459" w:themeColor="accent3" w:themeTint="99"/>
+        <w:insideH w:val="single" w:sz="2" w:space="0" w:color="47D459" w:themeColor="accent3" w:themeTint="99"/>
+        <w:insideV w:val="single" w:sz="2" w:space="0" w:color="47D459" w:themeColor="accent3" w:themeTint="99"/>
+      </w:tblBorders>
+    </w:tblPr>
+    <w:tblStylePr w:type="firstRow">
+      <w:rPr>
+        <w:b/>
+        <w:bCs/>
+      </w:rPr>
+      <w:tblPr/>
+      <w:tcPr>
+        <w:tcBorders>
+          <w:top w:val="nil"/>
+          <w:bottom w:val="single" w:sz="12" w:space="0" w:color="47D459" w:themeColor="accent3" w:themeTint="99"/>
+          <w:insideH w:val="nil"/>
+          <w:insideV w:val="nil"/>
+        </w:tcBorders>
+        <w:shd w:val="clear" w:color="auto" w:fill="FFFFFF" w:themeFill="background1"/>
+      </w:tcPr>
+    </w:tblStylePr>
+    <w:tblStylePr w:type="lastRow">
+      <w:rPr>
+        <w:b/>
+        <w:bCs/>
+      </w:rPr>
+      <w:tblPr/>
+      <w:tcPr>
+        <w:tcBorders>
+          <w:top w:val="double" w:sz="2" w:space="0" w:color="47D459" w:themeColor="accent3" w:themeTint="99"/>
+          <w:bottom w:val="nil"/>
+          <w:insideH w:val="nil"/>
+          <w:insideV w:val="nil"/>
+        </w:tcBorders>
+        <w:shd w:val="clear" w:color="auto" w:fill="FFFFFF" w:themeFill="background1"/>
+      </w:tcPr>
+    </w:tblStylePr>
+    <w:tblStylePr w:type="firstCol">
+      <w:rPr>
+        <w:b/>
+        <w:bCs/>
+      </w:rPr>
+    </w:tblStylePr>
+    <w:tblStylePr w:type="lastCol">
+      <w:rPr>
+        <w:b/>
+        <w:bCs/>
+      </w:rPr>
+    </w:tblStylePr>
+    <w:tblStylePr w:type="band1Vert">
+      <w:tblPr/>
+      <w:tcPr>
+        <w:shd w:val="clear" w:color="auto" w:fill="C1F0C7" w:themeFill="accent3" w:themeFillTint="33"/>
+      </w:tcPr>
+    </w:tblStylePr>
+    <w:tblStylePr w:type="band1Horz">
+      <w:tblPr/>
+      <w:tcPr>
+        <w:shd w:val="clear" w:color="auto" w:fill="C1F0C7" w:themeFill="accent3" w:themeFillTint="33"/>
+      </w:tcPr>
+    </w:tblStylePr>
+  </w:style>
+  <w:style w:type="table" w:styleId="GridTable2-Accent5">
+    <w:name w:val="Grid Table 2 Accent 5"/>
+    <w:basedOn w:val="TableNormal"/>
+    <w:uiPriority w:val="47"/>
+    <w:rsid w:val="00A0032D"/>
+    <w:pPr>
+      <w:spacing w:after="0" w:line="240" w:lineRule="auto"/>
+    </w:pPr>
+    <w:tblPr>
+      <w:tblStyleRowBandSize w:val="1"/>
+      <w:tblStyleColBandSize w:val="1"/>
+      <w:tblBorders>
+        <w:top w:val="single" w:sz="2" w:space="0" w:color="D86DCB" w:themeColor="accent5" w:themeTint="99"/>
+        <w:bottom w:val="single" w:sz="2" w:space="0" w:color="D86DCB" w:themeColor="accent5" w:themeTint="99"/>
+        <w:insideH w:val="single" w:sz="2" w:space="0" w:color="D86DCB" w:themeColor="accent5" w:themeTint="99"/>
+        <w:insideV w:val="single" w:sz="2" w:space="0" w:color="D86DCB" w:themeColor="accent5" w:themeTint="99"/>
+      </w:tblBorders>
+    </w:tblPr>
+    <w:tblStylePr w:type="firstRow">
+      <w:rPr>
+        <w:b/>
+        <w:bCs/>
+      </w:rPr>
+      <w:tblPr/>
+      <w:tcPr>
+        <w:tcBorders>
+          <w:top w:val="nil"/>
+          <w:bottom w:val="single" w:sz="12" w:space="0" w:color="D86DCB" w:themeColor="accent5" w:themeTint="99"/>
+          <w:insideH w:val="nil"/>
+          <w:insideV w:val="nil"/>
+        </w:tcBorders>
+        <w:shd w:val="clear" w:color="auto" w:fill="FFFFFF" w:themeFill="background1"/>
+      </w:tcPr>
+    </w:tblStylePr>
+    <w:tblStylePr w:type="lastRow">
+      <w:rPr>
+        <w:b/>
+        <w:bCs/>
+      </w:rPr>
+      <w:tblPr/>
+      <w:tcPr>
+        <w:tcBorders>
+          <w:top w:val="double" w:sz="2" w:space="0" w:color="D86DCB" w:themeColor="accent5" w:themeTint="99"/>
+          <w:bottom w:val="nil"/>
+          <w:insideH w:val="nil"/>
+          <w:insideV w:val="nil"/>
+        </w:tcBorders>
+        <w:shd w:val="clear" w:color="auto" w:fill="FFFFFF" w:themeFill="background1"/>
+      </w:tcPr>
+    </w:tblStylePr>
+    <w:tblStylePr w:type="firstCol">
+      <w:rPr>
+        <w:b/>
+        <w:bCs/>
+      </w:rPr>
+    </w:tblStylePr>
+    <w:tblStylePr w:type="lastCol">
+      <w:rPr>
+        <w:b/>
+        <w:bCs/>
+      </w:rPr>
+    </w:tblStylePr>
+    <w:tblStylePr w:type="band1Vert">
+      <w:tblPr/>
+      <w:tcPr>
+        <w:shd w:val="clear" w:color="auto" w:fill="F2CEED" w:themeFill="accent5" w:themeFillTint="33"/>
+      </w:tcPr>
+    </w:tblStylePr>
+    <w:tblStylePr w:type="band1Horz">
+      <w:tblPr/>
+      <w:tcPr>
+        <w:shd w:val="clear" w:color="auto" w:fill="F2CEED" w:themeFill="accent5" w:themeFillTint="33"/>
+      </w:tcPr>
+    </w:tblStylePr>
+  </w:style>
+  <w:style w:type="table" w:styleId="GridTable2-Accent6">
+    <w:name w:val="Grid Table 2 Accent 6"/>
+    <w:basedOn w:val="TableNormal"/>
+    <w:uiPriority w:val="47"/>
+    <w:rsid w:val="00A0032D"/>
+    <w:pPr>
+      <w:spacing w:after="0" w:line="240" w:lineRule="auto"/>
+    </w:pPr>
+    <w:tblPr>
+      <w:tblStyleRowBandSize w:val="1"/>
+      <w:tblStyleColBandSize w:val="1"/>
+      <w:tblBorders>
+        <w:top w:val="single" w:sz="2" w:space="0" w:color="8DD873" w:themeColor="accent6" w:themeTint="99"/>
+        <w:bottom w:val="single" w:sz="2" w:space="0" w:color="8DD873" w:themeColor="accent6" w:themeTint="99"/>
+        <w:insideH w:val="single" w:sz="2" w:space="0" w:color="8DD873" w:themeColor="accent6" w:themeTint="99"/>
+        <w:insideV w:val="single" w:sz="2" w:space="0" w:color="8DD873" w:themeColor="accent6" w:themeTint="99"/>
+      </w:tblBorders>
+    </w:tblPr>
+    <w:tblStylePr w:type="firstRow">
+      <w:rPr>
+        <w:b/>
+        <w:bCs/>
+      </w:rPr>
+      <w:tblPr/>
+      <w:tcPr>
+        <w:tcBorders>
+          <w:top w:val="nil"/>
+          <w:bottom w:val="single" w:sz="12" w:space="0" w:color="8DD873" w:themeColor="accent6" w:themeTint="99"/>
+          <w:insideH w:val="nil"/>
+          <w:insideV w:val="nil"/>
+        </w:tcBorders>
+        <w:shd w:val="clear" w:color="auto" w:fill="FFFFFF" w:themeFill="background1"/>
+      </w:tcPr>
+    </w:tblStylePr>
+    <w:tblStylePr w:type="lastRow">
+      <w:rPr>
+        <w:b/>
+        <w:bCs/>
+      </w:rPr>
+      <w:tblPr/>
+      <w:tcPr>
+        <w:tcBorders>
+          <w:top w:val="double" w:sz="2" w:space="0" w:color="8DD873" w:themeColor="accent6" w:themeTint="99"/>
+          <w:bottom w:val="nil"/>
+          <w:insideH w:val="nil"/>
+          <w:insideV w:val="nil"/>
+        </w:tcBorders>
+        <w:shd w:val="clear" w:color="auto" w:fill="FFFFFF" w:themeFill="background1"/>
+      </w:tcPr>
+    </w:tblStylePr>
+    <w:tblStylePr w:type="firstCol">
+      <w:rPr>
+        <w:b/>
+        <w:bCs/>
+      </w:rPr>
+    </w:tblStylePr>
+    <w:tblStylePr w:type="lastCol">
+      <w:rPr>
+        <w:b/>
+        <w:bCs/>
+      </w:rPr>
+    </w:tblStylePr>
+    <w:tblStylePr w:type="band1Vert">
+      <w:tblPr/>
+      <w:tcPr>
+        <w:shd w:val="clear" w:color="auto" w:fill="D9F2D0" w:themeFill="accent6" w:themeFillTint="33"/>
+      </w:tcPr>
+    </w:tblStylePr>
+    <w:tblStylePr w:type="band1Horz">
+      <w:tblPr/>
+      <w:tcPr>
+        <w:shd w:val="clear" w:color="auto" w:fill="D9F2D0" w:themeFill="accent6" w:themeFillTint="33"/>
+      </w:tcPr>
+    </w:tblStylePr>
+  </w:style>
+  <w:style w:type="table" w:styleId="GridTable3">
+    <w:name w:val="Grid Table 3"/>
+    <w:basedOn w:val="TableNormal"/>
+    <w:uiPriority w:val="48"/>
+    <w:rsid w:val="00A0032D"/>
+    <w:pPr>
+      <w:spacing w:after="0" w:line="240" w:lineRule="auto"/>
+    </w:pPr>
+    <w:tblPr>
+      <w:tblStyleRowBandSize w:val="1"/>
+      <w:tblStyleColBandSize w:val="1"/>
+      <w:tblBorders>
+        <w:top w:val="single" w:sz="4" w:space="0" w:color="666666" w:themeColor="text1" w:themeTint="99"/>
+        <w:left w:val="single" w:sz="4" w:space="0" w:color="666666" w:themeColor="text1" w:themeTint="99"/>
+        <w:bottom w:val="single" w:sz="4" w:space="0" w:color="666666" w:themeColor="text1" w:themeTint="99"/>
+        <w:right w:val="single" w:sz="4" w:space="0" w:color="666666" w:themeColor="text1" w:themeTint="99"/>
+        <w:insideH w:val="single" w:sz="4" w:space="0" w:color="666666" w:themeColor="text1" w:themeTint="99"/>
+        <w:insideV w:val="single" w:sz="4" w:space="0" w:color="666666" w:themeColor="text1" w:themeTint="99"/>
+      </w:tblBorders>
+    </w:tblPr>
+    <w:tblStylePr w:type="firstRow">
+      <w:rPr>
+        <w:b/>
+        <w:bCs/>
+      </w:rPr>
+      <w:tblPr/>
+      <w:tcPr>
+        <w:tcBorders>
+          <w:top w:val="nil"/>
+          <w:left w:val="nil"/>
+          <w:right w:val="nil"/>
+          <w:insideH w:val="nil"/>
+          <w:insideV w:val="nil"/>
+        </w:tcBorders>
+        <w:shd w:val="clear" w:color="auto" w:fill="FFFFFF" w:themeFill="background1"/>
+      </w:tcPr>
+    </w:tblStylePr>
+    <w:tblStylePr w:type="lastRow">
+      <w:rPr>
+        <w:b/>
+        <w:bCs/>
+      </w:rPr>
+      <w:tblPr/>
+      <w:tcPr>
+        <w:tcBorders>
+          <w:left w:val="nil"/>
+          <w:bottom w:val="nil"/>
+          <w:right w:val="nil"/>
+          <w:insideH w:val="nil"/>
+          <w:insideV w:val="nil"/>
+        </w:tcBorders>
+        <w:shd w:val="clear" w:color="auto" w:fill="FFFFFF" w:themeFill="background1"/>
+      </w:tcPr>
+    </w:tblStylePr>
+    <w:tblStylePr w:type="firstCol">
+      <w:pPr>
+        <w:jc w:val="right"/>
+      </w:pPr>
+      <w:rPr>
+        <w:i/>
+        <w:iCs/>
+      </w:rPr>
+      <w:tblPr/>
+      <w:tcPr>
+        <w:tcBorders>
+          <w:top w:val="nil"/>
+          <w:left w:val="nil"/>
+          <w:bottom w:val="nil"/>
+          <w:insideH w:val="nil"/>
+          <w:insideV w:val="nil"/>
+        </w:tcBorders>
+        <w:shd w:val="clear" w:color="auto" w:fill="FFFFFF" w:themeFill="background1"/>
+      </w:tcPr>
+    </w:tblStylePr>
+    <w:tblStylePr w:type="lastCol">
+      <w:rPr>
+        <w:i/>
+        <w:iCs/>
+      </w:rPr>
+      <w:tblPr/>
+      <w:tcPr>
+        <w:tcBorders>
+          <w:top w:val="nil"/>
+          <w:bottom w:val="nil"/>
+          <w:right w:val="nil"/>
+          <w:insideH w:val="nil"/>
+          <w:insideV w:val="nil"/>
+        </w:tcBorders>
+        <w:shd w:val="clear" w:color="auto" w:fill="FFFFFF" w:themeFill="background1"/>
+      </w:tcPr>
+    </w:tblStylePr>
+    <w:tblStylePr w:type="band1Vert">
+      <w:tblPr/>
+      <w:tcPr>
+        <w:shd w:val="clear" w:color="auto" w:fill="CCCCCC" w:themeFill="text1" w:themeFillTint="33"/>
+      </w:tcPr>
+    </w:tblStylePr>
+    <w:tblStylePr w:type="band1Horz">
+      <w:tblPr/>
+      <w:tcPr>
+        <w:shd w:val="clear" w:color="auto" w:fill="CCCCCC" w:themeFill="text1" w:themeFillTint="33"/>
+      </w:tcPr>
+    </w:tblStylePr>
+    <w:tblStylePr w:type="neCell">
+      <w:tblPr/>
+      <w:tcPr>
+        <w:tcBorders>
+          <w:bottom w:val="single" w:sz="4" w:space="0" w:color="666666" w:themeColor="text1" w:themeTint="99"/>
+        </w:tcBorders>
+      </w:tcPr>
+    </w:tblStylePr>
+    <w:tblStylePr w:type="nwCell">
+      <w:tblPr/>
+      <w:tcPr>
+        <w:tcBorders>
+          <w:bottom w:val="single" w:sz="4" w:space="0" w:color="666666" w:themeColor="text1" w:themeTint="99"/>
+        </w:tcBorders>
+      </w:tcPr>
+    </w:tblStylePr>
+    <w:tblStylePr w:type="seCell">
+      <w:tblPr/>
+      <w:tcPr>
+        <w:tcBorders>
+          <w:top w:val="single" w:sz="4" w:space="0" w:color="666666" w:themeColor="text1" w:themeTint="99"/>
+        </w:tcBorders>
+      </w:tcPr>
+    </w:tblStylePr>
+    <w:tblStylePr w:type="swCell">
+      <w:tblPr/>
+      <w:tcPr>
+        <w:tcBorders>
+          <w:top w:val="single" w:sz="4" w:space="0" w:color="666666" w:themeColor="text1" w:themeTint="99"/>
+        </w:tcBorders>
+      </w:tcPr>
+    </w:tblStylePr>
+  </w:style>
+  <w:style w:type="table" w:styleId="GridTable4-Accent3">
+    <w:name w:val="Grid Table 4 Accent 3"/>
+    <w:basedOn w:val="TableNormal"/>
+    <w:uiPriority w:val="49"/>
+    <w:rsid w:val="00A0032D"/>
+    <w:pPr>
+      <w:spacing w:after="0" w:line="240" w:lineRule="auto"/>
+    </w:pPr>
+    <w:tblPr>
+      <w:tblStyleRowBandSize w:val="1"/>
+      <w:tblStyleColBandSize w:val="1"/>
+      <w:tblBorders>
+        <w:top w:val="single" w:sz="4" w:space="0" w:color="47D459" w:themeColor="accent3" w:themeTint="99"/>
+        <w:left w:val="single" w:sz="4" w:space="0" w:color="47D459" w:themeColor="accent3" w:themeTint="99"/>
+        <w:bottom w:val="single" w:sz="4" w:space="0" w:color="47D459" w:themeColor="accent3" w:themeTint="99"/>
+        <w:right w:val="single" w:sz="4" w:space="0" w:color="47D459" w:themeColor="accent3" w:themeTint="99"/>
+        <w:insideH w:val="single" w:sz="4" w:space="0" w:color="47D459" w:themeColor="accent3" w:themeTint="99"/>
+        <w:insideV w:val="single" w:sz="4" w:space="0" w:color="47D459" w:themeColor="accent3" w:themeTint="99"/>
+      </w:tblBorders>
+    </w:tblPr>
+    <w:tblStylePr w:type="firstRow">
+      <w:rPr>
+        <w:b/>
+        <w:bCs/>
+        <w:color w:val="FFFFFF" w:themeColor="background1"/>
+      </w:rPr>
+      <w:tblPr/>
+      <w:tcPr>
+        <w:tcBorders>
+          <w:top w:val="single" w:sz="4" w:space="0" w:color="196B24" w:themeColor="accent3"/>
+          <w:left w:val="single" w:sz="4" w:space="0" w:color="196B24" w:themeColor="accent3"/>
+          <w:bottom w:val="single" w:sz="4" w:space="0" w:color="196B24" w:themeColor="accent3"/>
+          <w:right w:val="single" w:sz="4" w:space="0" w:color="196B24" w:themeColor="accent3"/>
+          <w:insideH w:val="nil"/>
+          <w:insideV w:val="nil"/>
+        </w:tcBorders>
+        <w:shd w:val="clear" w:color="auto" w:fill="196B24" w:themeFill="accent3"/>
+      </w:tcPr>
+    </w:tblStylePr>
+    <w:tblStylePr w:type="lastRow">
+      <w:rPr>
+        <w:b/>
+        <w:bCs/>
+      </w:rPr>
+      <w:tblPr/>
+      <w:tcPr>
+        <w:tcBorders>
+          <w:top w:val="double" w:sz="4" w:space="0" w:color="196B24" w:themeColor="accent3"/>
+        </w:tcBorders>
+      </w:tcPr>
+    </w:tblStylePr>
+    <w:tblStylePr w:type="firstCol">
+      <w:rPr>
+        <w:b/>
+        <w:bCs/>
+      </w:rPr>
+    </w:tblStylePr>
+    <w:tblStylePr w:type="lastCol">
+      <w:rPr>
+        <w:b/>
+        <w:bCs/>
+      </w:rPr>
+    </w:tblStylePr>
+    <w:tblStylePr w:type="band1Vert">
+      <w:tblPr/>
+      <w:tcPr>
+        <w:shd w:val="clear" w:color="auto" w:fill="C1F0C7" w:themeFill="accent3" w:themeFillTint="33"/>
+      </w:tcPr>
+    </w:tblStylePr>
+    <w:tblStylePr w:type="band1Horz">
+      <w:tblPr/>
+      <w:tcPr>
+        <w:shd w:val="clear" w:color="auto" w:fill="C1F0C7" w:themeFill="accent3" w:themeFillTint="33"/>
+      </w:tcPr>
+    </w:tblStylePr>
+  </w:style>
 </w:styles>
 </file>
 

</xml_diff>